<commit_message>
fix: remover caracteres invalidos (0x1C e mojibake) do DOCX de demolicao que impediam o Word de abrir; adicionar placeholder {identificacao}
</commit_message>
<xml_diff>
--- a/src/lib/templates/proposta-demolicao/template.docx
+++ b/src/lib/templates/proposta-demolicao/template.docx
@@ -1,9 +1,3374 @@
 
-<file path=word/document.xml><?xml version="1.0" encoding="UTF-8" standalone="yes"?>
-<w:document xmlns:wpc="http://schemas.microsoft.com/office/word/2010/wordprocessingCanvas" xmlns:cx="http://schemas.microsoft.com/office/drawing/2014/chartex" xmlns:cx1="http://schemas.microsoft.com/office/drawing/2015/9/8/chartex" xmlns:cx2="http://schemas.microsoft.com/office/drawing/2015/10/21/chartex" xmlns:cx3="http://schemas.microsoft.com/office/drawing/2016/5/9/chartex" xmlns:cx4="http://schemas.microsoft.com/office/drawing/2016/5/10/chartex" xmlns:cx5="http://schemas.microsoft.com/office/drawing/2016/5/11/chartex" xmlns:cx6="http://schemas.microsoft.com/office/drawing/2016/5/12/chartex" xmlns:cx7="http://schemas.microsoft.com/office/drawing/2016/5/13/chartex" xmlns:cx8="http://schemas.microsoft.com/office/drawing/2016/5/14/chartex" xmlns:mc="http://schemas.openxmlformats.org/markup-compatibility/2006" xmlns:aink="http://schemas.microsoft.com/office/drawing/2016/ink" xmlns:am3d="http://schemas.microsoft.com/office/drawing/2017/model3d" xmlns:o="urn:schemas-microsoft-com:office:office" xmlns:oel="http://schemas.microsoft.com/office/2019/extlst" xmlns:r="http://schemas.openxmlformats.org/officeDocument/2006/relationships" xmlns:m="http://schemas.openxmlformats.org/officeDocument/2006/math" xmlns:v="urn:schemas-microsoft-com:vml" xmlns:wp14="http://schemas.microsoft.com/office/word/2010/wordprocessingDrawing" xmlns:wp="http://schemas.openxmlformats.org/drawingml/2006/wordprocessingDrawing" xmlns:w10="urn:schemas-microsoft-com:office:word" xmlns:w="http://schemas.openxmlformats.org/wordprocessingml/2006/main" xmlns:w14="http://schemas.microsoft.com/office/word/2010/wordml" xmlns:w15="http://schemas.microsoft.com/office/word/2012/wordml" xmlns:w16cei="http://schemas.microsoft.com/office/word/2026/wordml/cei" xmlns:w16cex="http://schemas.microsoft.com/office/word/2018/wordml/cex" xmlns:w16cid="http://schemas.microsoft.com/office/word/2016/wordml/cid" xmlns:w16="http://schemas.microsoft.com/office/word/2018/wordml" xmlns:w16du="http://schemas.microsoft.com/office/word/2023/wordml/word16du" xmlns:w16sdtdh="http://schemas.microsoft.com/office/word/2020/wordml/sdtdatahash" xmlns:w16sdtfl="http://schemas.microsoft.com/office/word/2024/wordml/sdtformatlock" xmlns:w16se="http://schemas.microsoft.com/office/word/2015/wordml/symex" xmlns:wpg="http://schemas.microsoft.com/office/word/2010/wordprocessingGroup" xmlns:wpi="http://schemas.microsoft.com/office/word/2010/wordprocessingInk" xmlns:wne="http://schemas.microsoft.com/office/word/2006/wordml" xmlns:wps="http://schemas.microsoft.com/office/word/2010/wordprocessingShape" mc:Ignorable="w14 w15 w16se w16cid w16 w16cex w16sdtdh w16sdtfl w16du wp14"><w:body><w:p><w:pPr><w:pStyle w:val="Ttulo2"/><w:jc w:val="right"/><w:rPr><w:rFonts w:ascii="Ebrima" w:hAnsi="Ebrima"/><w:szCs w:val="24"/></w:rPr></w:pPr><w:r><w:rPr><w:rFonts w:ascii="Ebrima" w:hAnsi="Ebrima"/><w:szCs w:val="24"/></w:rPr><w:t>IDENTIFICA�!ÒO NUMERO  /  ANO �- REV. 00</w:t></w:r></w:p><w:p><w:pPr><w:rPr></w:rPr></w:pPr></w:p><w:p><w:pPr><w:pStyle w:val="Ttulo2"/><w:jc w:val="right"/><w:rPr><w:rFonts w:ascii="Ebrima" w:hAnsi="Ebrima"/><w:szCs w:val="24"/></w:rPr></w:pPr><w:r><w:rPr><w:rFonts w:ascii="Ebrima" w:hAnsi="Ebrima"/><w:szCs w:val="24"/></w:rPr><w:t>Curitiba</w:t></w:r><w:r><w:rPr><w:rFonts w:ascii="Ebrima" w:hAnsi="Ebrima"/><w:szCs w:val="24"/></w:rPr><w:t xml:space="preserve">, </w:t></w:r><w:r><w:rPr><w:rFonts w:ascii="Ebrima" w:hAnsi="Ebrima"/><w:szCs w:val="24"/></w:rPr><w:t>04 de agosto</w:t></w:r><w:r><w:rPr><w:rFonts w:ascii="Ebrima" w:hAnsi="Ebrima"/><w:szCs w:val="24"/></w:rPr><w:t xml:space="preserve"> de 2026</w:t></w:r><w:r><w:rPr><w:rFonts w:ascii="Ebrima" w:hAnsi="Ebrima"/><w:szCs w:val="24"/></w:rPr><w:t>.</w:t></w:r></w:p><w:p><w:pPr><w:pStyle w:val="Ttulo2"/><w:rPr><w:rFonts w:ascii="Ebrima" w:hAnsi="Ebrima"/><w:szCs w:val="24"/></w:rPr></w:pPr><w:r><w:rPr><w:rFonts w:ascii="Ebrima" w:hAnsi="Ebrima"/><w:szCs w:val="24"/></w:rPr><w:t>Ao</w:t></w:r><w:r><w:rPr><w:rFonts w:ascii="Ebrima" w:hAnsi="Ebrima"/><w:szCs w:val="24"/></w:rPr><w:t xml:space="preserve"> </w:t></w:r></w:p><w:p><w:pPr><w:jc w:val="both"/><w:rPr><w:rFonts w:ascii="Ebrima" w:hAnsi="Ebrima"/><w:b/><w:bCs/><w:smallCaps/><w:sz w:val="24"/><w:szCs w:val="24"/></w:rPr></w:pPr><w:r><w:rPr><w:rFonts w:ascii="Ebrima" w:hAnsi="Ebrima"/><w:b/><w:bCs/><w:smallCaps/><w:sz w:val="24"/><w:szCs w:val="24"/></w:rPr><w:t xml:space="preserve">Eng. </w:t></w:r><w:proofErr w:type="spellStart"/><w:r><w:rPr><w:rFonts w:ascii="Ebrima" w:hAnsi="Ebrima"/><w:b/><w:bCs/><w:smallCaps/><w:sz w:val="24"/><w:szCs w:val="24"/></w:rPr><w:t>Antonio</w:t></w:r><w:proofErr w:type="spellEnd"/><w:r><w:rPr><w:rFonts w:ascii="Ebrima" w:hAnsi="Ebrima"/><w:b/><w:bCs/><w:smallCaps/><w:sz w:val="24"/><w:szCs w:val="24"/></w:rPr><w:t xml:space="preserve"> M. Martins</w:t></w:r></w:p><w:p><w:pPr><w:jc w:val="both"/><w:rPr><w:rFonts w:ascii="Ebrima" w:hAnsi="Ebrima"/><w:smallCaps/><w:sz w:val="24"/><w:szCs w:val="24"/></w:rPr></w:pPr><w:r><w:rPr><w:rFonts w:ascii="Ebrima" w:hAnsi="Ebrima"/><w:smallCaps/><w:sz w:val="24"/><w:szCs w:val="24"/></w:rPr><w:t>{empresaNome}</w:t></w:r></w:p><w:p><w:pPr><w:jc w:val="both"/><w:rPr><w:rFonts w:ascii="Ebrima" w:hAnsi="Ebrima"/><w:sz w:val="24"/><w:szCs w:val="24"/></w:rPr></w:pPr></w:p><w:p><w:pPr><w:jc w:val="both"/><w:rPr><w:rFonts w:ascii="Ebrima" w:hAnsi="Ebrima"/><w:sz w:val="24"/><w:szCs w:val="24"/></w:rPr></w:pPr></w:p><w:p><w:pPr><w:jc w:val="both"/><w:rPr><w:rFonts w:ascii="Ebrima" w:hAnsi="Ebrima"/><w:sz w:val="24"/><w:szCs w:val="24"/></w:rPr></w:pPr></w:p><w:p><w:pPr><w:jc w:val="both"/><w:rPr><w:rFonts w:ascii="Ebrima" w:hAnsi="Ebrima"/><w:smallCaps/><w:sz w:val="24"/><w:szCs w:val="24"/></w:rPr></w:pPr><w:r><w:rPr><w:rFonts w:ascii="Ebrima" w:hAnsi="Ebrima"/><w:sz w:val="24"/><w:szCs w:val="24"/></w:rPr><w:t>Prezad</w:t></w:r><w:r><w:rPr><w:rFonts w:ascii="Ebrima" w:hAnsi="Ebrima"/><w:sz w:val="24"/><w:szCs w:val="24"/></w:rPr><w:t>o</w:t></w:r><w:r><w:rPr><w:rFonts w:ascii="Ebrima" w:hAnsi="Ebrima"/><w:sz w:val="24"/><w:szCs w:val="24"/></w:rPr><w:t>,</w:t></w:r></w:p><w:p><w:pPr><w:jc w:val="both"/><w:rPr><w:rFonts w:ascii="Ebrima" w:hAnsi="Ebrima"/><w:sz w:val="24"/><w:szCs w:val="24"/></w:rPr></w:pPr></w:p><w:p><w:pPr><w:jc w:val="both"/><w:rPr><w:rFonts w:ascii="Ebrima" w:hAnsi="Ebrima"/><w:sz w:val="24"/><w:szCs w:val="24"/></w:rPr></w:pPr></w:p><w:p><w:pPr><w:jc w:val="both"/><w:rPr><w:rFonts w:ascii="Ebrima" w:hAnsi="Ebrima"/><w:sz w:val="24"/><w:szCs w:val="24"/></w:rPr></w:pPr><w:r><w:rPr><w:rFonts w:ascii="Ebrima" w:hAnsi="Ebrima"/><w:sz w:val="24"/><w:szCs w:val="24"/></w:rPr><w:t xml:space="preserve">Conforme </w:t></w:r><w:r><w:rPr><w:rFonts w:ascii="Ebrima" w:hAnsi="Ebrima"/><w:sz w:val="24"/><w:szCs w:val="24"/></w:rPr><w:t>solicitação</w:t></w:r><w:r><w:rPr><w:rFonts w:ascii="Ebrima" w:hAnsi="Ebrima"/><w:sz w:val="24"/><w:szCs w:val="24"/></w:rPr><w:t xml:space="preserve">, apresentamos proposta para condução de serviços de assessoria ambiental referente </w:t></w:r><w:r><w:rPr><w:rFonts w:ascii="Ebrima" w:hAnsi="Ebrima"/><w:sz w:val="24"/><w:szCs w:val="24"/></w:rPr><w:t xml:space="preserve">a </w:t></w:r><w:r><w:rPr><w:rFonts w:ascii="Ebrima" w:hAnsi="Ebrima"/><w:sz w:val="24"/><w:szCs w:val="24"/></w:rPr><w:t xml:space="preserve">obras de demolição a serem executadas </w:t></w:r><w:r><w:rPr><w:rFonts w:ascii="Ebrima" w:hAnsi="Ebrima"/><w:sz w:val="24"/><w:szCs w:val="24"/></w:rPr><w:t xml:space="preserve">no bairro </w:t></w:r><w:r><w:rPr><w:rFonts w:ascii="Ebrima" w:hAnsi="Ebrima"/><w:sz w:val="24"/><w:szCs w:val="24"/></w:rPr><w:t>Prado Velho</w:t></w:r><w:r><w:rPr><w:rFonts w:ascii="Ebrima" w:hAnsi="Ebrima"/><w:sz w:val="24"/><w:szCs w:val="24"/></w:rPr><w:t xml:space="preserve">, </w:t></w:r><w:r><w:rPr><w:rFonts w:ascii="Ebrima" w:hAnsi="Ebrima"/><w:sz w:val="24"/><w:szCs w:val="24"/></w:rPr><w:t>em {cidade}, {uf}</w:t></w:r><w:r><w:rPr><w:rFonts w:ascii="Ebrima" w:hAnsi="Ebrima"/><w:sz w:val="24"/><w:szCs w:val="24"/></w:rPr><w:t xml:space="preserve">. </w:t></w:r><w:r><w:rPr><w:rFonts w:ascii="Ebrima" w:hAnsi="Ebrima"/><w:sz w:val="24"/><w:szCs w:val="24"/></w:rPr><w:t>Considerando as informações prestadas, foram orçados os seguintes trabalhos:</w:t></w:r></w:p><w:p><w:pPr><w:jc w:val="both"/><w:rPr><w:rFonts w:ascii="Ebrima" w:hAnsi="Ebrima"/><w:sz w:val="24"/><w:szCs w:val="24"/></w:rPr></w:pPr></w:p><w:p><w:pPr><w:jc w:val="both"/><w:rPr><w:rFonts w:ascii="Ebrima" w:hAnsi="Ebrima"/><w:bCs/><w:sz w:val="24"/><w:szCs w:val="24"/></w:rPr></w:pPr><w:r><w:rPr><w:rFonts w:ascii="Ebrima" w:hAnsi="Ebrima"/><w:b/><w:smallCaps/><w:sz w:val="24"/><w:szCs w:val="24"/></w:rPr><w:t>Objeto</w:t></w:r><w:r><w:rPr><w:rFonts w:ascii="Ebrima" w:hAnsi="Ebrima"/><w:b/><w:smallCaps/><w:sz w:val="24"/><w:szCs w:val="24"/></w:rPr><w:t>s</w:t></w:r><w:r><w:rPr><w:rFonts w:ascii="Ebrima" w:hAnsi="Ebrima"/><w:b/><w:smallCaps/><w:sz w:val="24"/><w:szCs w:val="24"/></w:rPr><w:t xml:space="preserve">: </w:t></w:r><w:r><w:rPr><w:rFonts w:ascii="Ebrima" w:hAnsi="Ebrima"/><w:bCs/><w:sz w:val="24"/><w:szCs w:val="24"/></w:rPr><w:t>Serviços de assessoria ambiental:</w:t></w:r></w:p><w:p><w:pPr><w:jc w:val="both"/><w:rPr><w:rFonts w:ascii="Ebrima" w:hAnsi="Ebrima"/><w:bCs/><w:sz w:val="24"/><w:szCs w:val="24"/></w:rPr></w:pPr></w:p><w:p><w:pPr><w:pStyle w:val="PargrafodaLista"/><w:numPr><w:ilvl w:val="0"/><w:numId w:val="3"/></w:numPr><w:jc w:val="both"/><w:rPr><w:rFonts w:ascii="Ebrima" w:hAnsi="Ebrima"/><w:sz w:val="24"/><w:szCs w:val="24"/></w:rPr></w:pPr><w:r><w:rPr><w:rFonts w:ascii="Ebrima" w:hAnsi="Ebrima"/><w:smallCaps/><w:sz w:val="24"/><w:szCs w:val="24"/></w:rPr><w:t>PGRCC Demolição -</w:t></w:r><w:r><w:rPr><w:rFonts w:ascii="Ebrima" w:hAnsi="Ebrima"/><w:sz w:val="24"/><w:szCs w:val="24"/></w:rPr><w:t xml:space="preserve"> Elaboração de </w:t></w:r><w:r><w:rPr><w:rFonts w:ascii="Ebrima" w:hAnsi="Ebrima"/><w:sz w:val="24"/><w:szCs w:val="24"/></w:rPr><w:t>{quantidadePgrcc} ({quantidadePgrccExtenso})</w:t></w:r><w:r><w:rPr><w:rFonts w:ascii="Ebrima" w:hAnsi="Ebrima"/><w:sz w:val="24"/><w:szCs w:val="24"/></w:rPr><w:t xml:space="preserve"> Projeto de Gerenciamento de Resíduos da Construção Civil (PGRCC SIMPLIFICADO), que se constitu</w:t></w:r><w:r><w:rPr><w:rFonts w:ascii="Ebrima" w:hAnsi="Ebrima"/><w:sz w:val="24"/><w:szCs w:val="24"/></w:rPr><w:t>em</w:t></w:r><w:r><w:rPr><w:rFonts w:ascii="Ebrima" w:hAnsi="Ebrima"/><w:sz w:val="24"/><w:szCs w:val="24"/></w:rPr><w:t xml:space="preserve"> em documento-padrão da Prefeitura Municipal com diretrizes gerais do processo de gerenciamento dos resíduos na obra e documentos correlatos. Inclui a respectiva Anotação de Responsabilidade �- ART/CREA-PR, protocolização via plataforma SIMA, e acompanhamento processual até a emissão do respectivo Parecer Técnico, ficando a CONTRATANTE responsável por implantar o projeto. </w:t></w:r><w:r><w:rPr><w:rFonts w:ascii="Ebrima" w:hAnsi="Ebrima"/><w:sz w:val="24"/><w:szCs w:val="24"/></w:rPr><w:t>Não inclui trabalhos de campo.</w:t></w:r></w:p><w:p><w:pPr><w:pStyle w:val="PargrafodaLista"/><w:jc w:val="both"/><w:rPr><w:rFonts w:ascii="Ebrima" w:hAnsi="Ebrima"/><w:sz w:val="24"/><w:szCs w:val="24"/></w:rPr></w:pPr></w:p><w:p><w:pPr><w:pStyle w:val="PargrafodaLista"/><w:numPr><w:ilvl w:val="0"/><w:numId w:val="3"/></w:numPr><w:tabs><w:tab w:val="left" w:pos="426"/></w:tabs><w:ind w:left="426"/><w:jc w:val="both"/><w:rPr><w:rFonts w:ascii="Ebrima" w:hAnsi="Ebrima"/><w:sz w:val="24"/><w:szCs w:val="24"/></w:rPr></w:pPr><w:r><w:rPr><w:rFonts w:ascii="Ebrima" w:hAnsi="Ebrima"/><w:smallCaps/><w:sz w:val="24"/><w:szCs w:val="24"/></w:rPr><w:t>R</w:t></w:r><w:r><w:rPr><w:rFonts w:ascii="Ebrima" w:hAnsi="Ebrima"/><w:smallCaps/><w:sz w:val="24"/><w:szCs w:val="24"/></w:rPr><w:t>GRCC Demolição -</w:t></w:r><w:r><w:rPr><w:rFonts w:ascii="Ebrima" w:hAnsi="Ebrima"/><w:smallCaps/><w:sz w:val="24"/><w:szCs w:val="24"/></w:rPr><w:t xml:space="preserve"> </w:t></w:r><w:r><w:rPr><w:rFonts w:ascii="Ebrima" w:hAnsi="Ebrima"/><w:sz w:val="24"/><w:szCs w:val="24"/></w:rPr><w:t xml:space="preserve">Elaboração de </w:t></w:r><w:r><w:rPr><w:rFonts w:ascii="Ebrima" w:hAnsi="Ebrima"/><w:sz w:val="24"/><w:szCs w:val="24"/></w:rPr><w:t>{quantidadePgrcc} ({quantidadePgrccExtenso})</w:t></w:r><w:r><w:rPr><w:rFonts w:ascii="Ebrima" w:hAnsi="Ebrima"/><w:sz w:val="24"/><w:szCs w:val="24"/></w:rPr><w:t xml:space="preserve"> </w:t></w:r><w:r><w:rPr><w:rFonts w:ascii="Ebrima" w:hAnsi="Ebrima"/><w:sz w:val="24"/><w:szCs w:val="24"/></w:rPr><w:t>R</w:t></w:r><w:r><w:rPr><w:rFonts w:ascii="Ebrima" w:hAnsi="Ebrima"/><w:sz w:val="24"/><w:szCs w:val="24"/></w:rPr><w:t>elatório</w:t></w:r><w:r><w:rPr><w:rFonts w:ascii="Ebrima" w:hAnsi="Ebrima"/><w:sz w:val="24"/><w:szCs w:val="24"/></w:rPr><w:t xml:space="preserve"> </w:t></w:r><w:r><w:rPr><w:rFonts w:ascii="Ebrima" w:hAnsi="Ebrima"/><w:sz w:val="24"/><w:szCs w:val="24"/></w:rPr><w:t>de gerenciamento de resíduos da construção civil relativo à</w:t></w:r><w:r><w:rPr><w:rFonts w:ascii="Ebrima" w:hAnsi="Ebrima"/><w:sz w:val="24"/><w:szCs w:val="24"/></w:rPr><w:t>s</w:t></w:r><w:r><w:rPr><w:rFonts w:ascii="Ebrima" w:hAnsi="Ebrima"/><w:sz w:val="24"/><w:szCs w:val="24"/></w:rPr><w:t xml:space="preserve"> obra</w:t></w:r><w:r><w:rPr><w:rFonts w:ascii="Ebrima" w:hAnsi="Ebrima"/><w:sz w:val="24"/><w:szCs w:val="24"/></w:rPr><w:t>s</w:t></w:r><w:r><w:rPr><w:rFonts w:ascii="Ebrima" w:hAnsi="Ebrima"/><w:sz w:val="24"/><w:szCs w:val="24"/></w:rPr><w:t xml:space="preserve"> de </w:t></w:r><w:r><w:rPr><w:rFonts w:ascii="Ebrima" w:hAnsi="Ebrima"/><w:sz w:val="24"/><w:szCs w:val="24"/></w:rPr><w:t>demolição</w:t></w:r><w:r><w:rPr><w:rFonts w:ascii="Ebrima" w:hAnsi="Ebrima"/><w:sz w:val="24"/><w:szCs w:val="24"/></w:rPr><w:t xml:space="preserve">. O Relatório de Gerenciamento de Resíduos da Construção Civil (RGRCC) tem por objetivo principal comprovar ao órgão ambiental (SMMA/PMC) a efetiva implantação do PGRCC precedente, bem como subsidiar a emissão </w:t></w:r><w:r><w:rPr><w:rFonts w:ascii="Ebrima" w:hAnsi="Ebrima"/><w:sz w:val="24"/><w:szCs w:val="24"/></w:rPr><w:t>do Certificado de Demolição</w:t></w:r><w:r><w:rPr><w:rFonts w:ascii="Ebrima" w:hAnsi="Ebrima"/><w:sz w:val="24"/><w:szCs w:val="24"/></w:rPr><w:t xml:space="preserve">. O relatório contempla a apresentação das empresas parceiras da Construtora utilizadas no gerenciamento dos resíduos da obra, bem como a apresentação de comprovantes fornecidos pela </w:t></w:r><w:r><w:rPr><w:rFonts w:ascii="Ebrima" w:hAnsi="Ebrima"/><w:sz w:val="24"/><w:szCs w:val="24"/></w:rPr><w:t>CONTRATANTE</w:t></w:r><w:r><w:rPr><w:rFonts w:ascii="Ebrima" w:hAnsi="Ebrima"/><w:sz w:val="24"/><w:szCs w:val="24"/></w:rPr><w:t xml:space="preserve"> e terceiros durante o gerenciamento dos resíduos na obra (coleta, transporte e destino de resíduos). </w:t></w:r><w:r><w:rPr><w:rFonts w:ascii="Ebrima" w:hAnsi="Ebrima"/><w:sz w:val="24"/><w:szCs w:val="24"/></w:rPr><w:t>Inclui v</w:t></w:r><w:r><w:rPr><w:rFonts w:ascii="Ebrima" w:hAnsi="Ebrima"/><w:sz w:val="24"/><w:szCs w:val="24"/></w:rPr><w:t>erificação dos documentos apresentados</w:t></w:r><w:r><w:rPr><w:rFonts w:ascii="Ebrima" w:hAnsi="Ebrima"/><w:sz w:val="24"/><w:szCs w:val="24"/></w:rPr><w:t xml:space="preserve">, consolidação das informações e Anotação de Responsabilidade Técnica �- ART/CREA, além de serviços de protocolo junto à plataforma SIMA e acompanhamento processual até a emissão do respectivo Parecer Técnico. </w:t></w:r></w:p><w:p><w:pPr><w:jc w:val="both"/><w:rPr><w:rFonts w:ascii="Ebrima" w:hAnsi="Ebrima"/><w:sz w:val="24"/><w:szCs w:val="24"/></w:rPr></w:pPr><w:r><w:rPr><w:rFonts w:ascii="Ebrima" w:hAnsi="Ebrima"/><w:sz w:val="24"/><w:szCs w:val="24"/></w:rPr><w:lastRenderedPageBreak/><w:t>Demais serviços não especificados neste documento serão objeto de novo orçamento.</w:t></w:r></w:p><w:p><w:pPr><w:jc w:val="both"/><w:rPr><w:rFonts w:ascii="Ebrima" w:hAnsi="Ebrima"/><w:sz w:val="24"/><w:szCs w:val="24"/></w:rPr></w:pPr></w:p><w:p><w:pPr><w:jc w:val="both"/><w:rPr><w:rFonts w:ascii="Ebrima" w:hAnsi="Ebrima"/><w:sz w:val="24"/><w:szCs w:val="24"/></w:rPr></w:pPr><w:r><w:rPr><w:rFonts w:ascii="Ebrima" w:hAnsi="Ebrima"/><w:b/><w:smallCaps/><w:sz w:val="24"/><w:szCs w:val="24"/></w:rPr><w:t>Prazo de Execução</w:t></w:r><w:r><w:rPr><w:rFonts w:ascii="Ebrima" w:hAnsi="Ebrima"/><w:smallCaps/><w:sz w:val="24"/><w:szCs w:val="24"/></w:rPr><w:t xml:space="preserve">: </w:t></w:r><w:r><w:rPr><w:rFonts w:ascii="Ebrima" w:hAnsi="Ebrima"/><w:sz w:val="24"/><w:szCs w:val="24"/></w:rPr><w:t xml:space="preserve">Negociável, conforme necessidades </w:t></w:r><w:r><w:rPr><w:rFonts w:ascii="Ebrima" w:hAnsi="Ebrima"/><w:sz w:val="24"/><w:szCs w:val="24"/></w:rPr><w:t>da CONTRATANTE, condicionado à disponibilização das informações</w:t></w:r><w:r><w:rPr><w:rFonts w:ascii="Ebrima" w:hAnsi="Ebrima"/><w:sz w:val="24"/><w:szCs w:val="24"/></w:rPr><w:t>.</w:t></w:r></w:p><w:p><w:pPr><w:jc w:val="both"/><w:rPr><w:rFonts w:ascii="Ebrima" w:hAnsi="Ebrima"/><w:sz w:val="24"/><w:szCs w:val="24"/></w:rPr></w:pPr></w:p><w:p><w:pPr><w:pStyle w:val="Corpo"/><w:tabs><w:tab w:val="left" w:pos="720"/><w:tab w:val="left" w:pos="1440"/><w:tab w:val="left" w:pos="2160"/><w:tab w:val="left" w:pos="2880"/><w:tab w:val="left" w:pos="3600"/><w:tab w:val="left" w:pos="4320"/><w:tab w:val="left" w:pos="5040"/><w:tab w:val="left" w:pos="5760"/><w:tab w:val="left" w:pos="6480"/><w:tab w:val="left" w:pos="7200"/><w:tab w:val="left" w:pos="7920"/><w:tab w:val="left" w:pos="8640"/></w:tabs><w:jc w:val="both"/><w:rPr><w:rFonts w:ascii="Ebrima" w:hAnsi="Ebrima"/><w:b/><w:smallCaps/><w:sz w:val="24"/><w:szCs w:val="24"/></w:rPr></w:pPr><w:r><w:rPr><w:rFonts w:ascii="Ebrima" w:hAnsi="Ebrima"/><w:b/><w:smallCaps/><w:sz w:val="24"/><w:szCs w:val="24"/></w:rPr><w:t xml:space="preserve">Investimento: </w:t></w:r></w:p><w:tbl><w:tblPr><w:tblW w:w="12585" w:type="dxa"/><w:tblInd w:w="-5" w:type="dxa"/><w:tblLayout w:type="fixed"/><w:tblCellMar><w:left w:w="70" w:type="dxa"/><w:right w:w="70" w:type="dxa"/></w:tblCellMar><w:tblLook w:val="04A0" w:firstRow="1" w:lastRow="0" w:firstColumn="1" w:lastColumn="0" w:noHBand="0" w:noVBand="1"/></w:tblPr><w:tblGrid><w:gridCol w:w="575"/><w:gridCol w:w="3531"/><w:gridCol w:w="709"/><w:gridCol w:w="567"/><w:gridCol w:w="709"/><w:gridCol w:w="1306"/><w:gridCol w:w="1418"/><w:gridCol w:w="1563"/><w:gridCol w:w="1041"/><w:gridCol w:w="1166"/></w:tblGrid><w:tr><w:trPr><w:gridAfter w:val="3"/><w:wAfter w:w="3770" w:type="dxa"/><w:trHeight w:val="300"/></w:trPr><w:tc><w:tcPr><w:tcW w:w="575" w:type="dxa"/><w:vMerge w:val="restart"/><w:tcBorders><w:top w:val="single" w:sz="8" w:space="0" w:color="auto"/><w:left w:val="single" w:sz="8" w:space="0" w:color="auto"/><w:bottom w:val="single" w:sz="8" w:space="0" w:color="000000"/><w:right w:val="single" w:sz="4" w:space="0" w:color="auto"/></w:tcBorders><w:shd w:val="clear" w:color="000000" w:fill="FFFFFF"/><w:noWrap/><w:vAlign w:val="bottom"/><w:hideMark/></w:tcPr><w:p><w:pPr><w:jc w:val="center"/><w:rPr><w:rFonts w:ascii="Ebrima" w:hAnsi="Ebrima" w:cs="Calibri"/><w:b/><w:bCs/><w:color w:val="000000"/></w:rPr></w:pPr><w:r><w:rPr><w:rFonts w:ascii="Ebrima" w:hAnsi="Ebrima" w:cs="Calibri"/><w:b/><w:bCs/><w:color w:val="000000"/></w:rPr><w:t>Item</w:t></w:r></w:p></w:tc><w:tc><w:tcPr><w:tcW w:w="3531" w:type="dxa"/><w:vMerge w:val="restart"/><w:tcBorders><w:top w:val="single" w:sz="8" w:space="0" w:color="auto"/><w:left w:val="single" w:sz="4" w:space="0" w:color="auto"/><w:bottom w:val="single" w:sz="8" w:space="0" w:color="000000"/><w:right w:val="single" w:sz="4" w:space="0" w:color="000000"/></w:tcBorders><w:shd w:val="clear" w:color="000000" w:fill="FFFFFF"/><w:noWrap/><w:vAlign w:val="bottom"/><w:hideMark/></w:tcPr><w:p><w:pPr><w:jc w:val="center"/><w:rPr><w:rFonts w:ascii="Ebrima" w:hAnsi="Ebrima" w:cs="Calibri"/><w:b/><w:bCs/><w:color w:val="000000"/></w:rPr></w:pPr><w:r><w:rPr><w:rFonts w:ascii="Ebrima" w:hAnsi="Ebrima" w:cs="Calibri"/><w:b/><w:bCs/><w:color w:val="000000"/></w:rPr><w:t>Descrição</w:t></w:r></w:p></w:tc><w:tc><w:tcPr><w:tcW w:w="1276" w:type="dxa"/><w:gridSpan w:val="2"/><w:tcBorders><w:top w:val="single" w:sz="8" w:space="0" w:color="auto"/><w:left w:val="nil"/><w:bottom w:val="single" w:sz="4" w:space="0" w:color="auto"/><w:right w:val="single" w:sz="4" w:space="0" w:color="000000"/></w:tcBorders><w:shd w:val="clear" w:color="000000" w:fill="FFFFFF"/><w:noWrap/><w:vAlign w:val="bottom"/><w:hideMark/></w:tcPr><w:p><w:pPr><w:jc w:val="center"/><w:rPr><w:rFonts w:ascii="Ebrima" w:hAnsi="Ebrima" w:cs="Calibri"/><w:b/><w:bCs/><w:color w:val="000000"/></w:rPr></w:pPr><w:r><w:rPr><w:rFonts w:ascii="Ebrima" w:hAnsi="Ebrima" w:cs="Calibri"/><w:b/><w:bCs/><w:color w:val="000000"/></w:rPr><w:t>S.T.*</w:t></w:r></w:p></w:tc><w:tc><w:tcPr><w:tcW w:w="709" w:type="dxa"/><w:vMerge w:val="restart"/><w:tcBorders><w:top w:val="single" w:sz="8" w:space="0" w:color="auto"/><w:left w:val="single" w:sz="4" w:space="0" w:color="auto"/><w:bottom w:val="single" w:sz="8" w:space="0" w:color="000000"/><w:right w:val="single" w:sz="4" w:space="0" w:color="auto"/></w:tcBorders><w:shd w:val="clear" w:color="000000" w:fill="FFFFFF"/><w:vAlign w:val="bottom"/><w:hideMark/></w:tcPr><w:p><w:pPr><w:jc w:val="center"/><w:rPr><w:rFonts w:ascii="Ebrima" w:hAnsi="Ebrima" w:cs="Calibri"/><w:b/><w:bCs/><w:color w:val="000000"/></w:rPr></w:pPr><w:r><w:rPr><w:rFonts w:ascii="Ebrima" w:hAnsi="Ebrima" w:cs="Calibri"/><w:b/><w:bCs/><w:color w:val="000000"/></w:rPr><w:t>D.A.*</w:t></w:r></w:p></w:tc><w:tc><w:tcPr><w:tcW w:w="1306" w:type="dxa"/><w:vMerge w:val="restart"/><w:tcBorders><w:top w:val="single" w:sz="8" w:space="0" w:color="auto"/><w:left w:val="single" w:sz="4" w:space="0" w:color="auto"/><w:right w:val="single" w:sz="4" w:space="0" w:color="auto"/></w:tcBorders><w:shd w:val="clear" w:color="auto" w:fill="F2F2F2" w:themeFill="background1" w:themeFillShade="F2"/><w:vAlign w:val="center"/></w:tcPr><w:p><w:pPr><w:jc w:val="center"/><w:rPr><w:rFonts w:ascii="Ebrima" w:hAnsi="Ebrima" w:cs="Calibri"/><w:b/><w:bCs/><w:color w:val="000000"/></w:rPr></w:pPr><w:r><w:rPr><w:rFonts w:ascii="Ebrima" w:hAnsi="Ebrima" w:cs="Calibri"/><w:b/><w:bCs/><w:color w:val="000000"/></w:rPr><w:t>Valor</w:t></w:r></w:p></w:tc><w:tc><w:tcPr><w:tcW w:w="1418" w:type="dxa"/><w:vMerge w:val="restart"/><w:tcBorders><w:top w:val="single" w:sz="8" w:space="0" w:color="auto"/><w:left w:val="single" w:sz="4" w:space="0" w:color="auto"/><w:bottom w:val="single" w:sz="8" w:space="0" w:color="000000"/><w:right w:val="single" w:sz="8" w:space="0" w:color="auto"/></w:tcBorders><w:shd w:val="clear" w:color="auto" w:fill="F2F2F2" w:themeFill="background1" w:themeFillShade="F2"/><w:noWrap/><w:vAlign w:val="center"/><w:hideMark/></w:tcPr><w:p><w:pPr><w:jc w:val="center"/><w:rPr><w:rFonts w:ascii="Ebrima" w:hAnsi="Ebrima" w:cs="Calibri"/><w:b/><w:bCs/><w:color w:val="000000"/></w:rPr></w:pPr><w:r><w:rPr><w:rFonts w:ascii="Ebrima" w:hAnsi="Ebrima" w:cs="Calibri"/><w:b/><w:bCs/><w:color w:val="000000"/></w:rPr><w:t xml:space="preserve">Valor C/ DESCONTO </w:t></w:r></w:p></w:tc></w:tr><w:tr><w:trPr><w:gridAfter w:val="3"/><w:wAfter w:w="3770" w:type="dxa"/><w:trHeight w:val="315"/></w:trPr><w:tc><w:tcPr><w:tcW w:w="575" w:type="dxa"/><w:vMerge/><w:tcBorders><w:top w:val="single" w:sz="8" w:space="0" w:color="auto"/><w:left w:val="single" w:sz="8" w:space="0" w:color="auto"/><w:bottom w:val="single" w:sz="8" w:space="0" w:color="000000"/><w:right w:val="single" w:sz="4" w:space="0" w:color="auto"/></w:tcBorders><w:vAlign w:val="center"/><w:hideMark/></w:tcPr><w:p><w:pPr><w:rPr><w:rFonts w:ascii="Ebrima" w:hAnsi="Ebrima" w:cs="Calibri"/><w:b/><w:bCs/><w:color w:val="000000"/></w:rPr></w:pPr></w:p></w:tc><w:tc><w:tcPr><w:tcW w:w="3531" w:type="dxa"/><w:vMerge/><w:tcBorders><w:top w:val="single" w:sz="8" w:space="0" w:color="auto"/><w:left w:val="single" w:sz="4" w:space="0" w:color="auto"/><w:bottom w:val="single" w:sz="8" w:space="0" w:color="000000"/><w:right w:val="single" w:sz="4" w:space="0" w:color="000000"/></w:tcBorders><w:vAlign w:val="center"/><w:hideMark/></w:tcPr><w:p><w:pPr><w:rPr><w:rFonts w:ascii="Ebrima" w:hAnsi="Ebrima" w:cs="Calibri"/><w:b/><w:bCs/><w:color w:val="000000"/></w:rPr></w:pPr></w:p></w:tc><w:tc><w:tcPr><w:tcW w:w="709" w:type="dxa"/><w:tcBorders><w:top w:val="nil"/><w:left w:val="nil"/><w:bottom w:val="single" w:sz="8" w:space="0" w:color="auto"/><w:right w:val="single" w:sz="4" w:space="0" w:color="auto"/></w:tcBorders><w:shd w:val="clear" w:color="000000" w:fill="FFFFFF"/><w:noWrap/><w:vAlign w:val="bottom"/><w:hideMark/></w:tcPr><w:p><w:pPr><w:jc w:val="center"/><w:rPr><w:rFonts w:ascii="Ebrima" w:hAnsi="Ebrima" w:cs="Calibri"/><w:b/><w:bCs/><w:color w:val="000000"/></w:rPr></w:pPr><w:proofErr w:type="spellStart"/><w:r><w:rPr><w:rFonts w:ascii="Ebrima" w:hAnsi="Ebrima" w:cs="Calibri"/><w:b/><w:bCs/><w:color w:val="000000"/></w:rPr><w:t>Qtde</w:t></w:r><w:proofErr w:type="spellEnd"/></w:p></w:tc><w:tc><w:tcPr><w:tcW w:w="567" w:type="dxa"/><w:tcBorders><w:top w:val="nil"/><w:left w:val="nil"/><w:bottom w:val="single" w:sz="8" w:space="0" w:color="auto"/><w:right w:val="single" w:sz="4" w:space="0" w:color="auto"/></w:tcBorders><w:shd w:val="clear" w:color="000000" w:fill="FFFFFF"/><w:noWrap/><w:vAlign w:val="bottom"/><w:hideMark/></w:tcPr><w:p><w:pPr><w:jc w:val="center"/><w:rPr><w:rFonts w:ascii="Ebrima" w:hAnsi="Ebrima" w:cs="Calibri"/><w:b/><w:bCs/><w:color w:val="000000"/></w:rPr></w:pPr><w:r><w:rPr><w:rFonts w:ascii="Ebrima" w:hAnsi="Ebrima" w:cs="Calibri"/><w:b/><w:bCs/><w:color w:val="000000"/></w:rPr><w:t>Un.</w:t></w:r></w:p></w:tc><w:tc><w:tcPr><w:tcW w:w="709" w:type="dxa"/><w:vMerge/><w:tcBorders><w:top w:val="single" w:sz="8" w:space="0" w:color="auto"/><w:left w:val="single" w:sz="4" w:space="0" w:color="auto"/><w:bottom w:val="single" w:sz="8" w:space="0" w:color="000000"/><w:right w:val="single" w:sz="4" w:space="0" w:color="auto"/></w:tcBorders><w:vAlign w:val="center"/><w:hideMark/></w:tcPr><w:p><w:pPr><w:rPr><w:rFonts w:ascii="Ebrima" w:hAnsi="Ebrima" w:cs="Calibri"/><w:b/><w:bCs/><w:color w:val="000000"/></w:rPr></w:pPr></w:p></w:tc><w:tc><w:tcPr><w:tcW w:w="1306" w:type="dxa"/><w:vMerge/><w:tcBorders><w:left w:val="single" w:sz="4" w:space="0" w:color="auto"/><w:bottom w:val="single" w:sz="8" w:space="0" w:color="000000"/><w:right w:val="single" w:sz="4" w:space="0" w:color="auto"/></w:tcBorders><w:shd w:val="clear" w:color="auto" w:fill="F2F2F2" w:themeFill="background1" w:themeFillShade="F2"/></w:tcPr><w:p><w:pPr><w:rPr><w:rFonts w:ascii="Ebrima" w:hAnsi="Ebrima" w:cs="Calibri"/><w:b/><w:bCs/><w:color w:val="000000"/></w:rPr></w:pPr></w:p></w:tc><w:tc><w:tcPr><w:tcW w:w="1418" w:type="dxa"/><w:vMerge/><w:tcBorders><w:top w:val="single" w:sz="8" w:space="0" w:color="auto"/><w:left w:val="single" w:sz="4" w:space="0" w:color="auto"/><w:bottom w:val="single" w:sz="8" w:space="0" w:color="000000"/><w:right w:val="single" w:sz="8" w:space="0" w:color="auto"/></w:tcBorders><w:shd w:val="clear" w:color="auto" w:fill="F2F2F2" w:themeFill="background1" w:themeFillShade="F2"/><w:vAlign w:val="center"/><w:hideMark/></w:tcPr><w:p><w:pPr><w:rPr><w:rFonts w:ascii="Ebrima" w:hAnsi="Ebrima" w:cs="Calibri"/><w:b/><w:bCs/><w:color w:val="000000"/></w:rPr></w:pPr></w:p></w:tc></w:tr><w:tr><w:trPr><w:trHeight w:val="315"/></w:trPr><w:tc><w:tcPr><w:tcW w:w="575" w:type="dxa"/><w:tcBorders><w:top w:val="single" w:sz="4" w:space="0" w:color="auto"/><w:left w:val="single" w:sz="4" w:space="0" w:color="auto"/><w:bottom w:val="single" w:sz="4" w:space="0" w:color="auto"/><w:right w:val="single" w:sz="4" w:space="0" w:color="auto"/></w:tcBorders><w:vAlign w:val="center"/><w:hideMark/></w:tcPr><w:p><w:pPr><w:spacing w:line="256" w:lineRule="auto"/><w:jc w:val="center"/><w:rPr><w:rFonts w:ascii="Ebrima" w:hAnsi="Ebrima"/><w:sz w:val="20"/><w:szCs w:val="20"/></w:rPr></w:pPr><w:r><w:rPr><w:rFonts w:ascii="Ebrima" w:hAnsi="Ebrima"/><w:b/><w:sz w:val="20"/><w:szCs w:val="20"/></w:rPr><w:t xml:space="preserve">1</w:t></w:r></w:p></w:tc><w:tc><w:tcPr><w:tcW w:w="3531" w:type="dxa"/><w:tcBorders><w:top w:val="single" w:sz="4" w:space="0" w:color="auto"/><w:left w:val="single" w:sz="4" w:space="0" w:color="auto"/><w:bottom w:val="single" w:sz="4" w:space="0" w:color="auto"/><w:right w:val="single" w:sz="4" w:space="0" w:color="auto"/></w:tcBorders><w:vAlign w:val="center"/><w:hideMark/></w:tcPr><w:p><w:pPr><w:spacing w:line="256" w:lineRule="auto"/><w:jc w:val="left"/><w:rPr><w:rFonts w:ascii="Ebrima" w:hAnsi="Ebrima"/><w:sz w:val="20"/><w:szCs w:val="20"/></w:rPr></w:pPr><w:r><w:rPr><w:rFonts w:ascii="Ebrima" w:hAnsi="Ebrima"/><w:sz w:val="20"/><w:szCs w:val="20"/></w:rPr><w:t xml:space="preserve">Elaboração de {quantidadePgrcc} PGRCC para obra de demolição.</w:t></w:r></w:p></w:tc><w:tc><w:tcPr><w:tcW w:w="709" w:type="dxa"/><w:tcBorders><w:top w:val="single" w:sz="4" w:space="0" w:color="auto"/><w:left w:val="single" w:sz="4" w:space="0" w:color="auto"/><w:bottom w:val="single" w:sz="4" w:space="0" w:color="auto"/><w:right w:val="single" w:sz="4" w:space="0" w:color="auto"/></w:tcBorders><w:vAlign w:val="center"/><w:hideMark/></w:tcPr><w:p><w:pPr><w:spacing w:line="256" w:lineRule="auto"/><w:jc w:val="center"/><w:rPr><w:rFonts w:ascii="Ebrima" w:hAnsi="Ebrima"/><w:sz w:val="20"/><w:szCs w:val="20"/></w:rPr></w:pPr><w:r><w:rPr><w:rFonts w:ascii="Ebrima" w:hAnsi="Ebrima"/><w:sz w:val="20"/><w:szCs w:val="20"/></w:rPr><w:t xml:space="preserve">n</w:t></w:r></w:p></w:tc><w:tc><w:tcPr><w:tcW w:w="567" w:type="dxa"/><w:tcBorders><w:top w:val="single" w:sz="4" w:space="0" w:color="auto"/><w:left w:val="single" w:sz="4" w:space="0" w:color="auto"/><w:bottom w:val="single" w:sz="4" w:space="0" w:color="auto"/><w:right w:val="single" w:sz="4" w:space="0" w:color="auto"/></w:tcBorders><w:vAlign w:val="center"/><w:hideMark/></w:tcPr><w:p><w:pPr><w:spacing w:line="256" w:lineRule="auto"/><w:jc w:val="center"/><w:rPr><w:rFonts w:ascii="Ebrima" w:hAnsi="Ebrima"/><w:sz w:val="20"/><w:szCs w:val="20"/></w:rPr></w:pPr><w:r><w:rPr><w:rFonts w:ascii="Ebrima" w:hAnsi="Ebrima"/><w:sz w:val="20"/><w:szCs w:val="20"/></w:rPr><w:t xml:space="preserve">HT</w:t></w:r></w:p></w:tc><w:tc><w:tcPr><w:tcW w:w="709" w:type="dxa"/><w:tcBorders><w:top w:val="single" w:sz="4" w:space="0" w:color="auto"/><w:left w:val="single" w:sz="4" w:space="0" w:color="auto"/><w:bottom w:val="single" w:sz="4" w:space="0" w:color="auto"/><w:right w:val="single" w:sz="4" w:space="0" w:color="auto"/></w:tcBorders><w:vAlign w:val="center"/><w:hideMark/></w:tcPr><w:p><w:pPr><w:spacing w:line="256" w:lineRule="auto"/><w:jc w:val="center"/><w:rPr><w:rFonts w:ascii="Ebrima" w:hAnsi="Ebrima"/><w:sz w:val="20"/><w:szCs w:val="20"/></w:rPr></w:pPr><w:r><w:rPr><w:rFonts w:ascii="Ebrima" w:hAnsi="Ebrima"/><w:sz w:val="20"/><w:szCs w:val="20"/></w:rPr><w:t xml:space="preserve">{percentualDesconto}%</w:t></w:r></w:p></w:tc><w:tc><w:tcPr><w:tcW w:w="1306" w:type="dxa"/><w:tcBorders><w:top w:val="single" w:sz="4" w:space="0" w:color="auto"/><w:left w:val="single" w:sz="4" w:space="0" w:color="auto"/><w:bottom w:val="single" w:sz="4" w:space="0" w:color="auto"/><w:right w:val="single" w:sz="4" w:space="0" w:color="auto"/></w:tcBorders><w:vAlign w:val="center"/><w:hideMark/></w:tcPr><w:p><w:pPr><w:spacing w:line="256" w:lineRule="auto"/><w:jc w:val="center"/><w:rPr><w:rFonts w:ascii="Ebrima" w:hAnsi="Ebrima"/><w:sz w:val="20"/><w:szCs w:val="20"/></w:rPr></w:pPr><w:r><w:rPr><w:rFonts w:ascii="Ebrima" w:hAnsi="Ebrima"/><w:b/><w:sz w:val="20"/><w:szCs w:val="20"/></w:rPr><w:t xml:space="preserve">{valorTotalPgrccFormatado}</w:t></w:r></w:p></w:tc><w:tc><w:tcPr><w:tcW w:w="1418" w:type="dxa"/><w:tcBorders><w:top w:val="single" w:sz="4" w:space="0" w:color="auto"/><w:left w:val="single" w:sz="4" w:space="0" w:color="auto"/><w:bottom w:val="single" w:sz="4" w:space="0" w:color="auto"/><w:right w:val="single" w:sz="4" w:space="0" w:color="auto"/></w:tcBorders><w:vAlign w:val="center"/><w:hideMark/></w:tcPr><w:p><w:pPr><w:spacing w:line="256" w:lineRule="auto"/><w:jc w:val="center"/><w:rPr><w:rFonts w:ascii="Ebrima" w:hAnsi="Ebrima"/><w:sz w:val="20"/><w:szCs w:val="20"/></w:rPr></w:pPr><w:r><w:rPr><w:rFonts w:ascii="Ebrima" w:hAnsi="Ebrima"/><w:b/><w:sz w:val="20"/><w:szCs w:val="20"/></w:rPr><w:t xml:space="preserve">{valorLiquidoPgrccFormatado}</w:t></w:r></w:p></w:tc></w:tr><w:tr><w:trPr><w:trHeight w:val="315"/></w:trPr><w:tc><w:tcPr><w:tcW w:w="575" w:type="dxa"/><w:tcBorders><w:top w:val="single" w:sz="4" w:space="0" w:color="auto"/><w:left w:val="single" w:sz="4" w:space="0" w:color="auto"/><w:bottom w:val="single" w:sz="4" w:space="0" w:color="auto"/><w:right w:val="single" w:sz="4" w:space="0" w:color="auto"/></w:tcBorders><w:vAlign w:val="center"/><w:hideMark/></w:tcPr><w:p><w:pPr><w:spacing w:line="256" w:lineRule="auto"/><w:jc w:val="center"/><w:rPr><w:rFonts w:ascii="Ebrima" w:hAnsi="Ebrima"/><w:sz w:val="20"/><w:szCs w:val="20"/></w:rPr></w:pPr><w:r><w:rPr><w:rFonts w:ascii="Ebrima" w:hAnsi="Ebrima"/><w:b/><w:sz w:val="20"/><w:szCs w:val="20"/></w:rPr><w:t xml:space="preserve">2</w:t></w:r></w:p></w:tc><w:tc><w:tcPr><w:tcW w:w="3531" w:type="dxa"/><w:tcBorders><w:top w:val="single" w:sz="4" w:space="0" w:color="auto"/><w:left w:val="single" w:sz="4" w:space="0" w:color="auto"/><w:bottom w:val="single" w:sz="4" w:space="0" w:color="auto"/><w:right w:val="single" w:sz="4" w:space="0" w:color="auto"/></w:tcBorders><w:vAlign w:val="center"/><w:hideMark/></w:tcPr><w:p><w:pPr><w:spacing w:line="256" w:lineRule="auto"/><w:jc w:val="left"/><w:rPr><w:rFonts w:ascii="Ebrima" w:hAnsi="Ebrima"/><w:sz w:val="20"/><w:szCs w:val="20"/></w:rPr></w:pPr><w:r><w:rPr><w:rFonts w:ascii="Ebrima" w:hAnsi="Ebrima"/><w:sz w:val="20"/><w:szCs w:val="20"/></w:rPr><w:t xml:space="preserve">Elaboração de {quantidadeRgrcc} RGRCC para obra de demolição.</w:t></w:r></w:p></w:tc><w:tc><w:tcPr><w:tcW w:w="709" w:type="dxa"/><w:tcBorders><w:top w:val="single" w:sz="4" w:space="0" w:color="auto"/><w:left w:val="single" w:sz="4" w:space="0" w:color="auto"/><w:bottom w:val="single" w:sz="4" w:space="0" w:color="auto"/><w:right w:val="single" w:sz="4" w:space="0" w:color="auto"/></w:tcBorders><w:vAlign w:val="center"/><w:hideMark/></w:tcPr><w:p><w:pPr><w:spacing w:line="256" w:lineRule="auto"/><w:jc w:val="center"/><w:rPr><w:rFonts w:ascii="Ebrima" w:hAnsi="Ebrima"/><w:sz w:val="20"/><w:szCs w:val="20"/></w:rPr></w:pPr><w:r><w:rPr><w:rFonts w:ascii="Ebrima" w:hAnsi="Ebrima"/><w:sz w:val="20"/><w:szCs w:val="20"/></w:rPr><w:t xml:space="preserve">y</w:t></w:r></w:p></w:tc><w:tc><w:tcPr><w:tcW w:w="567" w:type="dxa"/><w:tcBorders><w:top w:val="single" w:sz="4" w:space="0" w:color="auto"/><w:left w:val="single" w:sz="4" w:space="0" w:color="auto"/><w:bottom w:val="single" w:sz="4" w:space="0" w:color="auto"/><w:right w:val="single" w:sz="4" w:space="0" w:color="auto"/></w:tcBorders><w:vAlign w:val="center"/><w:hideMark/></w:tcPr><w:p><w:pPr><w:spacing w:line="256" w:lineRule="auto"/><w:jc w:val="center"/><w:rPr><w:rFonts w:ascii="Ebrima" w:hAnsi="Ebrima"/><w:sz w:val="20"/><w:szCs w:val="20"/></w:rPr></w:pPr><w:r><w:rPr><w:rFonts w:ascii="Ebrima" w:hAnsi="Ebrima"/><w:sz w:val="20"/><w:szCs w:val="20"/></w:rPr><w:t xml:space="preserve">HT</w:t></w:r></w:p></w:tc><w:tc><w:tcPr><w:tcW w:w="709" w:type="dxa"/><w:tcBorders><w:top w:val="single" w:sz="4" w:space="0" w:color="auto"/><w:left w:val="single" w:sz="4" w:space="0" w:color="auto"/><w:bottom w:val="single" w:sz="4" w:space="0" w:color="auto"/><w:right w:val="single" w:sz="4" w:space="0" w:color="auto"/></w:tcBorders><w:vAlign w:val="center"/><w:hideMark/></w:tcPr><w:p><w:pPr><w:spacing w:line="256" w:lineRule="auto"/><w:jc w:val="center"/><w:rPr><w:rFonts w:ascii="Ebrima" w:hAnsi="Ebrima"/><w:sz w:val="20"/><w:szCs w:val="20"/></w:rPr></w:pPr><w:r><w:rPr><w:rFonts w:ascii="Ebrima" w:hAnsi="Ebrima"/><w:sz w:val="20"/><w:szCs w:val="20"/></w:rPr><w:t xml:space="preserve">{percentualDesconto}%</w:t></w:r></w:p></w:tc><w:tc><w:tcPr><w:tcW w:w="1306" w:type="dxa"/><w:tcBorders><w:top w:val="single" w:sz="4" w:space="0" w:color="auto"/><w:left w:val="single" w:sz="4" w:space="0" w:color="auto"/><w:bottom w:val="single" w:sz="4" w:space="0" w:color="auto"/><w:right w:val="single" w:sz="4" w:space="0" w:color="auto"/></w:tcBorders><w:vAlign w:val="center"/><w:hideMark/></w:tcPr><w:p><w:pPr><w:spacing w:line="256" w:lineRule="auto"/><w:jc w:val="center"/><w:rPr><w:rFonts w:ascii="Ebrima" w:hAnsi="Ebrima"/><w:sz w:val="20"/><w:szCs w:val="20"/></w:rPr></w:pPr><w:r><w:rPr><w:rFonts w:ascii="Ebrima" w:hAnsi="Ebrima"/><w:b/><w:sz w:val="20"/><w:szCs w:val="20"/></w:rPr><w:t xml:space="preserve">{valorTotalRgrccFormatado}</w:t></w:r></w:p></w:tc><w:tc><w:tcPr><w:tcW w:w="1418" w:type="dxa"/><w:tcBorders><w:top w:val="single" w:sz="4" w:space="0" w:color="auto"/><w:left w:val="single" w:sz="4" w:space="0" w:color="auto"/><w:bottom w:val="single" w:sz="4" w:space="0" w:color="auto"/><w:right w:val="single" w:sz="4" w:space="0" w:color="auto"/></w:tcBorders><w:vAlign w:val="center"/><w:hideMark/></w:tcPr><w:p><w:pPr><w:spacing w:line="256" w:lineRule="auto"/><w:jc w:val="center"/><w:rPr><w:rFonts w:ascii="Ebrima" w:hAnsi="Ebrima"/><w:sz w:val="20"/><w:szCs w:val="20"/></w:rPr></w:pPr><w:r><w:rPr><w:rFonts w:ascii="Ebrima" w:hAnsi="Ebrima"/><w:b/><w:sz w:val="20"/><w:szCs w:val="20"/></w:rPr><w:t xml:space="preserve">{valorLiquidoRgrccFormatado}</w:t></w:r></w:p></w:tc></w:tr><w:tr><w:trPr><w:trHeight w:val="325"/></w:trPr><w:tc><w:tcPr><w:tcW w:w="6091" w:type="dxa"/><w:gridSpan w:val="5"/><w:tcBorders><w:top w:val="single" w:sz="4" w:space="0" w:color="auto"/><w:left w:val="single" w:sz="4" w:space="0" w:color="auto"/><w:bottom w:val="single" w:sz="4" w:space="0" w:color="auto"/><w:right w:val="single" w:sz="4" w:space="0" w:color="auto"/></w:tcBorders><w:vAlign w:val="center"/><w:hideMark/></w:tcPr><w:p><w:pPr><w:spacing w:line="256" w:lineRule="auto"/><w:jc w:val="left"/><w:rPr><w:rFonts w:ascii="Ebrima" w:hAnsi="Ebrima"/><w:sz w:val="20"/><w:szCs w:val="20"/></w:rPr></w:pPr><w:r><w:rPr><w:rFonts w:ascii="Ebrima" w:hAnsi="Ebrima"/><w:b/><w:sz w:val="20"/><w:szCs w:val="20"/></w:rPr><w:t xml:space="preserve">Anotação de Responsabilidade Técnica CREA-PR</w:t></w:r></w:p></w:tc><w:tc><w:tcPr><w:tcW w:w="2724" w:type="dxa"/><w:gridSpan w:val="2"/><w:tcBorders><w:top w:val="single" w:sz="4" w:space="0" w:color="auto"/><w:left w:val="single" w:sz="4" w:space="0" w:color="auto"/><w:bottom w:val="single" w:sz="4" w:space="0" w:color="auto"/><w:right w:val="single" w:sz="4" w:space="0" w:color="auto"/></w:tcBorders><w:vAlign w:val="center"/><w:hideMark/></w:tcPr><w:p><w:pPr><w:spacing w:line="256" w:lineRule="auto"/><w:jc w:val="center"/><w:rPr><w:rFonts w:ascii="Ebrima" w:hAnsi="Ebrima"/><w:sz w:val="20"/><w:szCs w:val="20"/></w:rPr></w:pPr><w:r><w:rPr><w:rFonts w:ascii="Ebrima" w:hAnsi="Ebrima"/><w:sz w:val="20"/><w:szCs w:val="20"/></w:rPr><w:t xml:space="preserve">inclusa</w:t></w:r></w:p></w:tc><w:tc><w:tcPr><w:tcW w:w="1563" w:type="dxa"/><w:tcBorders><w:top w:val="single" w:sz="4" w:space="0" w:color="auto"/><w:left w:val="single" w:sz="4" w:space="0" w:color="auto"/><w:bottom w:val="single" w:sz="4" w:space="0" w:color="auto"/><w:right w:val="single" w:sz="4" w:space="0" w:color="auto"/></w:tcBorders><w:vAlign w:val="center"/><w:hideMark/></w:tcPr><w:p><w:pPr><w:spacing w:line="256" w:lineRule="auto"/><w:jc w:val="center"/><w:rPr><w:rFonts w:ascii="Ebrima" w:hAnsi="Ebrima"/><w:sz w:val="20"/><w:szCs w:val="20"/></w:rPr></w:pPr><w:r><w:rPr><w:rFonts w:ascii="Ebrima" w:hAnsi="Ebrima"/><w:sz w:val="20"/><w:szCs w:val="20"/></w:rPr><w:t xml:space="preserve"></w:t></w:r></w:p></w:tc><w:tc><w:tcPr><w:tcW w:w="1041" w:type="dxa"/><w:tcBorders><w:top w:val="single" w:sz="4" w:space="0" w:color="auto"/><w:left w:val="single" w:sz="4" w:space="0" w:color="auto"/><w:bottom w:val="single" w:sz="4" w:space="0" w:color="auto"/><w:right w:val="single" w:sz="4" w:space="0" w:color="auto"/></w:tcBorders><w:vAlign w:val="center"/><w:hideMark/></w:tcPr><w:p><w:pPr><w:spacing w:line="256" w:lineRule="auto"/><w:jc w:val="center"/><w:rPr><w:rFonts w:ascii="Ebrima" w:hAnsi="Ebrima"/><w:sz w:val="20"/><w:szCs w:val="20"/></w:rPr></w:pPr><w:r><w:rPr><w:rFonts w:ascii="Ebrima" w:hAnsi="Ebrima"/><w:sz w:val="20"/><w:szCs w:val="20"/></w:rPr><w:t xml:space="preserve"></w:t></w:r></w:p></w:tc><w:tc><w:tcPr><w:tcW w:w="1166" w:type="dxa"/><w:tcBorders><w:top w:val="single" w:sz="4" w:space="0" w:color="auto"/><w:left w:val="single" w:sz="4" w:space="0" w:color="auto"/><w:bottom w:val="single" w:sz="4" w:space="0" w:color="auto"/><w:right w:val="single" w:sz="4" w:space="0" w:color="auto"/></w:tcBorders><w:vAlign w:val="center"/><w:hideMark/></w:tcPr><w:p><w:pPr><w:spacing w:line="256" w:lineRule="auto"/><w:jc w:val="center"/><w:rPr><w:rFonts w:ascii="Ebrima" w:hAnsi="Ebrima"/><w:sz w:val="20"/><w:szCs w:val="20"/></w:rPr></w:pPr><w:r><w:rPr><w:rFonts w:ascii="Ebrima" w:hAnsi="Ebrima"/><w:sz w:val="20"/><w:szCs w:val="20"/></w:rPr><w:t xml:space="preserve">incluso</w:t></w:r></w:p></w:tc></w:tr></w:tbl><w:p><w:pPr><w:pStyle w:val="Corpo"/><w:tabs><w:tab w:val="left" w:pos="720"/><w:tab w:val="left" w:pos="1440"/><w:tab w:val="left" w:pos="2160"/><w:tab w:val="left" w:pos="2880"/><w:tab w:val="left" w:pos="3600"/><w:tab w:val="left" w:pos="4320"/><w:tab w:val="left" w:pos="5040"/><w:tab w:val="left" w:pos="5760"/><w:tab w:val="left" w:pos="6480"/><w:tab w:val="left" w:pos="7200"/><w:tab w:val="left" w:pos="7920"/><w:tab w:val="left" w:pos="8640"/></w:tabs><w:jc w:val="center"/><w:rPr><w:rFonts w:ascii="Ebrima" w:hAnsi="Ebrima"/><w:bCs/><w:smallCaps/><w:sz w:val="20"/></w:rPr></w:pPr><w:r><w:rPr><w:rFonts w:ascii="Ebrima" w:hAnsi="Ebrima"/><w:bCs/><w:smallCaps/><w:sz w:val="20"/></w:rPr><w:t>* 1 HT</w:t></w:r><w:r><w:rPr><w:rFonts w:ascii="Ebrima" w:hAnsi="Ebrima"/><w:bCs/><w:smallCaps/><w:sz w:val="20"/></w:rPr><w:t xml:space="preserve"> </w:t></w:r><w:r><w:rPr><w:rFonts w:ascii="Ebrima" w:hAnsi="Ebrima"/><w:bCs/><w:smallCaps/><w:sz w:val="20"/></w:rPr><w:t xml:space="preserve">= R$ </w:t></w:r><w:r><w:rPr><w:rFonts w:ascii="Ebrima" w:hAnsi="Ebrima"/><w:bCs/><w:smallCaps/><w:sz w:val="20"/></w:rPr><w:t>2</w:t></w:r><w:r><w:rPr><w:rFonts w:ascii="Ebrima" w:hAnsi="Ebrima"/><w:bCs/><w:smallCaps/><w:sz w:val="20"/></w:rPr><w:t>91,78</w:t></w:r><w:r><w:rPr><w:rFonts w:ascii="Ebrima" w:hAnsi="Ebrima"/><w:bCs/><w:smallCaps/><w:sz w:val="20"/></w:rPr><w:t xml:space="preserve"> (valor correspondente a 3% de 6 </w:t></w:r><w:proofErr w:type="gramStart"/><w:r><w:rPr><w:rFonts w:ascii="Ebrima" w:hAnsi="Ebrima"/><w:bCs/><w:smallCaps/><w:sz w:val="20"/></w:rPr><w:t>salários mínimos</w:t></w:r><w:proofErr w:type="gramEnd"/><w:r><w:rPr><w:rFonts w:ascii="Ebrima" w:hAnsi="Ebrima"/><w:bCs/><w:smallCaps/><w:sz w:val="20"/></w:rPr><w:t xml:space="preserve"> = SENGE-PR)</w:t></w:r></w:p><w:p><w:pPr><w:pStyle w:val="Corpo"/><w:tabs><w:tab w:val="left" w:pos="720"/><w:tab w:val="left" w:pos="1440"/><w:tab w:val="left" w:pos="2160"/><w:tab w:val="left" w:pos="2880"/><w:tab w:val="left" w:pos="3600"/><w:tab w:val="left" w:pos="4320"/><w:tab w:val="left" w:pos="5040"/><w:tab w:val="left" w:pos="5760"/><w:tab w:val="left" w:pos="6480"/><w:tab w:val="left" w:pos="7200"/><w:tab w:val="left" w:pos="7920"/><w:tab w:val="left" w:pos="8640"/></w:tabs><w:jc w:val="center"/><w:rPr><w:rFonts w:ascii="Ebrima" w:hAnsi="Ebrima"/><w:b/><w:smallCaps/><w:sz w:val="24"/><w:szCs w:val="24"/></w:rPr></w:pPr><w:r><w:rPr><w:rFonts w:ascii="Ebrima" w:hAnsi="Ebrima"/><w:bCs/><w:smallCaps/><w:sz w:val="20"/></w:rPr><w:t>S.T. = Serviços técnicos</w:t></w:r><w:r><w:rPr><w:rFonts w:ascii="Ebrima" w:hAnsi="Ebrima"/><w:bCs/><w:smallCaps/><w:sz w:val="20"/></w:rPr><w:tab/></w:r><w:r><w:rPr><w:rFonts w:ascii="Ebrima" w:hAnsi="Ebrima"/><w:bCs/><w:smallCaps/><w:sz w:val="20"/></w:rPr><w:t>/</w:t></w:r><w:r><w:rPr><w:rFonts w:ascii="Ebrima" w:hAnsi="Ebrima"/><w:bCs/><w:smallCaps/><w:sz w:val="20"/></w:rPr><w:t xml:space="preserve"> D.A.</w:t></w:r><w:r><w:rPr><w:rFonts w:ascii="Ebrima" w:hAnsi="Ebrima"/><w:bCs/><w:smallCaps/><w:sz w:val="20"/></w:rPr><w:t xml:space="preserve"> = Despesas administrativas e tributárias</w:t></w:r></w:p><w:p><w:pPr><w:pStyle w:val="Corpo"/><w:tabs><w:tab w:val="left" w:pos="720"/><w:tab w:val="left" w:pos="1440"/><w:tab w:val="left" w:pos="2160"/><w:tab w:val="left" w:pos="2880"/><w:tab w:val="left" w:pos="3600"/><w:tab w:val="left" w:pos="4320"/><w:tab w:val="left" w:pos="5040"/><w:tab w:val="left" w:pos="5760"/><w:tab w:val="left" w:pos="6480"/><w:tab w:val="left" w:pos="7200"/><w:tab w:val="left" w:pos="7920"/><w:tab w:val="left" w:pos="8640"/></w:tabs><w:jc w:val="both"/><w:rPr><w:rFonts w:ascii="Ebrima" w:hAnsi="Ebrima"/><w:b/><w:smallCaps/><w:sz w:val="24"/><w:szCs w:val="24"/></w:rPr></w:pPr></w:p><w:p><w:pPr><w:pStyle w:val="Corpo"/><w:tabs><w:tab w:val="left" w:pos="720"/><w:tab w:val="left" w:pos="1440"/><w:tab w:val="left" w:pos="2160"/><w:tab w:val="left" w:pos="2880"/><w:tab w:val="left" w:pos="3600"/><w:tab w:val="left" w:pos="4320"/><w:tab w:val="left" w:pos="5040"/><w:tab w:val="left" w:pos="5760"/><w:tab w:val="left" w:pos="6480"/><w:tab w:val="left" w:pos="7200"/><w:tab w:val="left" w:pos="7920"/><w:tab w:val="left" w:pos="8640"/></w:tabs><w:jc w:val="both"/><w:rPr><w:rFonts w:ascii="Ebrima" w:hAnsi="Ebrima"/><w:sz w:val="24"/><w:szCs w:val="24"/></w:rPr></w:pPr><w:r><w:rPr><w:rFonts w:ascii="Ebrima" w:hAnsi="Ebrima"/><w:b/><w:smallCaps/><w:sz w:val="24"/><w:szCs w:val="24"/></w:rPr><w:t>Validade da Proposta</w:t></w:r><w:r><w:rPr><w:rFonts w:ascii="Ebrima" w:hAnsi="Ebrima"/><w:smallCaps/><w:sz w:val="24"/><w:szCs w:val="24"/></w:rPr><w:t xml:space="preserve">: </w:t></w:r><w:r><w:rPr><w:rFonts w:ascii="Ebrima" w:hAnsi="Ebrima"/><w:sz w:val="24"/><w:szCs w:val="24"/></w:rPr><w:t>30 dias</w:t></w:r></w:p><w:p><w:pPr><w:jc w:val="both"/><w:rPr><w:rFonts w:ascii="Ebrima" w:hAnsi="Ebrima"/><w:b/><w:smallCaps/><w:sz w:val="24"/><w:szCs w:val="24"/></w:rPr></w:pPr></w:p><w:p><w:pPr><w:pStyle w:val="Corpo"/><w:tabs><w:tab w:val="left" w:pos="720"/><w:tab w:val="left" w:pos="1440"/><w:tab w:val="left" w:pos="2160"/><w:tab w:val="left" w:pos="2880"/><w:tab w:val="left" w:pos="3600"/><w:tab w:val="left" w:pos="4320"/><w:tab w:val="left" w:pos="5040"/><w:tab w:val="left" w:pos="5760"/><w:tab w:val="left" w:pos="6480"/><w:tab w:val="left" w:pos="7200"/><w:tab w:val="left" w:pos="7920"/><w:tab w:val="left" w:pos="8640"/></w:tabs><w:jc w:val="both"/><w:rPr><w:rFonts w:ascii="Ebrima" w:hAnsi="Ebrima"/><w:sz w:val="24"/><w:szCs w:val="24"/></w:rPr></w:pPr><w:r><w:rPr><w:rFonts w:ascii="Ebrima" w:hAnsi="Ebrima"/><w:b/><w:smallCaps/><w:sz w:val="24"/><w:szCs w:val="24"/></w:rPr><w:t>Reajuste</w:t></w:r><w:r><w:rPr><w:rFonts w:ascii="Ebrima" w:hAnsi="Ebrima"/><w:smallCaps/><w:sz w:val="24"/><w:szCs w:val="24"/></w:rPr><w:t xml:space="preserve">: </w:t></w:r><w:r><w:rPr><w:rFonts w:ascii="Ebrima" w:hAnsi="Ebrima"/><w:sz w:val="24"/><w:szCs w:val="24"/></w:rPr><w:t xml:space="preserve">Os valores apresentados são válidos pelo período de </w:t></w:r><w:r><w:rPr><w:rFonts w:ascii="Ebrima" w:hAnsi="Ebrima"/><w:sz w:val="24"/><w:szCs w:val="24"/></w:rPr><w:t>12</w:t></w:r><w:r><w:rPr><w:rFonts w:ascii="Ebrima" w:hAnsi="Ebrima"/><w:sz w:val="24"/><w:szCs w:val="24"/></w:rPr><w:t xml:space="preserve"> meses a contar da data de aprovação da proposta</w:t></w:r><w:r><w:rPr><w:rFonts w:ascii="Ebrima" w:hAnsi="Ebrima"/><w:sz w:val="24"/><w:szCs w:val="24"/></w:rPr><w:t>. A</w:t></w:r><w:r><w:rPr><w:rFonts w:ascii="Ebrima" w:hAnsi="Ebrima"/><w:sz w:val="24"/><w:szCs w:val="24"/></w:rPr><w:t xml:space="preserve">pós este período </w:t></w:r><w:r><w:rPr><w:rFonts w:ascii="Ebrima" w:hAnsi="Ebrima"/><w:sz w:val="24"/><w:szCs w:val="24"/></w:rPr><w:t xml:space="preserve">o valor será reajustado </w:t></w:r><w:r><w:rPr><w:rFonts w:ascii="Ebrima" w:hAnsi="Ebrima"/><w:sz w:val="24"/><w:szCs w:val="24"/></w:rPr><w:t xml:space="preserve">anualmente </w:t></w:r><w:r><w:rPr><w:rFonts w:ascii="Ebrima" w:hAnsi="Ebrima"/><w:sz w:val="24"/><w:szCs w:val="24"/></w:rPr><w:t>de acordo com o valor atualizado da hora técnica (indexado ao salário-mínimo) ou subsidiariamente pelo INCC</w:t></w:r><w:r><w:rPr><w:rFonts w:ascii="Ebrima" w:hAnsi="Ebrima"/><w:sz w:val="24"/><w:szCs w:val="24"/></w:rPr><w:t>.</w:t></w:r></w:p><w:p><w:pPr><w:pStyle w:val="Corpo"/><w:tabs><w:tab w:val="left" w:pos="720"/><w:tab w:val="left" w:pos="1440"/><w:tab w:val="left" w:pos="2160"/><w:tab w:val="left" w:pos="2880"/><w:tab w:val="left" w:pos="3600"/><w:tab w:val="left" w:pos="4320"/><w:tab w:val="left" w:pos="5040"/><w:tab w:val="left" w:pos="5760"/><w:tab w:val="left" w:pos="6480"/><w:tab w:val="left" w:pos="7200"/><w:tab w:val="left" w:pos="7920"/><w:tab w:val="left" w:pos="8640"/></w:tabs><w:jc w:val="both"/><w:rPr><w:rFonts w:ascii="Ebrima" w:hAnsi="Ebrima"/><w:sz w:val="24"/><w:szCs w:val="24"/></w:rPr></w:pPr></w:p><w:p><w:pPr><w:pStyle w:val="Corpo"/><w:tabs><w:tab w:val="left" w:pos="720"/><w:tab w:val="left" w:pos="1440"/><w:tab w:val="left" w:pos="2160"/><w:tab w:val="left" w:pos="2880"/><w:tab w:val="left" w:pos="3600"/><w:tab w:val="left" w:pos="4320"/><w:tab w:val="left" w:pos="5040"/><w:tab w:val="left" w:pos="5760"/><w:tab w:val="left" w:pos="6480"/><w:tab w:val="left" w:pos="7200"/><w:tab w:val="left" w:pos="7920"/><w:tab w:val="left" w:pos="8640"/></w:tabs><w:jc w:val="both"/><w:rPr><w:rFonts w:ascii="Ebrima" w:hAnsi="Ebrima"/><w:b/><w:bCs/><w:smallCaps/><w:sz w:val="24"/><w:szCs w:val="24"/></w:rPr></w:pPr><w:r><w:rPr><w:rFonts w:ascii="Ebrima" w:hAnsi="Ebrima"/><w:b/><w:bCs/><w:smallCaps/><w:sz w:val="24"/><w:szCs w:val="24"/></w:rPr><w:t>Condições:</w:t></w:r><w:r><w:rPr><w:rFonts w:ascii="Ebrima" w:hAnsi="Ebrima"/><w:b/><w:bCs/><w:smallCaps/><w:sz w:val="24"/><w:szCs w:val="24"/></w:rPr><w:tab/></w:r><w:r><w:rPr><w:rFonts w:ascii="Ebrima" w:hAnsi="Ebrima"/><w:b/><w:bCs/><w:smallCaps/><w:sz w:val="24"/><w:szCs w:val="24"/></w:rPr><w:tab/></w:r><w:r><w:rPr><w:rFonts w:ascii="Ebrima" w:hAnsi="Ebrima"/><w:b/><w:bCs/><w:smallCaps/><w:sz w:val="24"/><w:szCs w:val="24"/></w:rPr><w:tab/></w:r><w:r><w:rPr><w:rFonts w:ascii="Ebrima" w:hAnsi="Ebrima"/><w:b/><w:bCs/><w:smallCaps/><w:sz w:val="24"/><w:szCs w:val="24"/></w:rPr><w:tab/></w:r><w:r><w:rPr><w:rFonts w:ascii="Ebrima" w:hAnsi="Ebrima"/><w:b/><w:bCs/><w:smallCaps/><w:sz w:val="24"/><w:szCs w:val="24"/></w:rPr><w:tab/></w:r><w:r><w:rPr><w:rFonts w:ascii="Ebrima" w:hAnsi="Ebrima"/><w:b/><w:bCs/><w:smallCaps/><w:sz w:val="24"/><w:szCs w:val="24"/></w:rPr><w:tab/></w:r><w:r><w:rPr><w:rFonts w:ascii="Ebrima" w:hAnsi="Ebrima"/><w:b/><w:bCs/><w:smallCaps/><w:sz w:val="24"/><w:szCs w:val="24"/></w:rPr><w:tab/></w:r><w:r><w:rPr><w:rFonts w:ascii="Ebrima" w:hAnsi="Ebrima"/><w:b/><w:bCs/><w:smallCaps/><w:sz w:val="24"/><w:szCs w:val="24"/></w:rPr><w:tab/></w:r></w:p><w:p><w:pPr><w:pStyle w:val="Corpo"/><w:tabs><w:tab w:val="left" w:pos="720"/><w:tab w:val="left" w:pos="1440"/><w:tab w:val="left" w:pos="2160"/><w:tab w:val="left" w:pos="2880"/><w:tab w:val="left" w:pos="3600"/><w:tab w:val="left" w:pos="4320"/><w:tab w:val="left" w:pos="5040"/><w:tab w:val="left" w:pos="5760"/><w:tab w:val="left" w:pos="6480"/><w:tab w:val="left" w:pos="7200"/><w:tab w:val="left" w:pos="7920"/><w:tab w:val="left" w:pos="8640"/></w:tabs><w:jc w:val="both"/><w:rPr><w:rFonts w:ascii="Ebrima" w:hAnsi="Ebrima"/><w:sz w:val="24"/><w:szCs w:val="24"/></w:rPr></w:pPr><w:r><w:rPr><w:rFonts w:ascii="Ebrima" w:hAnsi="Ebrima"/><w:sz w:val="24"/><w:szCs w:val="24"/></w:rPr><w:t>a) o pagamento dos serviços não está condicionado à emissão de alvarás, certidões ou licenças pelos órgãos licenciadores;</w:t></w:r><w:r><w:rPr><w:rFonts w:ascii="Ebrima" w:hAnsi="Ebrima"/><w:sz w:val="24"/><w:szCs w:val="24"/></w:rPr><w:tab/></w:r><w:r><w:rPr><w:rFonts w:ascii="Ebrima" w:hAnsi="Ebrima"/><w:sz w:val="24"/><w:szCs w:val="24"/></w:rPr><w:tab/></w:r><w:r><w:rPr><w:rFonts w:ascii="Ebrima" w:hAnsi="Ebrima"/><w:sz w:val="24"/><w:szCs w:val="24"/></w:rPr><w:tab/></w:r><w:r><w:rPr><w:rFonts w:ascii="Ebrima" w:hAnsi="Ebrima"/><w:sz w:val="24"/><w:szCs w:val="24"/></w:rPr><w:tab/></w:r><w:r><w:rPr><w:rFonts w:ascii="Ebrima" w:hAnsi="Ebrima"/><w:sz w:val="24"/><w:szCs w:val="24"/></w:rPr><w:tab/></w:r><w:r><w:rPr><w:rFonts w:ascii="Ebrima" w:hAnsi="Ebrima"/><w:sz w:val="24"/><w:szCs w:val="24"/></w:rPr><w:tab/></w:r><w:r><w:rPr><w:rFonts w:ascii="Ebrima" w:hAnsi="Ebrima"/><w:sz w:val="24"/><w:szCs w:val="24"/></w:rPr><w:tab/></w:r></w:p><w:p><w:pPr><w:pStyle w:val="Corpo"/><w:tabs><w:tab w:val="left" w:pos="720"/><w:tab w:val="left" w:pos="1440"/><w:tab w:val="left" w:pos="2160"/><w:tab w:val="left" w:pos="2880"/><w:tab w:val="left" w:pos="3600"/><w:tab w:val="left" w:pos="4320"/><w:tab w:val="left" w:pos="5040"/><w:tab w:val="left" w:pos="5760"/><w:tab w:val="left" w:pos="6480"/><w:tab w:val="left" w:pos="7200"/><w:tab w:val="left" w:pos="7920"/><w:tab w:val="left" w:pos="8640"/></w:tabs><w:jc w:val="both"/><w:rPr><w:rFonts w:ascii="Ebrima" w:hAnsi="Ebrima"/><w:sz w:val="24"/><w:szCs w:val="24"/></w:rPr></w:pPr><w:r><w:rPr><w:rFonts w:ascii="Ebrima" w:hAnsi="Ebrima"/><w:sz w:val="24"/><w:szCs w:val="24"/></w:rPr><w:t xml:space="preserve">b) a </w:t></w:r><w:r><w:rPr><w:rFonts w:ascii="Ebrima" w:hAnsi="Ebrima"/><w:sz w:val="24"/><w:szCs w:val="24"/></w:rPr><w:t>CONTRATANTE</w:t></w:r><w:r><w:rPr><w:rFonts w:ascii="Ebrima" w:hAnsi="Ebrima"/><w:sz w:val="24"/><w:szCs w:val="24"/></w:rPr><w:t xml:space="preserve"> deve fornecer dados, informações</w:t></w:r><w:r><w:rPr><w:rFonts w:ascii="Ebrima" w:hAnsi="Ebrima"/><w:sz w:val="24"/><w:szCs w:val="24"/></w:rPr><w:t>, fotografias</w:t></w:r><w:r><w:rPr><w:rFonts w:ascii="Ebrima" w:hAnsi="Ebrima"/><w:sz w:val="24"/><w:szCs w:val="24"/></w:rPr><w:t xml:space="preserve"> e documentos necessários à execução dos serviços contratados</w:t></w:r><w:r><w:rPr><w:rFonts w:ascii="Ebrima" w:hAnsi="Ebrima"/><w:sz w:val="24"/><w:szCs w:val="24"/></w:rPr><w:t>;</w:t></w:r><w:r><w:rPr><w:rFonts w:ascii="Ebrima" w:hAnsi="Ebrima"/><w:sz w:val="24"/><w:szCs w:val="24"/></w:rPr><w:tab/></w:r><w:r><w:rPr><w:rFonts w:ascii="Ebrima" w:hAnsi="Ebrima"/><w:sz w:val="24"/><w:szCs w:val="24"/></w:rPr><w:tab/></w:r></w:p><w:p><w:pPr><w:pStyle w:val="Corpo"/><w:tabs><w:tab w:val="left" w:pos="720"/><w:tab w:val="left" w:pos="1440"/><w:tab w:val="left" w:pos="2160"/><w:tab w:val="left" w:pos="2880"/><w:tab w:val="left" w:pos="3600"/><w:tab w:val="left" w:pos="4320"/><w:tab w:val="left" w:pos="5040"/><w:tab w:val="left" w:pos="5760"/><w:tab w:val="left" w:pos="6480"/><w:tab w:val="left" w:pos="7200"/><w:tab w:val="left" w:pos="7920"/><w:tab w:val="left" w:pos="8640"/></w:tabs><w:jc w:val="both"/><w:rPr><w:rFonts w:ascii="Ebrima" w:hAnsi="Ebrima"/><w:sz w:val="24"/><w:szCs w:val="24"/></w:rPr></w:pPr><w:r><w:rPr><w:rFonts w:ascii="Ebrima" w:hAnsi="Ebrima"/><w:sz w:val="24"/><w:szCs w:val="24"/></w:rPr><w:t xml:space="preserve">c) fica a cargo da contratante o pagamento </w:t></w:r><w:r><w:rPr><w:rFonts w:ascii="Ebrima" w:hAnsi="Ebrima"/><w:sz w:val="24"/><w:szCs w:val="24"/></w:rPr><w:t>da</w:t></w:r><w:r><w:rPr><w:rFonts w:ascii="Ebrima" w:hAnsi="Ebrima"/><w:sz w:val="24"/><w:szCs w:val="24"/></w:rPr><w:t>s</w:t></w:r><w:r><w:rPr><w:rFonts w:ascii="Ebrima" w:hAnsi="Ebrima"/><w:sz w:val="24"/><w:szCs w:val="24"/></w:rPr><w:t xml:space="preserve"> </w:t></w:r><w:r><w:rPr><w:rFonts w:ascii="Ebrima" w:hAnsi="Ebrima"/><w:sz w:val="24"/><w:szCs w:val="24"/></w:rPr><w:t>taxa</w:t></w:r><w:r><w:rPr><w:rFonts w:ascii="Ebrima" w:hAnsi="Ebrima"/><w:sz w:val="24"/><w:szCs w:val="24"/></w:rPr><w:t>s</w:t></w:r><w:r><w:rPr><w:rFonts w:ascii="Ebrima" w:hAnsi="Ebrima"/><w:sz w:val="24"/><w:szCs w:val="24"/></w:rPr><w:t xml:space="preserve"> de análise do</w:t></w:r><w:r><w:rPr><w:rFonts w:ascii="Ebrima" w:hAnsi="Ebrima"/><w:sz w:val="24"/><w:szCs w:val="24"/></w:rPr><w:t>s processos e do</w:t></w:r><w:r><w:rPr><w:rFonts w:ascii="Ebrima" w:hAnsi="Ebrima"/><w:sz w:val="24"/><w:szCs w:val="24"/></w:rPr><w:t xml:space="preserve"> projeto/relatório.</w:t></w:r><w:r><w:rPr><w:rFonts w:ascii="Ebrima" w:hAnsi="Ebrima"/><w:sz w:val="24"/><w:szCs w:val="24"/></w:rPr><w:tab/></w:r><w:r><w:rPr><w:rFonts w:ascii="Ebrima" w:hAnsi="Ebrima"/><w:sz w:val="24"/><w:szCs w:val="24"/></w:rPr><w:tab/></w:r></w:p><w:p><w:pPr><w:pStyle w:val="Corpo"/><w:tabs><w:tab w:val="left" w:pos="720"/><w:tab w:val="left" w:pos="1440"/><w:tab w:val="left" w:pos="2160"/><w:tab w:val="left" w:pos="2880"/><w:tab w:val="left" w:pos="3600"/><w:tab w:val="left" w:pos="4320"/><w:tab w:val="left" w:pos="5040"/><w:tab w:val="left" w:pos="5760"/><w:tab w:val="left" w:pos="6480"/><w:tab w:val="left" w:pos="7200"/><w:tab w:val="left" w:pos="7920"/><w:tab w:val="left" w:pos="8640"/></w:tabs><w:jc w:val="both"/><w:rPr><w:rFonts w:ascii="Ebrima" w:hAnsi="Ebrima"/><w:sz w:val="24"/><w:szCs w:val="24"/></w:rPr></w:pPr><w:r><w:rPr><w:rFonts w:ascii="Ebrima" w:hAnsi="Ebrima"/><w:sz w:val="24"/><w:szCs w:val="24"/></w:rPr><w:tab/></w:r><w:r><w:rPr><w:rFonts w:ascii="Ebrima" w:hAnsi="Ebrima"/><w:sz w:val="24"/><w:szCs w:val="24"/></w:rPr><w:tab/></w:r><w:r><w:rPr><w:rFonts w:ascii="Ebrima" w:hAnsi="Ebrima"/><w:sz w:val="24"/><w:szCs w:val="24"/></w:rPr><w:tab/></w:r><w:r><w:rPr><w:rFonts w:ascii="Ebrima" w:hAnsi="Ebrima"/><w:sz w:val="24"/><w:szCs w:val="24"/></w:rPr><w:tab/></w:r><w:r><w:rPr><w:rFonts w:ascii="Ebrima" w:hAnsi="Ebrima"/><w:sz w:val="24"/><w:szCs w:val="24"/></w:rPr><w:tab/></w:r><w:r><w:rPr><w:rFonts w:ascii="Ebrima" w:hAnsi="Ebrima"/><w:sz w:val="24"/><w:szCs w:val="24"/></w:rPr><w:tab/></w:r></w:p><w:p><w:pPr><w:pStyle w:val="Corpo"/><w:tabs><w:tab w:val="left" w:pos="0"/><w:tab w:val="left" w:pos="1440"/><w:tab w:val="left" w:pos="2160"/><w:tab w:val="left" w:pos="2880"/><w:tab w:val="left" w:pos="3600"/><w:tab w:val="left" w:pos="4320"/><w:tab w:val="left" w:pos="5040"/><w:tab w:val="left" w:pos="5760"/><w:tab w:val="left" w:pos="6480"/><w:tab w:val="left" w:pos="7200"/><w:tab w:val="left" w:pos="7920"/><w:tab w:val="left" w:pos="8640"/></w:tabs><w:jc w:val="both"/><w:rPr><w:rFonts w:ascii="Ebrima" w:hAnsi="Ebrima"/><w:b/><w:smallCaps/><w:sz w:val="24"/><w:szCs w:val="24"/></w:rPr></w:pPr><w:r><w:rPr><w:rFonts w:ascii="Ebrima" w:hAnsi="Ebrima"/><w:b/><w:smallCaps/><w:sz w:val="24"/><w:szCs w:val="24"/></w:rPr><w:t xml:space="preserve">Pagamento: </w:t></w:r><w:r><w:rPr><w:rFonts w:ascii="Ebrima" w:hAnsi="Ebrima"/><w:sz w:val="24"/><w:szCs w:val="24"/></w:rPr><w:t xml:space="preserve"> </w:t></w:r><w:r><w:rPr><w:rFonts w:ascii="Ebrima" w:hAnsi="Ebrima"/><w:sz w:val="24"/><w:szCs w:val="24"/></w:rPr><w:t xml:space="preserve">Em até </w:t></w:r><w:r><w:rPr><w:rFonts w:ascii="Ebrima" w:hAnsi="Ebrima"/><w:sz w:val="24"/><w:szCs w:val="24"/></w:rPr><w:t>3</w:t></w:r><w:r><w:rPr><w:rFonts w:ascii="Ebrima" w:hAnsi="Ebrima"/><w:sz w:val="24"/><w:szCs w:val="24"/></w:rPr><w:t xml:space="preserve">0 dias </w:t></w:r><w:r><w:rPr><w:rFonts w:ascii="Ebrima" w:hAnsi="Ebrima"/><w:sz w:val="24"/><w:szCs w:val="24"/></w:rPr><w:t>da conclusão de cada uma das etapas de trabalho</w:t></w:r><w:r><w:rPr><w:rFonts w:ascii="Ebrima" w:hAnsi="Ebrima"/><w:sz w:val="24"/><w:szCs w:val="24"/></w:rPr><w:t>, contados da emissão da respectiva nota fiscal</w:t></w:r><w:r><w:rPr><w:rFonts w:ascii="Ebrima" w:hAnsi="Ebrima"/><w:sz w:val="24"/><w:szCs w:val="24"/></w:rPr><w:t>.</w:t></w:r></w:p><w:p><w:pPr><w:pStyle w:val="Corpo"/><w:tabs><w:tab w:val="left" w:pos="720"/><w:tab w:val="left" w:pos="1440"/><w:tab w:val="left" w:pos="2160"/><w:tab w:val="left" w:pos="2880"/><w:tab w:val="left" w:pos="3600"/><w:tab w:val="left" w:pos="4320"/><w:tab w:val="left" w:pos="5040"/><w:tab w:val="left" w:pos="5760"/><w:tab w:val="left" w:pos="6480"/><w:tab w:val="left" w:pos="7200"/><w:tab w:val="left" w:pos="7920"/><w:tab w:val="left" w:pos="8640"/></w:tabs><w:jc w:val="both"/><w:rPr><w:rFonts w:ascii="Ebrima" w:hAnsi="Ebrima"/><w:sz w:val="16"/><w:szCs w:val="16"/></w:rPr></w:pPr></w:p><w:p><w:pPr><w:pStyle w:val="Corpo"/><w:tabs><w:tab w:val="left" w:pos="720"/><w:tab w:val="left" w:pos="1440"/><w:tab w:val="left" w:pos="2160"/><w:tab w:val="left" w:pos="2880"/><w:tab w:val="left" w:pos="3600"/><w:tab w:val="left" w:pos="4320"/><w:tab w:val="left" w:pos="5040"/><w:tab w:val="left" w:pos="5760"/><w:tab w:val="left" w:pos="6480"/><w:tab w:val="left" w:pos="7200"/><w:tab w:val="left" w:pos="7920"/><w:tab w:val="left" w:pos="8640"/></w:tabs><w:jc w:val="both"/><w:rPr><w:rFonts w:ascii="Ebrima" w:hAnsi="Ebrima"/><w:sz w:val="24"/><w:szCs w:val="24"/></w:rPr></w:pPr></w:p><w:p><w:pPr><w:pStyle w:val="Corpo"/><w:tabs><w:tab w:val="left" w:pos="720"/><w:tab w:val="left" w:pos="1440"/><w:tab w:val="left" w:pos="2160"/><w:tab w:val="left" w:pos="2880"/><w:tab w:val="left" w:pos="3600"/><w:tab w:val="left" w:pos="4320"/><w:tab w:val="left" w:pos="5040"/><w:tab w:val="left" w:pos="5760"/><w:tab w:val="left" w:pos="6480"/><w:tab w:val="left" w:pos="7200"/><w:tab w:val="left" w:pos="7920"/><w:tab w:val="left" w:pos="8640"/></w:tabs><w:jc w:val="both"/><w:rPr><w:rFonts w:ascii="Ebrima" w:hAnsi="Ebrima"/><w:sz w:val="24"/><w:szCs w:val="24"/></w:rPr></w:pPr><w:r><w:rPr><w:rFonts w:ascii="Ebrima" w:hAnsi="Ebrima"/><w:sz w:val="24"/><w:szCs w:val="24"/></w:rPr><w:t>Colocando-nos à Vosso dispor para os esclarecimentos que se fizerem necessários, despedimo-nos,</w:t></w:r></w:p><w:p><w:pPr><w:pStyle w:val="Corpo"/><w:tabs><w:tab w:val="left" w:pos="720"/><w:tab w:val="left" w:pos="1440"/><w:tab w:val="left" w:pos="2160"/><w:tab w:val="left" w:pos="2880"/><w:tab w:val="left" w:pos="3600"/><w:tab w:val="left" w:pos="4320"/><w:tab w:val="left" w:pos="5040"/><w:tab w:val="left" w:pos="5760"/><w:tab w:val="left" w:pos="6480"/><w:tab w:val="left" w:pos="7200"/><w:tab w:val="left" w:pos="7920"/><w:tab w:val="left" w:pos="8640"/></w:tabs><w:jc w:val="both"/><w:rPr><w:rFonts w:ascii="Ebrima" w:hAnsi="Ebrima"/><w:smallCaps/><w:sz w:val="24"/><w:szCs w:val="24"/></w:rPr></w:pPr></w:p><w:p><w:pPr><w:pStyle w:val="Corpo"/><w:tabs><w:tab w:val="left" w:pos="720"/><w:tab w:val="left" w:pos="1440"/><w:tab w:val="left" w:pos="2160"/><w:tab w:val="left" w:pos="2880"/><w:tab w:val="left" w:pos="3600"/><w:tab w:val="left" w:pos="4320"/><w:tab w:val="left" w:pos="5040"/><w:tab w:val="left" w:pos="5760"/><w:tab w:val="left" w:pos="6480"/><w:tab w:val="left" w:pos="7200"/><w:tab w:val="left" w:pos="7920"/><w:tab w:val="left" w:pos="8640"/></w:tabs><w:jc w:val="both"/><w:rPr><w:rFonts w:ascii="Ebrima" w:hAnsi="Ebrima"/><w:smallCaps/><w:sz w:val="24"/><w:szCs w:val="24"/></w:rPr></w:pPr></w:p><w:p><w:pPr><w:pStyle w:val="Corpo"/><w:tabs><w:tab w:val="left" w:pos="720"/><w:tab w:val="left" w:pos="1440"/><w:tab w:val="left" w:pos="2160"/><w:tab w:val="left" w:pos="2880"/><w:tab w:val="left" w:pos="3600"/><w:tab w:val="left" w:pos="4320"/><w:tab w:val="left" w:pos="5040"/><w:tab w:val="left" w:pos="5760"/><w:tab w:val="left" w:pos="6480"/><w:tab w:val="left" w:pos="7200"/><w:tab w:val="left" w:pos="7920"/><w:tab w:val="left" w:pos="8640"/></w:tabs><w:jc w:val="both"/><w:rPr><w:rFonts w:ascii="Ebrima" w:hAnsi="Ebrima"/><w:smallCaps/><w:sz w:val="24"/><w:szCs w:val="24"/></w:rPr></w:pPr></w:p><w:p><w:pPr><w:pStyle w:val="Corpo"/><w:tabs><w:tab w:val="left" w:pos="720"/><w:tab w:val="left" w:pos="1440"/><w:tab w:val="left" w:pos="2160"/><w:tab w:val="left" w:pos="2880"/><w:tab w:val="left" w:pos="3600"/><w:tab w:val="left" w:pos="4320"/><w:tab w:val="left" w:pos="5040"/><w:tab w:val="left" w:pos="5760"/><w:tab w:val="left" w:pos="6480"/><w:tab w:val="left" w:pos="7200"/><w:tab w:val="left" w:pos="7920"/><w:tab w:val="left" w:pos="8640"/></w:tabs><w:jc w:val="both"/><w:rPr><w:rFonts w:ascii="Ebrima" w:hAnsi="Ebrima"/><w:smallCaps/><w:sz w:val="24"/><w:szCs w:val="24"/></w:rPr></w:pPr></w:p><w:p><w:pPr><w:pStyle w:val="Corpo"/><w:tabs><w:tab w:val="left" w:pos="720"/><w:tab w:val="left" w:pos="1440"/><w:tab w:val="left" w:pos="2160"/><w:tab w:val="left" w:pos="2880"/><w:tab w:val="left" w:pos="3600"/><w:tab w:val="left" w:pos="4320"/><w:tab w:val="left" w:pos="5040"/><w:tab w:val="left" w:pos="5760"/><w:tab w:val="left" w:pos="6480"/><w:tab w:val="left" w:pos="7200"/><w:tab w:val="left" w:pos="7920"/><w:tab w:val="left" w:pos="8640"/></w:tabs><w:jc w:val="both"/><w:rPr><w:rFonts w:ascii="Ebrima" w:hAnsi="Ebrima"/><w:sz w:val="24"/><w:szCs w:val="24"/></w:rPr></w:pPr><w:r><w:rPr><w:rFonts w:ascii="Ebrima" w:hAnsi="Ebrima"/><w:smallCaps/><w:sz w:val="24"/><w:szCs w:val="24"/></w:rPr><w:t>Cordialmente</w:t></w:r><w:r><w:rPr><w:rFonts w:ascii="Ebrima" w:hAnsi="Ebrima"/><w:sz w:val="24"/><w:szCs w:val="24"/></w:rPr><w:t>,</w:t></w:r></w:p><w:p><w:pPr><w:pStyle w:val="Corpo"/><w:tabs><w:tab w:val="left" w:pos="720"/><w:tab w:val="left" w:pos="1440"/><w:tab w:val="left" w:pos="2160"/><w:tab w:val="left" w:pos="2880"/><w:tab w:val="left" w:pos="3600"/><w:tab w:val="left" w:pos="4320"/><w:tab w:val="left" w:pos="5040"/><w:tab w:val="left" w:pos="5760"/><w:tab w:val="left" w:pos="6480"/><w:tab w:val="left" w:pos="7200"/><w:tab w:val="left" w:pos="7920"/><w:tab w:val="left" w:pos="8640"/></w:tabs><w:jc w:val="both"/><w:rPr><w:rFonts w:ascii="Ebrima" w:hAnsi="Ebrima"/><w:b/><w:smallCaps/><w:sz w:val="24"/><w:szCs w:val="24"/></w:rPr></w:pPr><w:r><w:rPr><w:rFonts w:ascii="Ebrima" w:hAnsi="Ebrima"/><w:b/><w:smallCaps/><w:noProof/><w:sz w:val="24"/><w:szCs w:val="24"/></w:rPr><w:drawing><wp:inline distT="0" distB="0" distL="0" distR="0" wp14:anchorId="6CA5B6D3" wp14:editId="664CB6FB"><wp:extent cx="869577" cy="430306"/><wp:effectExtent l="0" t="0" r="6985" b="8255"/><wp:docPr id="1" name="Imagem 1" descr="Desenho preto e branco&#xA;&#xA;Descrição gerada automaticamente com confiança média"/><wp:cNvGraphicFramePr><a:graphicFrameLocks xmlns:a="http://schemas.openxmlformats.org/drawingml/2006/main" noChangeAspect="1"/></wp:cNvGraphicFramePr><a:graphic xmlns:a="http://schemas.openxmlformats.org/drawingml/2006/main"><a:graphicData uri="http://schemas.openxmlformats.org/drawingml/2006/picture"><pic:pic xmlns:pic="http://schemas.openxmlformats.org/drawingml/2006/picture"><pic:nvPicPr><pic:cNvPr id="1" name="Imagem 1" descr="Desenho preto e branco&#xA;&#xA;Descrição gerada automaticamente com confiança média"/><pic:cNvPicPr/></pic:nvPicPr><pic:blipFill><a:blip r:embed="rId8" cstate="print"><a:extLst><a:ext uri="{28A0092B-C50C-407E-A947-70E740481C1C}"><a14:useLocalDpi xmlns:a14="http://schemas.microsoft.com/office/drawing/2010/main" val="0"/></a:ext></a:extLst></a:blip><a:stretch><a:fillRect/></a:stretch></pic:blipFill><pic:spPr><a:xfrm><a:off x="0" y="0"/><a:ext cx="903493" cy="447089"/></a:xfrm><a:prstGeom prst="rect"><a:avLst/></a:prstGeom></pic:spPr></pic:pic></a:graphicData></a:graphic></wp:inline></w:drawing></w:r></w:p><w:p><w:pPr><w:pStyle w:val="Corpo"/><w:tabs><w:tab w:val="left" w:pos="720"/><w:tab w:val="left" w:pos="1440"/><w:tab w:val="left" w:pos="2160"/><w:tab w:val="left" w:pos="2880"/><w:tab w:val="left" w:pos="3600"/><w:tab w:val="left" w:pos="4320"/><w:tab w:val="left" w:pos="5040"/><w:tab w:val="left" w:pos="5760"/><w:tab w:val="left" w:pos="6480"/><w:tab w:val="left" w:pos="7200"/><w:tab w:val="left" w:pos="7920"/><w:tab w:val="left" w:pos="8640"/></w:tabs><w:jc w:val="both"/><w:rPr><w:rFonts w:ascii="Ebrima" w:hAnsi="Ebrima"/><w:b/><w:smallCaps/><w:sz w:val="24"/><w:szCs w:val="24"/></w:rPr></w:pPr><w:r><w:rPr><w:rFonts w:ascii="Ebrima" w:hAnsi="Ebrima"/><w:b/><w:smallCaps/><w:sz w:val="24"/><w:szCs w:val="24"/></w:rPr><w:t>André Nagalli</w:t></w:r></w:p><w:p><w:pPr><w:pStyle w:val="Corpo"/><w:tabs><w:tab w:val="left" w:pos="720"/><w:tab w:val="left" w:pos="1440"/><w:tab w:val="left" w:pos="2160"/><w:tab w:val="left" w:pos="2880"/><w:tab w:val="left" w:pos="3600"/><w:tab w:val="left" w:pos="4320"/><w:tab w:val="left" w:pos="5040"/><w:tab w:val="left" w:pos="5760"/><w:tab w:val="left" w:pos="6480"/><w:tab w:val="left" w:pos="7200"/><w:tab w:val="left" w:pos="7920"/><w:tab w:val="left" w:pos="8640"/></w:tabs><w:jc w:val="both"/><w:rPr><w:rFonts w:ascii="Ebrima" w:hAnsi="Ebrima"/><w:bCs/><w:smallCaps/><w:sz w:val="20"/></w:rPr></w:pPr><w:r><w:rPr><w:rFonts w:ascii="Ebrima" w:hAnsi="Ebrima"/><w:bCs/><w:smallCaps/><w:sz w:val="20"/></w:rPr><w:t>Eng. Civil CREA-PR 70</w:t></w:r><w:r><w:rPr><w:rFonts w:ascii="Ebrima" w:hAnsi="Ebrima"/><w:bCs/><w:smallCaps/><w:sz w:val="20"/></w:rPr><w:t>.</w:t></w:r><w:r><w:rPr><w:rFonts w:ascii="Ebrima" w:hAnsi="Ebrima"/><w:bCs/><w:smallCaps/><w:sz w:val="20"/></w:rPr><w:t>901/D, Advogado, OAB</w:t></w:r><w:r><w:rPr><w:rFonts w:ascii="Ebrima" w:hAnsi="Ebrima"/><w:bCs/><w:smallCaps/><w:sz w:val="20"/></w:rPr><w:t>/PR</w:t></w:r><w:r><w:rPr><w:rFonts w:ascii="Ebrima" w:hAnsi="Ebrima"/><w:bCs/><w:smallCaps/><w:sz w:val="20"/></w:rPr><w:t xml:space="preserve"> 87</w:t></w:r><w:r><w:rPr><w:rFonts w:ascii="Ebrima" w:hAnsi="Ebrima"/><w:bCs/><w:smallCaps/><w:sz w:val="20"/></w:rPr><w:t>.</w:t></w:r><w:r><w:rPr><w:rFonts w:ascii="Ebrima" w:hAnsi="Ebrima"/><w:bCs/><w:smallCaps/><w:sz w:val="20"/></w:rPr><w:t>212</w:t></w:r></w:p><w:p><w:pPr><w:pStyle w:val="Corpo"/><w:tabs><w:tab w:val="left" w:pos="720"/><w:tab w:val="left" w:pos="1440"/><w:tab w:val="left" w:pos="2160"/><w:tab w:val="left" w:pos="2880"/><w:tab w:val="left" w:pos="3600"/><w:tab w:val="left" w:pos="4320"/><w:tab w:val="left" w:pos="5040"/><w:tab w:val="left" w:pos="5760"/><w:tab w:val="left" w:pos="6480"/><w:tab w:val="left" w:pos="7200"/><w:tab w:val="left" w:pos="7920"/><w:tab w:val="left" w:pos="8640"/></w:tabs><w:jc w:val="both"/><w:rPr><w:rFonts w:ascii="Ebrima" w:hAnsi="Ebrima"/><w:sz w:val="20"/></w:rPr></w:pPr><w:r><w:rPr><w:rFonts w:ascii="Ebrima" w:hAnsi="Ebrima"/><w:bCs/><w:smallCaps/><w:sz w:val="20"/></w:rPr><w:t>Mestre em Eng. de Rec. Hídricos e Ambiental, Doutor em Geologia</w:t></w:r></w:p><w:sectPr><w:headerReference w:type="default" r:id="rId9"/><w:footerReference w:type="default" r:id="rId10"/><w:pgSz w:w="11906" w:h="16838"/><w:pgMar w:top="1843" w:right="1418" w:bottom="1560" w:left="1701" w:header="567" w:footer="981" w:gutter="0"/><w:cols w:space="708"/><w:docGrid w:linePitch="360"/></w:sectPr></w:body></w:document>
+<file path=word/document.xml><?xml version="1.0" encoding="utf-8"?>
+<w:document xmlns:wpc="http://schemas.microsoft.com/office/word/2010/wordprocessingCanvas" xmlns:cx="http://schemas.microsoft.com/office/drawing/2014/chartex" xmlns:cx1="http://schemas.microsoft.com/office/drawing/2015/9/8/chartex" xmlns:cx2="http://schemas.microsoft.com/office/drawing/2015/10/21/chartex" xmlns:cx3="http://schemas.microsoft.com/office/drawing/2016/5/9/chartex" xmlns:cx4="http://schemas.microsoft.com/office/drawing/2016/5/10/chartex" xmlns:cx5="http://schemas.microsoft.com/office/drawing/2016/5/11/chartex" xmlns:cx6="http://schemas.microsoft.com/office/drawing/2016/5/12/chartex" xmlns:cx7="http://schemas.microsoft.com/office/drawing/2016/5/13/chartex" xmlns:cx8="http://schemas.microsoft.com/office/drawing/2016/5/14/chartex" xmlns:mc="http://schemas.openxmlformats.org/markup-compatibility/2006" xmlns:aink="http://schemas.microsoft.com/office/drawing/2016/ink" xmlns:am3d="http://schemas.microsoft.com/office/drawing/2017/model3d" xmlns:o="urn:schemas-microsoft-com:office:office" xmlns:oel="http://schemas.microsoft.com/office/2019/extlst" xmlns:r="http://schemas.openxmlformats.org/officeDocument/2006/relationships" xmlns:m="http://schemas.openxmlformats.org/officeDocument/2006/math" xmlns:v="urn:schemas-microsoft-com:vml" xmlns:wp14="http://schemas.microsoft.com/office/word/2010/wordprocessingDrawing" xmlns:wp="http://schemas.openxmlformats.org/drawingml/2006/wordprocessingDrawing" xmlns:w10="urn:schemas-microsoft-com:office:word" xmlns:w="http://schemas.openxmlformats.org/wordprocessingml/2006/main" xmlns:w14="http://schemas.microsoft.com/office/word/2010/wordml" xmlns:w15="http://schemas.microsoft.com/office/word/2012/wordml" xmlns:w16cei="http://schemas.microsoft.com/office/word/2026/wordml/cei" xmlns:w16cex="http://schemas.microsoft.com/office/word/2018/wordml/cex" xmlns:w16cid="http://schemas.microsoft.com/office/word/2016/wordml/cid" xmlns:w16="http://schemas.microsoft.com/office/word/2018/wordml" xmlns:w16du="http://schemas.microsoft.com/office/word/2023/wordml/word16du" xmlns:w16sdtdh="http://schemas.microsoft.com/office/word/2020/wordml/sdtdatahash" xmlns:w16sdtfl="http://schemas.microsoft.com/office/word/2024/wordml/sdtformatlock" xmlns:w16se="http://schemas.microsoft.com/office/word/2015/wordml/symex" xmlns:wpg="http://schemas.microsoft.com/office/word/2010/wordprocessingGroup" xmlns:wpi="http://schemas.microsoft.com/office/word/2010/wordprocessingInk" xmlns:wne="http://schemas.microsoft.com/office/word/2006/wordml" xmlns:wps="http://schemas.microsoft.com/office/word/2010/wordprocessingShape" mc:Ignorable="w14 w15 w16se w16cid w16 w16cex w16sdtdh w16sdtfl w16du wp14">
+  <w:body>
+    <w:p>
+      <w:pPr>
+        <w:pStyle w:val="Ttulo2"/>
+        <w:jc w:val="right"/>
+        <w:rPr>
+          <w:rFonts w:ascii="Ebrima" w:hAnsi="Ebrima"/>
+          <w:szCs w:val="24"/>
+        </w:rPr>
+      </w:pPr>
+      <w:r>
+        <w:rPr>
+          <w:rFonts w:ascii="Ebrima" w:hAnsi="Ebrima"/>
+          <w:szCs w:val="24"/>
+        </w:rPr>
+        <w:t>IDENTIFICAÇÃO {identificacao}</w:t>
+      </w:r>
+    </w:p>
+    <w:p>
+      <w:pPr>
+        <w:rPr/>
+      </w:pPr>
+    </w:p>
+    <w:p>
+      <w:pPr>
+        <w:pStyle w:val="Ttulo2"/>
+        <w:jc w:val="right"/>
+        <w:rPr>
+          <w:rFonts w:ascii="Ebrima" w:hAnsi="Ebrima"/>
+          <w:szCs w:val="24"/>
+        </w:rPr>
+      </w:pPr>
+      <w:r>
+        <w:rPr>
+          <w:rFonts w:ascii="Ebrima" w:hAnsi="Ebrima"/>
+          <w:szCs w:val="24"/>
+        </w:rPr>
+        <w:t>Curitiba</w:t>
+      </w:r>
+      <w:r>
+        <w:rPr>
+          <w:rFonts w:ascii="Ebrima" w:hAnsi="Ebrima"/>
+          <w:szCs w:val="24"/>
+        </w:rPr>
+        <w:t xml:space="preserve">, </w:t>
+      </w:r>
+      <w:r>
+        <w:rPr>
+          <w:rFonts w:ascii="Ebrima" w:hAnsi="Ebrima"/>
+          <w:szCs w:val="24"/>
+        </w:rPr>
+        <w:t>04 de agosto</w:t>
+      </w:r>
+      <w:r>
+        <w:rPr>
+          <w:rFonts w:ascii="Ebrima" w:hAnsi="Ebrima"/>
+          <w:szCs w:val="24"/>
+        </w:rPr>
+        <w:t xml:space="preserve"> de 2026</w:t>
+      </w:r>
+      <w:r>
+        <w:rPr>
+          <w:rFonts w:ascii="Ebrima" w:hAnsi="Ebrima"/>
+          <w:szCs w:val="24"/>
+        </w:rPr>
+        <w:t>.</w:t>
+      </w:r>
+    </w:p>
+    <w:p>
+      <w:pPr>
+        <w:pStyle w:val="Ttulo2"/>
+        <w:rPr>
+          <w:rFonts w:ascii="Ebrima" w:hAnsi="Ebrima"/>
+          <w:szCs w:val="24"/>
+        </w:rPr>
+      </w:pPr>
+      <w:r>
+        <w:rPr>
+          <w:rFonts w:ascii="Ebrima" w:hAnsi="Ebrima"/>
+          <w:szCs w:val="24"/>
+        </w:rPr>
+        <w:t>Ao</w:t>
+      </w:r>
+      <w:r>
+        <w:rPr>
+          <w:rFonts w:ascii="Ebrima" w:hAnsi="Ebrima"/>
+          <w:szCs w:val="24"/>
+        </w:rPr>
+        <w:t xml:space="preserve"> </w:t>
+      </w:r>
+    </w:p>
+    <w:p>
+      <w:pPr>
+        <w:jc w:val="both"/>
+        <w:rPr>
+          <w:rFonts w:ascii="Ebrima" w:hAnsi="Ebrima"/>
+          <w:b/>
+          <w:bCs/>
+          <w:smallCaps/>
+          <w:sz w:val="24"/>
+          <w:szCs w:val="24"/>
+        </w:rPr>
+      </w:pPr>
+      <w:r>
+        <w:rPr>
+          <w:rFonts w:ascii="Ebrima" w:hAnsi="Ebrima"/>
+          <w:b/>
+          <w:bCs/>
+          <w:smallCaps/>
+          <w:sz w:val="24"/>
+          <w:szCs w:val="24"/>
+        </w:rPr>
+        <w:t xml:space="preserve">Eng. </w:t>
+      </w:r>
+      <w:proofErr w:type="spellStart"/>
+      <w:r>
+        <w:rPr>
+          <w:rFonts w:ascii="Ebrima" w:hAnsi="Ebrima"/>
+          <w:b/>
+          <w:bCs/>
+          <w:smallCaps/>
+          <w:sz w:val="24"/>
+          <w:szCs w:val="24"/>
+        </w:rPr>
+        <w:t>Antonio</w:t>
+      </w:r>
+      <w:proofErr w:type="spellEnd"/>
+      <w:r>
+        <w:rPr>
+          <w:rFonts w:ascii="Ebrima" w:hAnsi="Ebrima"/>
+          <w:b/>
+          <w:bCs/>
+          <w:smallCaps/>
+          <w:sz w:val="24"/>
+          <w:szCs w:val="24"/>
+        </w:rPr>
+        <w:t xml:space="preserve"> M. Martins</w:t>
+      </w:r>
+    </w:p>
+    <w:p>
+      <w:pPr>
+        <w:jc w:val="both"/>
+        <w:rPr>
+          <w:rFonts w:ascii="Ebrima" w:hAnsi="Ebrima"/>
+          <w:smallCaps/>
+          <w:sz w:val="24"/>
+          <w:szCs w:val="24"/>
+        </w:rPr>
+      </w:pPr>
+      <w:r>
+        <w:rPr>
+          <w:rFonts w:ascii="Ebrima" w:hAnsi="Ebrima"/>
+          <w:smallCaps/>
+          <w:sz w:val="24"/>
+          <w:szCs w:val="24"/>
+        </w:rPr>
+        <w:t>{empresaNome}</w:t>
+      </w:r>
+    </w:p>
+    <w:p>
+      <w:pPr>
+        <w:jc w:val="both"/>
+        <w:rPr>
+          <w:rFonts w:ascii="Ebrima" w:hAnsi="Ebrima"/>
+          <w:sz w:val="24"/>
+          <w:szCs w:val="24"/>
+        </w:rPr>
+      </w:pPr>
+    </w:p>
+    <w:p>
+      <w:pPr>
+        <w:jc w:val="both"/>
+        <w:rPr>
+          <w:rFonts w:ascii="Ebrima" w:hAnsi="Ebrima"/>
+          <w:sz w:val="24"/>
+          <w:szCs w:val="24"/>
+        </w:rPr>
+      </w:pPr>
+    </w:p>
+    <w:p>
+      <w:pPr>
+        <w:jc w:val="both"/>
+        <w:rPr>
+          <w:rFonts w:ascii="Ebrima" w:hAnsi="Ebrima"/>
+          <w:sz w:val="24"/>
+          <w:szCs w:val="24"/>
+        </w:rPr>
+      </w:pPr>
+    </w:p>
+    <w:p>
+      <w:pPr>
+        <w:jc w:val="both"/>
+        <w:rPr>
+          <w:rFonts w:ascii="Ebrima" w:hAnsi="Ebrima"/>
+          <w:smallCaps/>
+          <w:sz w:val="24"/>
+          <w:szCs w:val="24"/>
+        </w:rPr>
+      </w:pPr>
+      <w:r>
+        <w:rPr>
+          <w:rFonts w:ascii="Ebrima" w:hAnsi="Ebrima"/>
+          <w:sz w:val="24"/>
+          <w:szCs w:val="24"/>
+        </w:rPr>
+        <w:t>Prezad</w:t>
+      </w:r>
+      <w:r>
+        <w:rPr>
+          <w:rFonts w:ascii="Ebrima" w:hAnsi="Ebrima"/>
+          <w:sz w:val="24"/>
+          <w:szCs w:val="24"/>
+        </w:rPr>
+        <w:t>o</w:t>
+      </w:r>
+      <w:r>
+        <w:rPr>
+          <w:rFonts w:ascii="Ebrima" w:hAnsi="Ebrima"/>
+          <w:sz w:val="24"/>
+          <w:szCs w:val="24"/>
+        </w:rPr>
+        <w:t>,</w:t>
+      </w:r>
+    </w:p>
+    <w:p>
+      <w:pPr>
+        <w:jc w:val="both"/>
+        <w:rPr>
+          <w:rFonts w:ascii="Ebrima" w:hAnsi="Ebrima"/>
+          <w:sz w:val="24"/>
+          <w:szCs w:val="24"/>
+        </w:rPr>
+      </w:pPr>
+    </w:p>
+    <w:p>
+      <w:pPr>
+        <w:jc w:val="both"/>
+        <w:rPr>
+          <w:rFonts w:ascii="Ebrima" w:hAnsi="Ebrima"/>
+          <w:sz w:val="24"/>
+          <w:szCs w:val="24"/>
+        </w:rPr>
+      </w:pPr>
+    </w:p>
+    <w:p>
+      <w:pPr>
+        <w:jc w:val="both"/>
+        <w:rPr>
+          <w:rFonts w:ascii="Ebrima" w:hAnsi="Ebrima"/>
+          <w:sz w:val="24"/>
+          <w:szCs w:val="24"/>
+        </w:rPr>
+      </w:pPr>
+      <w:r>
+        <w:rPr>
+          <w:rFonts w:ascii="Ebrima" w:hAnsi="Ebrima"/>
+          <w:sz w:val="24"/>
+          <w:szCs w:val="24"/>
+        </w:rPr>
+        <w:t xml:space="preserve">Conforme </w:t>
+      </w:r>
+      <w:r>
+        <w:rPr>
+          <w:rFonts w:ascii="Ebrima" w:hAnsi="Ebrima"/>
+          <w:sz w:val="24"/>
+          <w:szCs w:val="24"/>
+        </w:rPr>
+        <w:t>solicitação</w:t>
+      </w:r>
+      <w:r>
+        <w:rPr>
+          <w:rFonts w:ascii="Ebrima" w:hAnsi="Ebrima"/>
+          <w:sz w:val="24"/>
+          <w:szCs w:val="24"/>
+        </w:rPr>
+        <w:t xml:space="preserve">, apresentamos proposta para condução de serviços de assessoria ambiental referente </w:t>
+      </w:r>
+      <w:r>
+        <w:rPr>
+          <w:rFonts w:ascii="Ebrima" w:hAnsi="Ebrima"/>
+          <w:sz w:val="24"/>
+          <w:szCs w:val="24"/>
+        </w:rPr>
+        <w:t xml:space="preserve">a </w:t>
+      </w:r>
+      <w:r>
+        <w:rPr>
+          <w:rFonts w:ascii="Ebrima" w:hAnsi="Ebrima"/>
+          <w:sz w:val="24"/>
+          <w:szCs w:val="24"/>
+        </w:rPr>
+        <w:t xml:space="preserve">obras de demolição a serem executadas </w:t>
+      </w:r>
+      <w:r>
+        <w:rPr>
+          <w:rFonts w:ascii="Ebrima" w:hAnsi="Ebrima"/>
+          <w:sz w:val="24"/>
+          <w:szCs w:val="24"/>
+        </w:rPr>
+        <w:t xml:space="preserve">no bairro </w:t>
+      </w:r>
+      <w:r>
+        <w:rPr>
+          <w:rFonts w:ascii="Ebrima" w:hAnsi="Ebrima"/>
+          <w:sz w:val="24"/>
+          <w:szCs w:val="24"/>
+        </w:rPr>
+        <w:t>Prado Velho</w:t>
+      </w:r>
+      <w:r>
+        <w:rPr>
+          <w:rFonts w:ascii="Ebrima" w:hAnsi="Ebrima"/>
+          <w:sz w:val="24"/>
+          <w:szCs w:val="24"/>
+        </w:rPr>
+        <w:t xml:space="preserve">, </w:t>
+      </w:r>
+      <w:r>
+        <w:rPr>
+          <w:rFonts w:ascii="Ebrima" w:hAnsi="Ebrima"/>
+          <w:sz w:val="24"/>
+          <w:szCs w:val="24"/>
+        </w:rPr>
+        <w:t>em {cidade}, {uf}</w:t>
+      </w:r>
+      <w:r>
+        <w:rPr>
+          <w:rFonts w:ascii="Ebrima" w:hAnsi="Ebrima"/>
+          <w:sz w:val="24"/>
+          <w:szCs w:val="24"/>
+        </w:rPr>
+        <w:t xml:space="preserve">. </w:t>
+      </w:r>
+      <w:r>
+        <w:rPr>
+          <w:rFonts w:ascii="Ebrima" w:hAnsi="Ebrima"/>
+          <w:sz w:val="24"/>
+          <w:szCs w:val="24"/>
+        </w:rPr>
+        <w:t>Considerando as informações prestadas, foram orçados os seguintes trabalhos:</w:t>
+      </w:r>
+    </w:p>
+    <w:p>
+      <w:pPr>
+        <w:jc w:val="both"/>
+        <w:rPr>
+          <w:rFonts w:ascii="Ebrima" w:hAnsi="Ebrima"/>
+          <w:sz w:val="24"/>
+          <w:szCs w:val="24"/>
+        </w:rPr>
+      </w:pPr>
+    </w:p>
+    <w:p>
+      <w:pPr>
+        <w:jc w:val="both"/>
+        <w:rPr>
+          <w:rFonts w:ascii="Ebrima" w:hAnsi="Ebrima"/>
+          <w:bCs/>
+          <w:sz w:val="24"/>
+          <w:szCs w:val="24"/>
+        </w:rPr>
+      </w:pPr>
+      <w:r>
+        <w:rPr>
+          <w:rFonts w:ascii="Ebrima" w:hAnsi="Ebrima"/>
+          <w:b/>
+          <w:smallCaps/>
+          <w:sz w:val="24"/>
+          <w:szCs w:val="24"/>
+        </w:rPr>
+        <w:t>Objeto</w:t>
+      </w:r>
+      <w:r>
+        <w:rPr>
+          <w:rFonts w:ascii="Ebrima" w:hAnsi="Ebrima"/>
+          <w:b/>
+          <w:smallCaps/>
+          <w:sz w:val="24"/>
+          <w:szCs w:val="24"/>
+        </w:rPr>
+        <w:t>s</w:t>
+      </w:r>
+      <w:r>
+        <w:rPr>
+          <w:rFonts w:ascii="Ebrima" w:hAnsi="Ebrima"/>
+          <w:b/>
+          <w:smallCaps/>
+          <w:sz w:val="24"/>
+          <w:szCs w:val="24"/>
+        </w:rPr>
+        <w:t xml:space="preserve">: </w:t>
+      </w:r>
+      <w:r>
+        <w:rPr>
+          <w:rFonts w:ascii="Ebrima" w:hAnsi="Ebrima"/>
+          <w:bCs/>
+          <w:sz w:val="24"/>
+          <w:szCs w:val="24"/>
+        </w:rPr>
+        <w:t>Serviços de assessoria ambiental:</w:t>
+      </w:r>
+    </w:p>
+    <w:p>
+      <w:pPr>
+        <w:jc w:val="both"/>
+        <w:rPr>
+          <w:rFonts w:ascii="Ebrima" w:hAnsi="Ebrima"/>
+          <w:bCs/>
+          <w:sz w:val="24"/>
+          <w:szCs w:val="24"/>
+        </w:rPr>
+      </w:pPr>
+    </w:p>
+    <w:p>
+      <w:pPr>
+        <w:pStyle w:val="PargrafodaLista"/>
+        <w:numPr>
+          <w:ilvl w:val="0"/>
+          <w:numId w:val="3"/>
+        </w:numPr>
+        <w:jc w:val="both"/>
+        <w:rPr>
+          <w:rFonts w:ascii="Ebrima" w:hAnsi="Ebrima"/>
+          <w:sz w:val="24"/>
+          <w:szCs w:val="24"/>
+        </w:rPr>
+      </w:pPr>
+      <w:r>
+        <w:rPr>
+          <w:rFonts w:ascii="Ebrima" w:hAnsi="Ebrima"/>
+          <w:smallCaps/>
+          <w:sz w:val="24"/>
+          <w:szCs w:val="24"/>
+        </w:rPr>
+        <w:t>PGRCC Demolição -</w:t>
+      </w:r>
+      <w:r>
+        <w:rPr>
+          <w:rFonts w:ascii="Ebrima" w:hAnsi="Ebrima"/>
+          <w:sz w:val="24"/>
+          <w:szCs w:val="24"/>
+        </w:rPr>
+        <w:t xml:space="preserve"> Elaboração de </w:t>
+      </w:r>
+      <w:r>
+        <w:rPr>
+          <w:rFonts w:ascii="Ebrima" w:hAnsi="Ebrima"/>
+          <w:sz w:val="24"/>
+          <w:szCs w:val="24"/>
+        </w:rPr>
+        <w:t>{quantidadePgrcc} ({quantidadePgrccExtenso})</w:t>
+      </w:r>
+      <w:r>
+        <w:rPr>
+          <w:rFonts w:ascii="Ebrima" w:hAnsi="Ebrima"/>
+          <w:sz w:val="24"/>
+          <w:szCs w:val="24"/>
+        </w:rPr>
+        <w:t xml:space="preserve"> Projeto de Gerenciamento de Resíduos da Construção Civil (PGRCC SIMPLIFICADO), que se constitu</w:t>
+      </w:r>
+      <w:r>
+        <w:rPr>
+          <w:rFonts w:ascii="Ebrima" w:hAnsi="Ebrima"/>
+          <w:sz w:val="24"/>
+          <w:szCs w:val="24"/>
+        </w:rPr>
+        <w:t>em</w:t>
+      </w:r>
+      <w:r>
+        <w:rPr>
+          <w:rFonts w:ascii="Ebrima" w:hAnsi="Ebrima"/>
+          <w:sz w:val="24"/>
+          <w:szCs w:val="24"/>
+        </w:rPr>
+        <w:t xml:space="preserve"> em documento-padrão da Prefeitura Municipal com diretrizes gerais do processo de gerenciamento dos resíduos na obra e documentos correlatos. Inclui a respectiva Anotação de Responsabilidade Técnica – ART/CREA-PR, protocolização via plataforma SIMA, e acompanhamento processual até a emissão do respectivo Parecer Técnico, ficando a CONTRATANTE responsável por implantar o projeto. </w:t>
+      </w:r>
+      <w:r>
+        <w:rPr>
+          <w:rFonts w:ascii="Ebrima" w:hAnsi="Ebrima"/>
+          <w:sz w:val="24"/>
+          <w:szCs w:val="24"/>
+        </w:rPr>
+        <w:t>Não inclui trabalhos de campo.</w:t>
+      </w:r>
+    </w:p>
+    <w:p>
+      <w:pPr>
+        <w:pStyle w:val="PargrafodaLista"/>
+        <w:jc w:val="both"/>
+        <w:rPr>
+          <w:rFonts w:ascii="Ebrima" w:hAnsi="Ebrima"/>
+          <w:sz w:val="24"/>
+          <w:szCs w:val="24"/>
+        </w:rPr>
+      </w:pPr>
+    </w:p>
+    <w:p>
+      <w:pPr>
+        <w:pStyle w:val="PargrafodaLista"/>
+        <w:numPr>
+          <w:ilvl w:val="0"/>
+          <w:numId w:val="3"/>
+        </w:numPr>
+        <w:tabs>
+          <w:tab w:val="left" w:pos="426"/>
+        </w:tabs>
+        <w:ind w:left="426"/>
+        <w:jc w:val="both"/>
+        <w:rPr>
+          <w:rFonts w:ascii="Ebrima" w:hAnsi="Ebrima"/>
+          <w:sz w:val="24"/>
+          <w:szCs w:val="24"/>
+        </w:rPr>
+      </w:pPr>
+      <w:r>
+        <w:rPr>
+          <w:rFonts w:ascii="Ebrima" w:hAnsi="Ebrima"/>
+          <w:smallCaps/>
+          <w:sz w:val="24"/>
+          <w:szCs w:val="24"/>
+        </w:rPr>
+        <w:t>R</w:t>
+      </w:r>
+      <w:r>
+        <w:rPr>
+          <w:rFonts w:ascii="Ebrima" w:hAnsi="Ebrima"/>
+          <w:smallCaps/>
+          <w:sz w:val="24"/>
+          <w:szCs w:val="24"/>
+        </w:rPr>
+        <w:t>GRCC Demolição -</w:t>
+      </w:r>
+      <w:r>
+        <w:rPr>
+          <w:rFonts w:ascii="Ebrima" w:hAnsi="Ebrima"/>
+          <w:smallCaps/>
+          <w:sz w:val="24"/>
+          <w:szCs w:val="24"/>
+        </w:rPr>
+        <w:t xml:space="preserve"> </w:t>
+      </w:r>
+      <w:r>
+        <w:rPr>
+          <w:rFonts w:ascii="Ebrima" w:hAnsi="Ebrima"/>
+          <w:sz w:val="24"/>
+          <w:szCs w:val="24"/>
+        </w:rPr>
+        <w:t xml:space="preserve">Elaboração de </w:t>
+      </w:r>
+      <w:r>
+        <w:rPr>
+          <w:rFonts w:ascii="Ebrima" w:hAnsi="Ebrima"/>
+          <w:sz w:val="24"/>
+          <w:szCs w:val="24"/>
+        </w:rPr>
+        <w:t>{quantidadePgrcc} ({quantidadePgrccExtenso})</w:t>
+      </w:r>
+      <w:r>
+        <w:rPr>
+          <w:rFonts w:ascii="Ebrima" w:hAnsi="Ebrima"/>
+          <w:sz w:val="24"/>
+          <w:szCs w:val="24"/>
+        </w:rPr>
+        <w:t xml:space="preserve"> </w:t>
+      </w:r>
+      <w:r>
+        <w:rPr>
+          <w:rFonts w:ascii="Ebrima" w:hAnsi="Ebrima"/>
+          <w:sz w:val="24"/>
+          <w:szCs w:val="24"/>
+        </w:rPr>
+        <w:t>R</w:t>
+      </w:r>
+      <w:r>
+        <w:rPr>
+          <w:rFonts w:ascii="Ebrima" w:hAnsi="Ebrima"/>
+          <w:sz w:val="24"/>
+          <w:szCs w:val="24"/>
+        </w:rPr>
+        <w:t>elatório</w:t>
+      </w:r>
+      <w:r>
+        <w:rPr>
+          <w:rFonts w:ascii="Ebrima" w:hAnsi="Ebrima"/>
+          <w:sz w:val="24"/>
+          <w:szCs w:val="24"/>
+        </w:rPr>
+        <w:t xml:space="preserve"> </w:t>
+      </w:r>
+      <w:r>
+        <w:rPr>
+          <w:rFonts w:ascii="Ebrima" w:hAnsi="Ebrima"/>
+          <w:sz w:val="24"/>
+          <w:szCs w:val="24"/>
+        </w:rPr>
+        <w:t>de gerenciamento de resíduos da construção civil relativo à</w:t>
+      </w:r>
+      <w:r>
+        <w:rPr>
+          <w:rFonts w:ascii="Ebrima" w:hAnsi="Ebrima"/>
+          <w:sz w:val="24"/>
+          <w:szCs w:val="24"/>
+        </w:rPr>
+        <w:t>s</w:t>
+      </w:r>
+      <w:r>
+        <w:rPr>
+          <w:rFonts w:ascii="Ebrima" w:hAnsi="Ebrima"/>
+          <w:sz w:val="24"/>
+          <w:szCs w:val="24"/>
+        </w:rPr>
+        <w:t xml:space="preserve"> obra</w:t>
+      </w:r>
+      <w:r>
+        <w:rPr>
+          <w:rFonts w:ascii="Ebrima" w:hAnsi="Ebrima"/>
+          <w:sz w:val="24"/>
+          <w:szCs w:val="24"/>
+        </w:rPr>
+        <w:t>s</w:t>
+      </w:r>
+      <w:r>
+        <w:rPr>
+          <w:rFonts w:ascii="Ebrima" w:hAnsi="Ebrima"/>
+          <w:sz w:val="24"/>
+          <w:szCs w:val="24"/>
+        </w:rPr>
+        <w:t xml:space="preserve"> de </w:t>
+      </w:r>
+      <w:r>
+        <w:rPr>
+          <w:rFonts w:ascii="Ebrima" w:hAnsi="Ebrima"/>
+          <w:sz w:val="24"/>
+          <w:szCs w:val="24"/>
+        </w:rPr>
+        <w:t>demolição</w:t>
+      </w:r>
+      <w:r>
+        <w:rPr>
+          <w:rFonts w:ascii="Ebrima" w:hAnsi="Ebrima"/>
+          <w:sz w:val="24"/>
+          <w:szCs w:val="24"/>
+        </w:rPr>
+        <w:t xml:space="preserve">. O Relatório de Gerenciamento de Resíduos da Construção Civil (RGRCC) tem por objetivo principal comprovar ao órgão ambiental (SMMA/PMC) a efetiva implantação do PGRCC precedente, bem como subsidiar a emissão </w:t>
+      </w:r>
+      <w:r>
+        <w:rPr>
+          <w:rFonts w:ascii="Ebrima" w:hAnsi="Ebrima"/>
+          <w:sz w:val="24"/>
+          <w:szCs w:val="24"/>
+        </w:rPr>
+        <w:t>do Certificado de Demolição</w:t>
+      </w:r>
+      <w:r>
+        <w:rPr>
+          <w:rFonts w:ascii="Ebrima" w:hAnsi="Ebrima"/>
+          <w:sz w:val="24"/>
+          <w:szCs w:val="24"/>
+        </w:rPr>
+        <w:t xml:space="preserve">. O relatório contempla a apresentação das empresas parceiras da Construtora utilizadas no gerenciamento dos resíduos da obra, bem como a apresentação de comprovantes fornecidos pela </w:t>
+      </w:r>
+      <w:r>
+        <w:rPr>
+          <w:rFonts w:ascii="Ebrima" w:hAnsi="Ebrima"/>
+          <w:sz w:val="24"/>
+          <w:szCs w:val="24"/>
+        </w:rPr>
+        <w:t>CONTRATANTE</w:t>
+      </w:r>
+      <w:r>
+        <w:rPr>
+          <w:rFonts w:ascii="Ebrima" w:hAnsi="Ebrima"/>
+          <w:sz w:val="24"/>
+          <w:szCs w:val="24"/>
+        </w:rPr>
+        <w:t xml:space="preserve"> e terceiros durante o gerenciamento dos resíduos na obra (coleta, transporte e destino de resíduos). </w:t>
+      </w:r>
+      <w:r>
+        <w:rPr>
+          <w:rFonts w:ascii="Ebrima" w:hAnsi="Ebrima"/>
+          <w:sz w:val="24"/>
+          <w:szCs w:val="24"/>
+        </w:rPr>
+        <w:t>Inclui v</w:t>
+      </w:r>
+      <w:r>
+        <w:rPr>
+          <w:rFonts w:ascii="Ebrima" w:hAnsi="Ebrima"/>
+          <w:sz w:val="24"/>
+          <w:szCs w:val="24"/>
+        </w:rPr>
+        <w:t>erificação dos documentos apresentados</w:t>
+      </w:r>
+      <w:r>
+        <w:rPr>
+          <w:rFonts w:ascii="Ebrima" w:hAnsi="Ebrima"/>
+          <w:sz w:val="24"/>
+          <w:szCs w:val="24"/>
+        </w:rPr>
+        <w:t xml:space="preserve">, consolidação das informações e Anotação de Responsabilidade Técnica – ART/CREA, além de serviços de protocolo junto à plataforma SIMA e acompanhamento processual até a emissão do respectivo Parecer Técnico. </w:t>
+      </w:r>
+    </w:p>
+    <w:p>
+      <w:pPr>
+        <w:jc w:val="both"/>
+        <w:rPr>
+          <w:rFonts w:ascii="Ebrima" w:hAnsi="Ebrima"/>
+          <w:sz w:val="24"/>
+          <w:szCs w:val="24"/>
+        </w:rPr>
+      </w:pPr>
+      <w:r>
+        <w:rPr>
+          <w:rFonts w:ascii="Ebrima" w:hAnsi="Ebrima"/>
+          <w:sz w:val="24"/>
+          <w:szCs w:val="24"/>
+        </w:rPr>
+        <w:lastRenderedPageBreak/>
+        <w:t>Demais serviços não especificados neste documento serão objeto de novo orçamento.</w:t>
+      </w:r>
+    </w:p>
+    <w:p>
+      <w:pPr>
+        <w:jc w:val="both"/>
+        <w:rPr>
+          <w:rFonts w:ascii="Ebrima" w:hAnsi="Ebrima"/>
+          <w:sz w:val="24"/>
+          <w:szCs w:val="24"/>
+        </w:rPr>
+      </w:pPr>
+    </w:p>
+    <w:p>
+      <w:pPr>
+        <w:jc w:val="both"/>
+        <w:rPr>
+          <w:rFonts w:ascii="Ebrima" w:hAnsi="Ebrima"/>
+          <w:sz w:val="24"/>
+          <w:szCs w:val="24"/>
+        </w:rPr>
+      </w:pPr>
+      <w:r>
+        <w:rPr>
+          <w:rFonts w:ascii="Ebrima" w:hAnsi="Ebrima"/>
+          <w:b/>
+          <w:smallCaps/>
+          <w:sz w:val="24"/>
+          <w:szCs w:val="24"/>
+        </w:rPr>
+        <w:t>Prazo de Execução</w:t>
+      </w:r>
+      <w:r>
+        <w:rPr>
+          <w:rFonts w:ascii="Ebrima" w:hAnsi="Ebrima"/>
+          <w:smallCaps/>
+          <w:sz w:val="24"/>
+          <w:szCs w:val="24"/>
+        </w:rPr>
+        <w:t xml:space="preserve">: </w:t>
+      </w:r>
+      <w:r>
+        <w:rPr>
+          <w:rFonts w:ascii="Ebrima" w:hAnsi="Ebrima"/>
+          <w:sz w:val="24"/>
+          <w:szCs w:val="24"/>
+        </w:rPr>
+        <w:t xml:space="preserve">Negociável, conforme necessidades </w:t>
+      </w:r>
+      <w:r>
+        <w:rPr>
+          <w:rFonts w:ascii="Ebrima" w:hAnsi="Ebrima"/>
+          <w:sz w:val="24"/>
+          <w:szCs w:val="24"/>
+        </w:rPr>
+        <w:t>da CONTRATANTE, condicionado à disponibilização das informações</w:t>
+      </w:r>
+      <w:r>
+        <w:rPr>
+          <w:rFonts w:ascii="Ebrima" w:hAnsi="Ebrima"/>
+          <w:sz w:val="24"/>
+          <w:szCs w:val="24"/>
+        </w:rPr>
+        <w:t>.</w:t>
+      </w:r>
+    </w:p>
+    <w:p>
+      <w:pPr>
+        <w:jc w:val="both"/>
+        <w:rPr>
+          <w:rFonts w:ascii="Ebrima" w:hAnsi="Ebrima"/>
+          <w:sz w:val="24"/>
+          <w:szCs w:val="24"/>
+        </w:rPr>
+      </w:pPr>
+    </w:p>
+    <w:p>
+      <w:pPr>
+        <w:pStyle w:val="Corpo"/>
+        <w:tabs>
+          <w:tab w:val="left" w:pos="720"/>
+          <w:tab w:val="left" w:pos="1440"/>
+          <w:tab w:val="left" w:pos="2160"/>
+          <w:tab w:val="left" w:pos="2880"/>
+          <w:tab w:val="left" w:pos="3600"/>
+          <w:tab w:val="left" w:pos="4320"/>
+          <w:tab w:val="left" w:pos="5040"/>
+          <w:tab w:val="left" w:pos="5760"/>
+          <w:tab w:val="left" w:pos="6480"/>
+          <w:tab w:val="left" w:pos="7200"/>
+          <w:tab w:val="left" w:pos="7920"/>
+          <w:tab w:val="left" w:pos="8640"/>
+        </w:tabs>
+        <w:jc w:val="both"/>
+        <w:rPr>
+          <w:rFonts w:ascii="Ebrima" w:hAnsi="Ebrima"/>
+          <w:b/>
+          <w:smallCaps/>
+          <w:sz w:val="24"/>
+          <w:szCs w:val="24"/>
+        </w:rPr>
+      </w:pPr>
+      <w:r>
+        <w:rPr>
+          <w:rFonts w:ascii="Ebrima" w:hAnsi="Ebrima"/>
+          <w:b/>
+          <w:smallCaps/>
+          <w:sz w:val="24"/>
+          <w:szCs w:val="24"/>
+        </w:rPr>
+        <w:t xml:space="preserve">Investimento: </w:t>
+      </w:r>
+    </w:p>
+    <w:tbl>
+      <w:tblPr>
+        <w:tblW w:w="12585" w:type="dxa"/>
+        <w:tblInd w:w="-5" w:type="dxa"/>
+        <w:tblLayout w:type="fixed"/>
+        <w:tblCellMar>
+          <w:left w:w="70" w:type="dxa"/>
+          <w:right w:w="70" w:type="dxa"/>
+        </w:tblCellMar>
+        <w:tblLook w:val="04A0" w:firstRow="1" w:lastRow="0" w:firstColumn="1" w:lastColumn="0" w:noHBand="0" w:noVBand="1"/>
+      </w:tblPr>
+      <w:tblGrid>
+        <w:gridCol w:w="575"/>
+        <w:gridCol w:w="3531"/>
+        <w:gridCol w:w="709"/>
+        <w:gridCol w:w="567"/>
+        <w:gridCol w:w="709"/>
+        <w:gridCol w:w="1306"/>
+        <w:gridCol w:w="1418"/>
+        <w:gridCol w:w="1563"/>
+        <w:gridCol w:w="1041"/>
+        <w:gridCol w:w="1166"/>
+      </w:tblGrid>
+      <w:tr>
+        <w:trPr>
+          <w:gridAfter w:val="3"/>
+          <w:wAfter w:w="3770" w:type="dxa"/>
+          <w:trHeight w:val="300"/>
+        </w:trPr>
+        <w:tc>
+          <w:tcPr>
+            <w:tcW w:w="575" w:type="dxa"/>
+            <w:vMerge w:val="restart"/>
+            <w:tcBorders>
+              <w:top w:val="single" w:sz="8" w:space="0" w:color="auto"/>
+              <w:left w:val="single" w:sz="8" w:space="0" w:color="auto"/>
+              <w:bottom w:val="single" w:sz="8" w:space="0" w:color="000000"/>
+              <w:right w:val="single" w:sz="4" w:space="0" w:color="auto"/>
+            </w:tcBorders>
+            <w:shd w:val="clear" w:color="000000" w:fill="FFFFFF"/>
+            <w:noWrap/>
+            <w:vAlign w:val="bottom"/>
+            <w:hideMark/>
+          </w:tcPr>
+          <w:p>
+            <w:pPr>
+              <w:jc w:val="center"/>
+              <w:rPr>
+                <w:rFonts w:ascii="Ebrima" w:hAnsi="Ebrima" w:cs="Calibri"/>
+                <w:b/>
+                <w:bCs/>
+                <w:color w:val="000000"/>
+              </w:rPr>
+            </w:pPr>
+            <w:r>
+              <w:rPr>
+                <w:rFonts w:ascii="Ebrima" w:hAnsi="Ebrima" w:cs="Calibri"/>
+                <w:b/>
+                <w:bCs/>
+                <w:color w:val="000000"/>
+              </w:rPr>
+              <w:t>Item</w:t>
+            </w:r>
+          </w:p>
+        </w:tc>
+        <w:tc>
+          <w:tcPr>
+            <w:tcW w:w="3531" w:type="dxa"/>
+            <w:vMerge w:val="restart"/>
+            <w:tcBorders>
+              <w:top w:val="single" w:sz="8" w:space="0" w:color="auto"/>
+              <w:left w:val="single" w:sz="4" w:space="0" w:color="auto"/>
+              <w:bottom w:val="single" w:sz="8" w:space="0" w:color="000000"/>
+              <w:right w:val="single" w:sz="4" w:space="0" w:color="000000"/>
+            </w:tcBorders>
+            <w:shd w:val="clear" w:color="000000" w:fill="FFFFFF"/>
+            <w:noWrap/>
+            <w:vAlign w:val="bottom"/>
+            <w:hideMark/>
+          </w:tcPr>
+          <w:p>
+            <w:pPr>
+              <w:jc w:val="center"/>
+              <w:rPr>
+                <w:rFonts w:ascii="Ebrima" w:hAnsi="Ebrima" w:cs="Calibri"/>
+                <w:b/>
+                <w:bCs/>
+                <w:color w:val="000000"/>
+              </w:rPr>
+            </w:pPr>
+            <w:r>
+              <w:rPr>
+                <w:rFonts w:ascii="Ebrima" w:hAnsi="Ebrima" w:cs="Calibri"/>
+                <w:b/>
+                <w:bCs/>
+                <w:color w:val="000000"/>
+              </w:rPr>
+              <w:t>Descrição</w:t>
+            </w:r>
+          </w:p>
+        </w:tc>
+        <w:tc>
+          <w:tcPr>
+            <w:tcW w:w="1276" w:type="dxa"/>
+            <w:gridSpan w:val="2"/>
+            <w:tcBorders>
+              <w:top w:val="single" w:sz="8" w:space="0" w:color="auto"/>
+              <w:left w:val="nil"/>
+              <w:bottom w:val="single" w:sz="4" w:space="0" w:color="auto"/>
+              <w:right w:val="single" w:sz="4" w:space="0" w:color="000000"/>
+            </w:tcBorders>
+            <w:shd w:val="clear" w:color="000000" w:fill="FFFFFF"/>
+            <w:noWrap/>
+            <w:vAlign w:val="bottom"/>
+            <w:hideMark/>
+          </w:tcPr>
+          <w:p>
+            <w:pPr>
+              <w:jc w:val="center"/>
+              <w:rPr>
+                <w:rFonts w:ascii="Ebrima" w:hAnsi="Ebrima" w:cs="Calibri"/>
+                <w:b/>
+                <w:bCs/>
+                <w:color w:val="000000"/>
+              </w:rPr>
+            </w:pPr>
+            <w:r>
+              <w:rPr>
+                <w:rFonts w:ascii="Ebrima" w:hAnsi="Ebrima" w:cs="Calibri"/>
+                <w:b/>
+                <w:bCs/>
+                <w:color w:val="000000"/>
+              </w:rPr>
+              <w:t>S.T.*</w:t>
+            </w:r>
+          </w:p>
+        </w:tc>
+        <w:tc>
+          <w:tcPr>
+            <w:tcW w:w="709" w:type="dxa"/>
+            <w:vMerge w:val="restart"/>
+            <w:tcBorders>
+              <w:top w:val="single" w:sz="8" w:space="0" w:color="auto"/>
+              <w:left w:val="single" w:sz="4" w:space="0" w:color="auto"/>
+              <w:bottom w:val="single" w:sz="8" w:space="0" w:color="000000"/>
+              <w:right w:val="single" w:sz="4" w:space="0" w:color="auto"/>
+            </w:tcBorders>
+            <w:shd w:val="clear" w:color="000000" w:fill="FFFFFF"/>
+            <w:vAlign w:val="bottom"/>
+            <w:hideMark/>
+          </w:tcPr>
+          <w:p>
+            <w:pPr>
+              <w:jc w:val="center"/>
+              <w:rPr>
+                <w:rFonts w:ascii="Ebrima" w:hAnsi="Ebrima" w:cs="Calibri"/>
+                <w:b/>
+                <w:bCs/>
+                <w:color w:val="000000"/>
+              </w:rPr>
+            </w:pPr>
+            <w:r>
+              <w:rPr>
+                <w:rFonts w:ascii="Ebrima" w:hAnsi="Ebrima" w:cs="Calibri"/>
+                <w:b/>
+                <w:bCs/>
+                <w:color w:val="000000"/>
+              </w:rPr>
+              <w:t>D.A.*</w:t>
+            </w:r>
+          </w:p>
+        </w:tc>
+        <w:tc>
+          <w:tcPr>
+            <w:tcW w:w="1306" w:type="dxa"/>
+            <w:vMerge w:val="restart"/>
+            <w:tcBorders>
+              <w:top w:val="single" w:sz="8" w:space="0" w:color="auto"/>
+              <w:left w:val="single" w:sz="4" w:space="0" w:color="auto"/>
+              <w:right w:val="single" w:sz="4" w:space="0" w:color="auto"/>
+            </w:tcBorders>
+            <w:shd w:val="clear" w:color="auto" w:fill="F2F2F2" w:themeFill="background1" w:themeFillShade="F2"/>
+            <w:vAlign w:val="center"/>
+          </w:tcPr>
+          <w:p>
+            <w:pPr>
+              <w:jc w:val="center"/>
+              <w:rPr>
+                <w:rFonts w:ascii="Ebrima" w:hAnsi="Ebrima" w:cs="Calibri"/>
+                <w:b/>
+                <w:bCs/>
+                <w:color w:val="000000"/>
+              </w:rPr>
+            </w:pPr>
+            <w:r>
+              <w:rPr>
+                <w:rFonts w:ascii="Ebrima" w:hAnsi="Ebrima" w:cs="Calibri"/>
+                <w:b/>
+                <w:bCs/>
+                <w:color w:val="000000"/>
+              </w:rPr>
+              <w:t>Valor</w:t>
+            </w:r>
+          </w:p>
+        </w:tc>
+        <w:tc>
+          <w:tcPr>
+            <w:tcW w:w="1418" w:type="dxa"/>
+            <w:vMerge w:val="restart"/>
+            <w:tcBorders>
+              <w:top w:val="single" w:sz="8" w:space="0" w:color="auto"/>
+              <w:left w:val="single" w:sz="4" w:space="0" w:color="auto"/>
+              <w:bottom w:val="single" w:sz="8" w:space="0" w:color="000000"/>
+              <w:right w:val="single" w:sz="8" w:space="0" w:color="auto"/>
+            </w:tcBorders>
+            <w:shd w:val="clear" w:color="auto" w:fill="F2F2F2" w:themeFill="background1" w:themeFillShade="F2"/>
+            <w:noWrap/>
+            <w:vAlign w:val="center"/>
+            <w:hideMark/>
+          </w:tcPr>
+          <w:p>
+            <w:pPr>
+              <w:jc w:val="center"/>
+              <w:rPr>
+                <w:rFonts w:ascii="Ebrima" w:hAnsi="Ebrima" w:cs="Calibri"/>
+                <w:b/>
+                <w:bCs/>
+                <w:color w:val="000000"/>
+              </w:rPr>
+            </w:pPr>
+            <w:r>
+              <w:rPr>
+                <w:rFonts w:ascii="Ebrima" w:hAnsi="Ebrima" w:cs="Calibri"/>
+                <w:b/>
+                <w:bCs/>
+                <w:color w:val="000000"/>
+              </w:rPr>
+              <w:t xml:space="preserve">Valor C/ DESCONTO </w:t>
+            </w:r>
+          </w:p>
+        </w:tc>
+      </w:tr>
+      <w:tr>
+        <w:trPr>
+          <w:gridAfter w:val="3"/>
+          <w:wAfter w:w="3770" w:type="dxa"/>
+          <w:trHeight w:val="315"/>
+        </w:trPr>
+        <w:tc>
+          <w:tcPr>
+            <w:tcW w:w="575" w:type="dxa"/>
+            <w:vMerge/>
+            <w:tcBorders>
+              <w:top w:val="single" w:sz="8" w:space="0" w:color="auto"/>
+              <w:left w:val="single" w:sz="8" w:space="0" w:color="auto"/>
+              <w:bottom w:val="single" w:sz="8" w:space="0" w:color="000000"/>
+              <w:right w:val="single" w:sz="4" w:space="0" w:color="auto"/>
+            </w:tcBorders>
+            <w:vAlign w:val="center"/>
+            <w:hideMark/>
+          </w:tcPr>
+          <w:p>
+            <w:pPr>
+              <w:rPr>
+                <w:rFonts w:ascii="Ebrima" w:hAnsi="Ebrima" w:cs="Calibri"/>
+                <w:b/>
+                <w:bCs/>
+                <w:color w:val="000000"/>
+              </w:rPr>
+            </w:pPr>
+          </w:p>
+        </w:tc>
+        <w:tc>
+          <w:tcPr>
+            <w:tcW w:w="3531" w:type="dxa"/>
+            <w:vMerge/>
+            <w:tcBorders>
+              <w:top w:val="single" w:sz="8" w:space="0" w:color="auto"/>
+              <w:left w:val="single" w:sz="4" w:space="0" w:color="auto"/>
+              <w:bottom w:val="single" w:sz="8" w:space="0" w:color="000000"/>
+              <w:right w:val="single" w:sz="4" w:space="0" w:color="000000"/>
+            </w:tcBorders>
+            <w:vAlign w:val="center"/>
+            <w:hideMark/>
+          </w:tcPr>
+          <w:p>
+            <w:pPr>
+              <w:rPr>
+                <w:rFonts w:ascii="Ebrima" w:hAnsi="Ebrima" w:cs="Calibri"/>
+                <w:b/>
+                <w:bCs/>
+                <w:color w:val="000000"/>
+              </w:rPr>
+            </w:pPr>
+          </w:p>
+        </w:tc>
+        <w:tc>
+          <w:tcPr>
+            <w:tcW w:w="709" w:type="dxa"/>
+            <w:tcBorders>
+              <w:top w:val="nil"/>
+              <w:left w:val="nil"/>
+              <w:bottom w:val="single" w:sz="8" w:space="0" w:color="auto"/>
+              <w:right w:val="single" w:sz="4" w:space="0" w:color="auto"/>
+            </w:tcBorders>
+            <w:shd w:val="clear" w:color="000000" w:fill="FFFFFF"/>
+            <w:noWrap/>
+            <w:vAlign w:val="bottom"/>
+            <w:hideMark/>
+          </w:tcPr>
+          <w:p>
+            <w:pPr>
+              <w:jc w:val="center"/>
+              <w:rPr>
+                <w:rFonts w:ascii="Ebrima" w:hAnsi="Ebrima" w:cs="Calibri"/>
+                <w:b/>
+                <w:bCs/>
+                <w:color w:val="000000"/>
+              </w:rPr>
+            </w:pPr>
+            <w:proofErr w:type="spellStart"/>
+            <w:r>
+              <w:rPr>
+                <w:rFonts w:ascii="Ebrima" w:hAnsi="Ebrima" w:cs="Calibri"/>
+                <w:b/>
+                <w:bCs/>
+                <w:color w:val="000000"/>
+              </w:rPr>
+              <w:t>Qtde</w:t>
+            </w:r>
+            <w:proofErr w:type="spellEnd"/>
+          </w:p>
+        </w:tc>
+        <w:tc>
+          <w:tcPr>
+            <w:tcW w:w="567" w:type="dxa"/>
+            <w:tcBorders>
+              <w:top w:val="nil"/>
+              <w:left w:val="nil"/>
+              <w:bottom w:val="single" w:sz="8" w:space="0" w:color="auto"/>
+              <w:right w:val="single" w:sz="4" w:space="0" w:color="auto"/>
+            </w:tcBorders>
+            <w:shd w:val="clear" w:color="000000" w:fill="FFFFFF"/>
+            <w:noWrap/>
+            <w:vAlign w:val="bottom"/>
+            <w:hideMark/>
+          </w:tcPr>
+          <w:p>
+            <w:pPr>
+              <w:jc w:val="center"/>
+              <w:rPr>
+                <w:rFonts w:ascii="Ebrima" w:hAnsi="Ebrima" w:cs="Calibri"/>
+                <w:b/>
+                <w:bCs/>
+                <w:color w:val="000000"/>
+              </w:rPr>
+            </w:pPr>
+            <w:r>
+              <w:rPr>
+                <w:rFonts w:ascii="Ebrima" w:hAnsi="Ebrima" w:cs="Calibri"/>
+                <w:b/>
+                <w:bCs/>
+                <w:color w:val="000000"/>
+              </w:rPr>
+              <w:t>Un.</w:t>
+            </w:r>
+          </w:p>
+        </w:tc>
+        <w:tc>
+          <w:tcPr>
+            <w:tcW w:w="709" w:type="dxa"/>
+            <w:vMerge/>
+            <w:tcBorders>
+              <w:top w:val="single" w:sz="8" w:space="0" w:color="auto"/>
+              <w:left w:val="single" w:sz="4" w:space="0" w:color="auto"/>
+              <w:bottom w:val="single" w:sz="8" w:space="0" w:color="000000"/>
+              <w:right w:val="single" w:sz="4" w:space="0" w:color="auto"/>
+            </w:tcBorders>
+            <w:vAlign w:val="center"/>
+            <w:hideMark/>
+          </w:tcPr>
+          <w:p>
+            <w:pPr>
+              <w:rPr>
+                <w:rFonts w:ascii="Ebrima" w:hAnsi="Ebrima" w:cs="Calibri"/>
+                <w:b/>
+                <w:bCs/>
+                <w:color w:val="000000"/>
+              </w:rPr>
+            </w:pPr>
+          </w:p>
+        </w:tc>
+        <w:tc>
+          <w:tcPr>
+            <w:tcW w:w="1306" w:type="dxa"/>
+            <w:vMerge/>
+            <w:tcBorders>
+              <w:left w:val="single" w:sz="4" w:space="0" w:color="auto"/>
+              <w:bottom w:val="single" w:sz="8" w:space="0" w:color="000000"/>
+              <w:right w:val="single" w:sz="4" w:space="0" w:color="auto"/>
+            </w:tcBorders>
+            <w:shd w:val="clear" w:color="auto" w:fill="F2F2F2" w:themeFill="background1" w:themeFillShade="F2"/>
+          </w:tcPr>
+          <w:p>
+            <w:pPr>
+              <w:rPr>
+                <w:rFonts w:ascii="Ebrima" w:hAnsi="Ebrima" w:cs="Calibri"/>
+                <w:b/>
+                <w:bCs/>
+                <w:color w:val="000000"/>
+              </w:rPr>
+            </w:pPr>
+          </w:p>
+        </w:tc>
+        <w:tc>
+          <w:tcPr>
+            <w:tcW w:w="1418" w:type="dxa"/>
+            <w:vMerge/>
+            <w:tcBorders>
+              <w:top w:val="single" w:sz="8" w:space="0" w:color="auto"/>
+              <w:left w:val="single" w:sz="4" w:space="0" w:color="auto"/>
+              <w:bottom w:val="single" w:sz="8" w:space="0" w:color="000000"/>
+              <w:right w:val="single" w:sz="8" w:space="0" w:color="auto"/>
+            </w:tcBorders>
+            <w:shd w:val="clear" w:color="auto" w:fill="F2F2F2" w:themeFill="background1" w:themeFillShade="F2"/>
+            <w:vAlign w:val="center"/>
+            <w:hideMark/>
+          </w:tcPr>
+          <w:p>
+            <w:pPr>
+              <w:rPr>
+                <w:rFonts w:ascii="Ebrima" w:hAnsi="Ebrima" w:cs="Calibri"/>
+                <w:b/>
+                <w:bCs/>
+                <w:color w:val="000000"/>
+              </w:rPr>
+            </w:pPr>
+          </w:p>
+        </w:tc>
+      </w:tr>
+      <w:tr>
+        <w:trPr>
+          <w:trHeight w:val="315"/>
+        </w:trPr>
+        <w:tc>
+          <w:tcPr>
+            <w:tcW w:w="575" w:type="dxa"/>
+            <w:tcBorders>
+              <w:top w:val="single" w:sz="4" w:space="0" w:color="auto"/>
+              <w:left w:val="single" w:sz="4" w:space="0" w:color="auto"/>
+              <w:bottom w:val="single" w:sz="4" w:space="0" w:color="auto"/>
+              <w:right w:val="single" w:sz="4" w:space="0" w:color="auto"/>
+            </w:tcBorders>
+            <w:vAlign w:val="center"/>
+            <w:hideMark/>
+          </w:tcPr>
+          <w:p>
+            <w:pPr>
+              <w:spacing w:line="256" w:lineRule="auto"/>
+              <w:jc w:val="center"/>
+              <w:rPr>
+                <w:rFonts w:ascii="Ebrima" w:hAnsi="Ebrima"/>
+                <w:sz w:val="20"/>
+                <w:szCs w:val="20"/>
+              </w:rPr>
+            </w:pPr>
+            <w:r>
+              <w:rPr>
+                <w:rFonts w:ascii="Ebrima" w:hAnsi="Ebrima"/>
+                <w:b/>
+                <w:sz w:val="20"/>
+                <w:szCs w:val="20"/>
+              </w:rPr>
+              <w:t xml:space="preserve">1</w:t>
+            </w:r>
+          </w:p>
+        </w:tc>
+        <w:tc>
+          <w:tcPr>
+            <w:tcW w:w="3531" w:type="dxa"/>
+            <w:tcBorders>
+              <w:top w:val="single" w:sz="4" w:space="0" w:color="auto"/>
+              <w:left w:val="single" w:sz="4" w:space="0" w:color="auto"/>
+              <w:bottom w:val="single" w:sz="4" w:space="0" w:color="auto"/>
+              <w:right w:val="single" w:sz="4" w:space="0" w:color="auto"/>
+            </w:tcBorders>
+            <w:vAlign w:val="center"/>
+            <w:hideMark/>
+          </w:tcPr>
+          <w:p>
+            <w:pPr>
+              <w:spacing w:line="256" w:lineRule="auto"/>
+              <w:jc w:val="left"/>
+              <w:rPr>
+                <w:rFonts w:ascii="Ebrima" w:hAnsi="Ebrima"/>
+                <w:sz w:val="20"/>
+                <w:szCs w:val="20"/>
+              </w:rPr>
+            </w:pPr>
+            <w:r>
+              <w:rPr>
+                <w:rFonts w:ascii="Ebrima" w:hAnsi="Ebrima"/>
+                <w:sz w:val="20"/>
+                <w:szCs w:val="20"/>
+              </w:rPr>
+              <w:t xml:space="preserve">Elaboração de {quantidadePgrcc} PGRCC para obra de demolição.</w:t>
+            </w:r>
+          </w:p>
+        </w:tc>
+        <w:tc>
+          <w:tcPr>
+            <w:tcW w:w="709" w:type="dxa"/>
+            <w:tcBorders>
+              <w:top w:val="single" w:sz="4" w:space="0" w:color="auto"/>
+              <w:left w:val="single" w:sz="4" w:space="0" w:color="auto"/>
+              <w:bottom w:val="single" w:sz="4" w:space="0" w:color="auto"/>
+              <w:right w:val="single" w:sz="4" w:space="0" w:color="auto"/>
+            </w:tcBorders>
+            <w:vAlign w:val="center"/>
+            <w:hideMark/>
+          </w:tcPr>
+          <w:p>
+            <w:pPr>
+              <w:spacing w:line="256" w:lineRule="auto"/>
+              <w:jc w:val="center"/>
+              <w:rPr>
+                <w:rFonts w:ascii="Ebrima" w:hAnsi="Ebrima"/>
+                <w:sz w:val="20"/>
+                <w:szCs w:val="20"/>
+              </w:rPr>
+            </w:pPr>
+            <w:r>
+              <w:rPr>
+                <w:rFonts w:ascii="Ebrima" w:hAnsi="Ebrima"/>
+                <w:sz w:val="20"/>
+                <w:szCs w:val="20"/>
+              </w:rPr>
+              <w:t xml:space="preserve">n</w:t>
+            </w:r>
+          </w:p>
+        </w:tc>
+        <w:tc>
+          <w:tcPr>
+            <w:tcW w:w="567" w:type="dxa"/>
+            <w:tcBorders>
+              <w:top w:val="single" w:sz="4" w:space="0" w:color="auto"/>
+              <w:left w:val="single" w:sz="4" w:space="0" w:color="auto"/>
+              <w:bottom w:val="single" w:sz="4" w:space="0" w:color="auto"/>
+              <w:right w:val="single" w:sz="4" w:space="0" w:color="auto"/>
+            </w:tcBorders>
+            <w:vAlign w:val="center"/>
+            <w:hideMark/>
+          </w:tcPr>
+          <w:p>
+            <w:pPr>
+              <w:spacing w:line="256" w:lineRule="auto"/>
+              <w:jc w:val="center"/>
+              <w:rPr>
+                <w:rFonts w:ascii="Ebrima" w:hAnsi="Ebrima"/>
+                <w:sz w:val="20"/>
+                <w:szCs w:val="20"/>
+              </w:rPr>
+            </w:pPr>
+            <w:r>
+              <w:rPr>
+                <w:rFonts w:ascii="Ebrima" w:hAnsi="Ebrima"/>
+                <w:sz w:val="20"/>
+                <w:szCs w:val="20"/>
+              </w:rPr>
+              <w:t xml:space="preserve">HT</w:t>
+            </w:r>
+          </w:p>
+        </w:tc>
+        <w:tc>
+          <w:tcPr>
+            <w:tcW w:w="709" w:type="dxa"/>
+            <w:tcBorders>
+              <w:top w:val="single" w:sz="4" w:space="0" w:color="auto"/>
+              <w:left w:val="single" w:sz="4" w:space="0" w:color="auto"/>
+              <w:bottom w:val="single" w:sz="4" w:space="0" w:color="auto"/>
+              <w:right w:val="single" w:sz="4" w:space="0" w:color="auto"/>
+            </w:tcBorders>
+            <w:vAlign w:val="center"/>
+            <w:hideMark/>
+          </w:tcPr>
+          <w:p>
+            <w:pPr>
+              <w:spacing w:line="256" w:lineRule="auto"/>
+              <w:jc w:val="center"/>
+              <w:rPr>
+                <w:rFonts w:ascii="Ebrima" w:hAnsi="Ebrima"/>
+                <w:sz w:val="20"/>
+                <w:szCs w:val="20"/>
+              </w:rPr>
+            </w:pPr>
+            <w:r>
+              <w:rPr>
+                <w:rFonts w:ascii="Ebrima" w:hAnsi="Ebrima"/>
+                <w:sz w:val="20"/>
+                <w:szCs w:val="20"/>
+              </w:rPr>
+              <w:t xml:space="preserve">{percentualDesconto}%</w:t>
+            </w:r>
+          </w:p>
+        </w:tc>
+        <w:tc>
+          <w:tcPr>
+            <w:tcW w:w="1306" w:type="dxa"/>
+            <w:tcBorders>
+              <w:top w:val="single" w:sz="4" w:space="0" w:color="auto"/>
+              <w:left w:val="single" w:sz="4" w:space="0" w:color="auto"/>
+              <w:bottom w:val="single" w:sz="4" w:space="0" w:color="auto"/>
+              <w:right w:val="single" w:sz="4" w:space="0" w:color="auto"/>
+            </w:tcBorders>
+            <w:vAlign w:val="center"/>
+            <w:hideMark/>
+          </w:tcPr>
+          <w:p>
+            <w:pPr>
+              <w:spacing w:line="256" w:lineRule="auto"/>
+              <w:jc w:val="center"/>
+              <w:rPr>
+                <w:rFonts w:ascii="Ebrima" w:hAnsi="Ebrima"/>
+                <w:sz w:val="20"/>
+                <w:szCs w:val="20"/>
+              </w:rPr>
+            </w:pPr>
+            <w:r>
+              <w:rPr>
+                <w:rFonts w:ascii="Ebrima" w:hAnsi="Ebrima"/>
+                <w:b/>
+                <w:sz w:val="20"/>
+                <w:szCs w:val="20"/>
+              </w:rPr>
+              <w:t xml:space="preserve">{valorTotalPgrccFormatado}</w:t>
+            </w:r>
+          </w:p>
+        </w:tc>
+        <w:tc>
+          <w:tcPr>
+            <w:tcW w:w="1418" w:type="dxa"/>
+            <w:tcBorders>
+              <w:top w:val="single" w:sz="4" w:space="0" w:color="auto"/>
+              <w:left w:val="single" w:sz="4" w:space="0" w:color="auto"/>
+              <w:bottom w:val="single" w:sz="4" w:space="0" w:color="auto"/>
+              <w:right w:val="single" w:sz="4" w:space="0" w:color="auto"/>
+            </w:tcBorders>
+            <w:vAlign w:val="center"/>
+            <w:hideMark/>
+          </w:tcPr>
+          <w:p>
+            <w:pPr>
+              <w:spacing w:line="256" w:lineRule="auto"/>
+              <w:jc w:val="center"/>
+              <w:rPr>
+                <w:rFonts w:ascii="Ebrima" w:hAnsi="Ebrima"/>
+                <w:sz w:val="20"/>
+                <w:szCs w:val="20"/>
+              </w:rPr>
+            </w:pPr>
+            <w:r>
+              <w:rPr>
+                <w:rFonts w:ascii="Ebrima" w:hAnsi="Ebrima"/>
+                <w:b/>
+                <w:sz w:val="20"/>
+                <w:szCs w:val="20"/>
+              </w:rPr>
+              <w:t xml:space="preserve">{valorLiquidoPgrccFormatado}</w:t>
+            </w:r>
+          </w:p>
+        </w:tc>
+      </w:tr>
+      <w:tr>
+        <w:trPr>
+          <w:trHeight w:val="315"/>
+        </w:trPr>
+        <w:tc>
+          <w:tcPr>
+            <w:tcW w:w="575" w:type="dxa"/>
+            <w:tcBorders>
+              <w:top w:val="single" w:sz="4" w:space="0" w:color="auto"/>
+              <w:left w:val="single" w:sz="4" w:space="0" w:color="auto"/>
+              <w:bottom w:val="single" w:sz="4" w:space="0" w:color="auto"/>
+              <w:right w:val="single" w:sz="4" w:space="0" w:color="auto"/>
+            </w:tcBorders>
+            <w:vAlign w:val="center"/>
+            <w:hideMark/>
+          </w:tcPr>
+          <w:p>
+            <w:pPr>
+              <w:spacing w:line="256" w:lineRule="auto"/>
+              <w:jc w:val="center"/>
+              <w:rPr>
+                <w:rFonts w:ascii="Ebrima" w:hAnsi="Ebrima"/>
+                <w:sz w:val="20"/>
+                <w:szCs w:val="20"/>
+              </w:rPr>
+            </w:pPr>
+            <w:r>
+              <w:rPr>
+                <w:rFonts w:ascii="Ebrima" w:hAnsi="Ebrima"/>
+                <w:b/>
+                <w:sz w:val="20"/>
+                <w:szCs w:val="20"/>
+              </w:rPr>
+              <w:t xml:space="preserve">2</w:t>
+            </w:r>
+          </w:p>
+        </w:tc>
+        <w:tc>
+          <w:tcPr>
+            <w:tcW w:w="3531" w:type="dxa"/>
+            <w:tcBorders>
+              <w:top w:val="single" w:sz="4" w:space="0" w:color="auto"/>
+              <w:left w:val="single" w:sz="4" w:space="0" w:color="auto"/>
+              <w:bottom w:val="single" w:sz="4" w:space="0" w:color="auto"/>
+              <w:right w:val="single" w:sz="4" w:space="0" w:color="auto"/>
+            </w:tcBorders>
+            <w:vAlign w:val="center"/>
+            <w:hideMark/>
+          </w:tcPr>
+          <w:p>
+            <w:pPr>
+              <w:spacing w:line="256" w:lineRule="auto"/>
+              <w:jc w:val="left"/>
+              <w:rPr>
+                <w:rFonts w:ascii="Ebrima" w:hAnsi="Ebrima"/>
+                <w:sz w:val="20"/>
+                <w:szCs w:val="20"/>
+              </w:rPr>
+            </w:pPr>
+            <w:r>
+              <w:rPr>
+                <w:rFonts w:ascii="Ebrima" w:hAnsi="Ebrima"/>
+                <w:sz w:val="20"/>
+                <w:szCs w:val="20"/>
+              </w:rPr>
+              <w:t xml:space="preserve">Elaboração de {quantidadeRgrcc} RGRCC para obra de demolição.</w:t>
+            </w:r>
+          </w:p>
+        </w:tc>
+        <w:tc>
+          <w:tcPr>
+            <w:tcW w:w="709" w:type="dxa"/>
+            <w:tcBorders>
+              <w:top w:val="single" w:sz="4" w:space="0" w:color="auto"/>
+              <w:left w:val="single" w:sz="4" w:space="0" w:color="auto"/>
+              <w:bottom w:val="single" w:sz="4" w:space="0" w:color="auto"/>
+              <w:right w:val="single" w:sz="4" w:space="0" w:color="auto"/>
+            </w:tcBorders>
+            <w:vAlign w:val="center"/>
+            <w:hideMark/>
+          </w:tcPr>
+          <w:p>
+            <w:pPr>
+              <w:spacing w:line="256" w:lineRule="auto"/>
+              <w:jc w:val="center"/>
+              <w:rPr>
+                <w:rFonts w:ascii="Ebrima" w:hAnsi="Ebrima"/>
+                <w:sz w:val="20"/>
+                <w:szCs w:val="20"/>
+              </w:rPr>
+            </w:pPr>
+            <w:r>
+              <w:rPr>
+                <w:rFonts w:ascii="Ebrima" w:hAnsi="Ebrima"/>
+                <w:sz w:val="20"/>
+                <w:szCs w:val="20"/>
+              </w:rPr>
+              <w:t xml:space="preserve">y</w:t>
+            </w:r>
+          </w:p>
+        </w:tc>
+        <w:tc>
+          <w:tcPr>
+            <w:tcW w:w="567" w:type="dxa"/>
+            <w:tcBorders>
+              <w:top w:val="single" w:sz="4" w:space="0" w:color="auto"/>
+              <w:left w:val="single" w:sz="4" w:space="0" w:color="auto"/>
+              <w:bottom w:val="single" w:sz="4" w:space="0" w:color="auto"/>
+              <w:right w:val="single" w:sz="4" w:space="0" w:color="auto"/>
+            </w:tcBorders>
+            <w:vAlign w:val="center"/>
+            <w:hideMark/>
+          </w:tcPr>
+          <w:p>
+            <w:pPr>
+              <w:spacing w:line="256" w:lineRule="auto"/>
+              <w:jc w:val="center"/>
+              <w:rPr>
+                <w:rFonts w:ascii="Ebrima" w:hAnsi="Ebrima"/>
+                <w:sz w:val="20"/>
+                <w:szCs w:val="20"/>
+              </w:rPr>
+            </w:pPr>
+            <w:r>
+              <w:rPr>
+                <w:rFonts w:ascii="Ebrima" w:hAnsi="Ebrima"/>
+                <w:sz w:val="20"/>
+                <w:szCs w:val="20"/>
+              </w:rPr>
+              <w:t xml:space="preserve">HT</w:t>
+            </w:r>
+          </w:p>
+        </w:tc>
+        <w:tc>
+          <w:tcPr>
+            <w:tcW w:w="709" w:type="dxa"/>
+            <w:tcBorders>
+              <w:top w:val="single" w:sz="4" w:space="0" w:color="auto"/>
+              <w:left w:val="single" w:sz="4" w:space="0" w:color="auto"/>
+              <w:bottom w:val="single" w:sz="4" w:space="0" w:color="auto"/>
+              <w:right w:val="single" w:sz="4" w:space="0" w:color="auto"/>
+            </w:tcBorders>
+            <w:vAlign w:val="center"/>
+            <w:hideMark/>
+          </w:tcPr>
+          <w:p>
+            <w:pPr>
+              <w:spacing w:line="256" w:lineRule="auto"/>
+              <w:jc w:val="center"/>
+              <w:rPr>
+                <w:rFonts w:ascii="Ebrima" w:hAnsi="Ebrima"/>
+                <w:sz w:val="20"/>
+                <w:szCs w:val="20"/>
+              </w:rPr>
+            </w:pPr>
+            <w:r>
+              <w:rPr>
+                <w:rFonts w:ascii="Ebrima" w:hAnsi="Ebrima"/>
+                <w:sz w:val="20"/>
+                <w:szCs w:val="20"/>
+              </w:rPr>
+              <w:t xml:space="preserve">{percentualDesconto}%</w:t>
+            </w:r>
+          </w:p>
+        </w:tc>
+        <w:tc>
+          <w:tcPr>
+            <w:tcW w:w="1306" w:type="dxa"/>
+            <w:tcBorders>
+              <w:top w:val="single" w:sz="4" w:space="0" w:color="auto"/>
+              <w:left w:val="single" w:sz="4" w:space="0" w:color="auto"/>
+              <w:bottom w:val="single" w:sz="4" w:space="0" w:color="auto"/>
+              <w:right w:val="single" w:sz="4" w:space="0" w:color="auto"/>
+            </w:tcBorders>
+            <w:vAlign w:val="center"/>
+            <w:hideMark/>
+          </w:tcPr>
+          <w:p>
+            <w:pPr>
+              <w:spacing w:line="256" w:lineRule="auto"/>
+              <w:jc w:val="center"/>
+              <w:rPr>
+                <w:rFonts w:ascii="Ebrima" w:hAnsi="Ebrima"/>
+                <w:sz w:val="20"/>
+                <w:szCs w:val="20"/>
+              </w:rPr>
+            </w:pPr>
+            <w:r>
+              <w:rPr>
+                <w:rFonts w:ascii="Ebrima" w:hAnsi="Ebrima"/>
+                <w:b/>
+                <w:sz w:val="20"/>
+                <w:szCs w:val="20"/>
+              </w:rPr>
+              <w:t xml:space="preserve">{valorTotalRgrccFormatado}</w:t>
+            </w:r>
+          </w:p>
+        </w:tc>
+        <w:tc>
+          <w:tcPr>
+            <w:tcW w:w="1418" w:type="dxa"/>
+            <w:tcBorders>
+              <w:top w:val="single" w:sz="4" w:space="0" w:color="auto"/>
+              <w:left w:val="single" w:sz="4" w:space="0" w:color="auto"/>
+              <w:bottom w:val="single" w:sz="4" w:space="0" w:color="auto"/>
+              <w:right w:val="single" w:sz="4" w:space="0" w:color="auto"/>
+            </w:tcBorders>
+            <w:vAlign w:val="center"/>
+            <w:hideMark/>
+          </w:tcPr>
+          <w:p>
+            <w:pPr>
+              <w:spacing w:line="256" w:lineRule="auto"/>
+              <w:jc w:val="center"/>
+              <w:rPr>
+                <w:rFonts w:ascii="Ebrima" w:hAnsi="Ebrima"/>
+                <w:sz w:val="20"/>
+                <w:szCs w:val="20"/>
+              </w:rPr>
+            </w:pPr>
+            <w:r>
+              <w:rPr>
+                <w:rFonts w:ascii="Ebrima" w:hAnsi="Ebrima"/>
+                <w:b/>
+                <w:sz w:val="20"/>
+                <w:szCs w:val="20"/>
+              </w:rPr>
+              <w:t xml:space="preserve">{valorLiquidoRgrccFormatado}</w:t>
+            </w:r>
+          </w:p>
+        </w:tc>
+      </w:tr>
+      <w:tr>
+        <w:trPr>
+          <w:trHeight w:val="325"/>
+        </w:trPr>
+        <w:tc>
+          <w:tcPr>
+            <w:tcW w:w="6091" w:type="dxa"/>
+            <w:gridSpan w:val="5"/>
+            <w:tcBorders>
+              <w:top w:val="single" w:sz="4" w:space="0" w:color="auto"/>
+              <w:left w:val="single" w:sz="4" w:space="0" w:color="auto"/>
+              <w:bottom w:val="single" w:sz="4" w:space="0" w:color="auto"/>
+              <w:right w:val="single" w:sz="4" w:space="0" w:color="auto"/>
+            </w:tcBorders>
+            <w:vAlign w:val="center"/>
+            <w:hideMark/>
+          </w:tcPr>
+          <w:p>
+            <w:pPr>
+              <w:spacing w:line="256" w:lineRule="auto"/>
+              <w:jc w:val="left"/>
+              <w:rPr>
+                <w:rFonts w:ascii="Ebrima" w:hAnsi="Ebrima"/>
+                <w:sz w:val="20"/>
+                <w:szCs w:val="20"/>
+              </w:rPr>
+            </w:pPr>
+            <w:r>
+              <w:rPr>
+                <w:rFonts w:ascii="Ebrima" w:hAnsi="Ebrima"/>
+                <w:b/>
+                <w:sz w:val="20"/>
+                <w:szCs w:val="20"/>
+              </w:rPr>
+              <w:t xml:space="preserve">Anotação de Responsabilidade Técnica CREA-PR</w:t>
+            </w:r>
+          </w:p>
+        </w:tc>
+        <w:tc>
+          <w:tcPr>
+            <w:tcW w:w="2724" w:type="dxa"/>
+            <w:gridSpan w:val="2"/>
+            <w:tcBorders>
+              <w:top w:val="single" w:sz="4" w:space="0" w:color="auto"/>
+              <w:left w:val="single" w:sz="4" w:space="0" w:color="auto"/>
+              <w:bottom w:val="single" w:sz="4" w:space="0" w:color="auto"/>
+              <w:right w:val="single" w:sz="4" w:space="0" w:color="auto"/>
+            </w:tcBorders>
+            <w:vAlign w:val="center"/>
+            <w:hideMark/>
+          </w:tcPr>
+          <w:p>
+            <w:pPr>
+              <w:spacing w:line="256" w:lineRule="auto"/>
+              <w:jc w:val="center"/>
+              <w:rPr>
+                <w:rFonts w:ascii="Ebrima" w:hAnsi="Ebrima"/>
+                <w:sz w:val="20"/>
+                <w:szCs w:val="20"/>
+              </w:rPr>
+            </w:pPr>
+            <w:r>
+              <w:rPr>
+                <w:rFonts w:ascii="Ebrima" w:hAnsi="Ebrima"/>
+                <w:sz w:val="20"/>
+                <w:szCs w:val="20"/>
+              </w:rPr>
+              <w:t xml:space="preserve">inclusa</w:t>
+            </w:r>
+          </w:p>
+        </w:tc>
+        <w:tc>
+          <w:tcPr>
+            <w:tcW w:w="1563" w:type="dxa"/>
+            <w:tcBorders>
+              <w:top w:val="single" w:sz="4" w:space="0" w:color="auto"/>
+              <w:left w:val="single" w:sz="4" w:space="0" w:color="auto"/>
+              <w:bottom w:val="single" w:sz="4" w:space="0" w:color="auto"/>
+              <w:right w:val="single" w:sz="4" w:space="0" w:color="auto"/>
+            </w:tcBorders>
+            <w:vAlign w:val="center"/>
+            <w:hideMark/>
+          </w:tcPr>
+          <w:p>
+            <w:pPr>
+              <w:spacing w:line="256" w:lineRule="auto"/>
+              <w:jc w:val="center"/>
+              <w:rPr>
+                <w:rFonts w:ascii="Ebrima" w:hAnsi="Ebrima"/>
+                <w:sz w:val="20"/>
+                <w:szCs w:val="20"/>
+              </w:rPr>
+            </w:pPr>
+            <w:r>
+              <w:rPr>
+                <w:rFonts w:ascii="Ebrima" w:hAnsi="Ebrima"/>
+                <w:sz w:val="20"/>
+                <w:szCs w:val="20"/>
+              </w:rPr>
+              <w:t xml:space="preserve"/>
+            </w:r>
+          </w:p>
+        </w:tc>
+        <w:tc>
+          <w:tcPr>
+            <w:tcW w:w="1041" w:type="dxa"/>
+            <w:tcBorders>
+              <w:top w:val="single" w:sz="4" w:space="0" w:color="auto"/>
+              <w:left w:val="single" w:sz="4" w:space="0" w:color="auto"/>
+              <w:bottom w:val="single" w:sz="4" w:space="0" w:color="auto"/>
+              <w:right w:val="single" w:sz="4" w:space="0" w:color="auto"/>
+            </w:tcBorders>
+            <w:vAlign w:val="center"/>
+            <w:hideMark/>
+          </w:tcPr>
+          <w:p>
+            <w:pPr>
+              <w:spacing w:line="256" w:lineRule="auto"/>
+              <w:jc w:val="center"/>
+              <w:rPr>
+                <w:rFonts w:ascii="Ebrima" w:hAnsi="Ebrima"/>
+                <w:sz w:val="20"/>
+                <w:szCs w:val="20"/>
+              </w:rPr>
+            </w:pPr>
+            <w:r>
+              <w:rPr>
+                <w:rFonts w:ascii="Ebrima" w:hAnsi="Ebrima"/>
+                <w:sz w:val="20"/>
+                <w:szCs w:val="20"/>
+              </w:rPr>
+              <w:t xml:space="preserve"/>
+            </w:r>
+          </w:p>
+        </w:tc>
+        <w:tc>
+          <w:tcPr>
+            <w:tcW w:w="1166" w:type="dxa"/>
+            <w:tcBorders>
+              <w:top w:val="single" w:sz="4" w:space="0" w:color="auto"/>
+              <w:left w:val="single" w:sz="4" w:space="0" w:color="auto"/>
+              <w:bottom w:val="single" w:sz="4" w:space="0" w:color="auto"/>
+              <w:right w:val="single" w:sz="4" w:space="0" w:color="auto"/>
+            </w:tcBorders>
+            <w:vAlign w:val="center"/>
+            <w:hideMark/>
+          </w:tcPr>
+          <w:p>
+            <w:pPr>
+              <w:spacing w:line="256" w:lineRule="auto"/>
+              <w:jc w:val="center"/>
+              <w:rPr>
+                <w:rFonts w:ascii="Ebrima" w:hAnsi="Ebrima"/>
+                <w:sz w:val="20"/>
+                <w:szCs w:val="20"/>
+              </w:rPr>
+            </w:pPr>
+            <w:r>
+              <w:rPr>
+                <w:rFonts w:ascii="Ebrima" w:hAnsi="Ebrima"/>
+                <w:sz w:val="20"/>
+                <w:szCs w:val="20"/>
+              </w:rPr>
+              <w:t xml:space="preserve">incluso</w:t>
+            </w:r>
+          </w:p>
+        </w:tc>
+      </w:tr>
+    </w:tbl>
+    <w:p>
+      <w:pPr>
+        <w:pStyle w:val="Corpo"/>
+        <w:tabs>
+          <w:tab w:val="left" w:pos="720"/>
+          <w:tab w:val="left" w:pos="1440"/>
+          <w:tab w:val="left" w:pos="2160"/>
+          <w:tab w:val="left" w:pos="2880"/>
+          <w:tab w:val="left" w:pos="3600"/>
+          <w:tab w:val="left" w:pos="4320"/>
+          <w:tab w:val="left" w:pos="5040"/>
+          <w:tab w:val="left" w:pos="5760"/>
+          <w:tab w:val="left" w:pos="6480"/>
+          <w:tab w:val="left" w:pos="7200"/>
+          <w:tab w:val="left" w:pos="7920"/>
+          <w:tab w:val="left" w:pos="8640"/>
+        </w:tabs>
+        <w:jc w:val="center"/>
+        <w:rPr>
+          <w:rFonts w:ascii="Ebrima" w:hAnsi="Ebrima"/>
+          <w:bCs/>
+          <w:smallCaps/>
+          <w:sz w:val="20"/>
+        </w:rPr>
+      </w:pPr>
+      <w:r>
+        <w:rPr>
+          <w:rFonts w:ascii="Ebrima" w:hAnsi="Ebrima"/>
+          <w:bCs/>
+          <w:smallCaps/>
+          <w:sz w:val="20"/>
+        </w:rPr>
+        <w:t>* 1 HT</w:t>
+      </w:r>
+      <w:r>
+        <w:rPr>
+          <w:rFonts w:ascii="Ebrima" w:hAnsi="Ebrima"/>
+          <w:bCs/>
+          <w:smallCaps/>
+          <w:sz w:val="20"/>
+        </w:rPr>
+        <w:t xml:space="preserve"> </w:t>
+      </w:r>
+      <w:r>
+        <w:rPr>
+          <w:rFonts w:ascii="Ebrima" w:hAnsi="Ebrima"/>
+          <w:bCs/>
+          <w:smallCaps/>
+          <w:sz w:val="20"/>
+        </w:rPr>
+        <w:t xml:space="preserve">= R$ </w:t>
+      </w:r>
+      <w:r>
+        <w:rPr>
+          <w:rFonts w:ascii="Ebrima" w:hAnsi="Ebrima"/>
+          <w:bCs/>
+          <w:smallCaps/>
+          <w:sz w:val="20"/>
+        </w:rPr>
+        <w:t>2</w:t>
+      </w:r>
+      <w:r>
+        <w:rPr>
+          <w:rFonts w:ascii="Ebrima" w:hAnsi="Ebrima"/>
+          <w:bCs/>
+          <w:smallCaps/>
+          <w:sz w:val="20"/>
+        </w:rPr>
+        <w:t>91,78</w:t>
+      </w:r>
+      <w:r>
+        <w:rPr>
+          <w:rFonts w:ascii="Ebrima" w:hAnsi="Ebrima"/>
+          <w:bCs/>
+          <w:smallCaps/>
+          <w:sz w:val="20"/>
+        </w:rPr>
+        <w:t xml:space="preserve"> (valor correspondente a 3% de 6 </w:t>
+      </w:r>
+      <w:proofErr w:type="gramStart"/>
+      <w:r>
+        <w:rPr>
+          <w:rFonts w:ascii="Ebrima" w:hAnsi="Ebrima"/>
+          <w:bCs/>
+          <w:smallCaps/>
+          <w:sz w:val="20"/>
+        </w:rPr>
+        <w:t>salários mínimos</w:t>
+      </w:r>
+      <w:proofErr w:type="gramEnd"/>
+      <w:r>
+        <w:rPr>
+          <w:rFonts w:ascii="Ebrima" w:hAnsi="Ebrima"/>
+          <w:bCs/>
+          <w:smallCaps/>
+          <w:sz w:val="20"/>
+        </w:rPr>
+        <w:t xml:space="preserve"> = SENGE-PR)</w:t>
+      </w:r>
+    </w:p>
+    <w:p>
+      <w:pPr>
+        <w:pStyle w:val="Corpo"/>
+        <w:tabs>
+          <w:tab w:val="left" w:pos="720"/>
+          <w:tab w:val="left" w:pos="1440"/>
+          <w:tab w:val="left" w:pos="2160"/>
+          <w:tab w:val="left" w:pos="2880"/>
+          <w:tab w:val="left" w:pos="3600"/>
+          <w:tab w:val="left" w:pos="4320"/>
+          <w:tab w:val="left" w:pos="5040"/>
+          <w:tab w:val="left" w:pos="5760"/>
+          <w:tab w:val="left" w:pos="6480"/>
+          <w:tab w:val="left" w:pos="7200"/>
+          <w:tab w:val="left" w:pos="7920"/>
+          <w:tab w:val="left" w:pos="8640"/>
+        </w:tabs>
+        <w:jc w:val="center"/>
+        <w:rPr>
+          <w:rFonts w:ascii="Ebrima" w:hAnsi="Ebrima"/>
+          <w:b/>
+          <w:smallCaps/>
+          <w:sz w:val="24"/>
+          <w:szCs w:val="24"/>
+        </w:rPr>
+      </w:pPr>
+      <w:r>
+        <w:rPr>
+          <w:rFonts w:ascii="Ebrima" w:hAnsi="Ebrima"/>
+          <w:bCs/>
+          <w:smallCaps/>
+          <w:sz w:val="20"/>
+        </w:rPr>
+        <w:t>S.T. = Serviços técnicos</w:t>
+      </w:r>
+      <w:r>
+        <w:rPr>
+          <w:rFonts w:ascii="Ebrima" w:hAnsi="Ebrima"/>
+          <w:bCs/>
+          <w:smallCaps/>
+          <w:sz w:val="20"/>
+        </w:rPr>
+        <w:tab/>
+      </w:r>
+      <w:r>
+        <w:rPr>
+          <w:rFonts w:ascii="Ebrima" w:hAnsi="Ebrima"/>
+          <w:bCs/>
+          <w:smallCaps/>
+          <w:sz w:val="20"/>
+        </w:rPr>
+        <w:t>/</w:t>
+      </w:r>
+      <w:r>
+        <w:rPr>
+          <w:rFonts w:ascii="Ebrima" w:hAnsi="Ebrima"/>
+          <w:bCs/>
+          <w:smallCaps/>
+          <w:sz w:val="20"/>
+        </w:rPr>
+        <w:t xml:space="preserve"> D.A.</w:t>
+      </w:r>
+      <w:r>
+        <w:rPr>
+          <w:rFonts w:ascii="Ebrima" w:hAnsi="Ebrima"/>
+          <w:bCs/>
+          <w:smallCaps/>
+          <w:sz w:val="20"/>
+        </w:rPr>
+        <w:t xml:space="preserve"> = Despesas administrativas e tributárias</w:t>
+      </w:r>
+    </w:p>
+    <w:p>
+      <w:pPr>
+        <w:pStyle w:val="Corpo"/>
+        <w:tabs>
+          <w:tab w:val="left" w:pos="720"/>
+          <w:tab w:val="left" w:pos="1440"/>
+          <w:tab w:val="left" w:pos="2160"/>
+          <w:tab w:val="left" w:pos="2880"/>
+          <w:tab w:val="left" w:pos="3600"/>
+          <w:tab w:val="left" w:pos="4320"/>
+          <w:tab w:val="left" w:pos="5040"/>
+          <w:tab w:val="left" w:pos="5760"/>
+          <w:tab w:val="left" w:pos="6480"/>
+          <w:tab w:val="left" w:pos="7200"/>
+          <w:tab w:val="left" w:pos="7920"/>
+          <w:tab w:val="left" w:pos="8640"/>
+        </w:tabs>
+        <w:jc w:val="both"/>
+        <w:rPr>
+          <w:rFonts w:ascii="Ebrima" w:hAnsi="Ebrima"/>
+          <w:b/>
+          <w:smallCaps/>
+          <w:sz w:val="24"/>
+          <w:szCs w:val="24"/>
+        </w:rPr>
+      </w:pPr>
+    </w:p>
+    <w:p>
+      <w:pPr>
+        <w:pStyle w:val="Corpo"/>
+        <w:tabs>
+          <w:tab w:val="left" w:pos="720"/>
+          <w:tab w:val="left" w:pos="1440"/>
+          <w:tab w:val="left" w:pos="2160"/>
+          <w:tab w:val="left" w:pos="2880"/>
+          <w:tab w:val="left" w:pos="3600"/>
+          <w:tab w:val="left" w:pos="4320"/>
+          <w:tab w:val="left" w:pos="5040"/>
+          <w:tab w:val="left" w:pos="5760"/>
+          <w:tab w:val="left" w:pos="6480"/>
+          <w:tab w:val="left" w:pos="7200"/>
+          <w:tab w:val="left" w:pos="7920"/>
+          <w:tab w:val="left" w:pos="8640"/>
+        </w:tabs>
+        <w:jc w:val="both"/>
+        <w:rPr>
+          <w:rFonts w:ascii="Ebrima" w:hAnsi="Ebrima"/>
+          <w:sz w:val="24"/>
+          <w:szCs w:val="24"/>
+        </w:rPr>
+      </w:pPr>
+      <w:r>
+        <w:rPr>
+          <w:rFonts w:ascii="Ebrima" w:hAnsi="Ebrima"/>
+          <w:b/>
+          <w:smallCaps/>
+          <w:sz w:val="24"/>
+          <w:szCs w:val="24"/>
+        </w:rPr>
+        <w:t>Validade da Proposta</w:t>
+      </w:r>
+      <w:r>
+        <w:rPr>
+          <w:rFonts w:ascii="Ebrima" w:hAnsi="Ebrima"/>
+          <w:smallCaps/>
+          <w:sz w:val="24"/>
+          <w:szCs w:val="24"/>
+        </w:rPr>
+        <w:t xml:space="preserve">: </w:t>
+      </w:r>
+      <w:r>
+        <w:rPr>
+          <w:rFonts w:ascii="Ebrima" w:hAnsi="Ebrima"/>
+          <w:sz w:val="24"/>
+          <w:szCs w:val="24"/>
+        </w:rPr>
+        <w:t>30 dias</w:t>
+      </w:r>
+    </w:p>
+    <w:p>
+      <w:pPr>
+        <w:jc w:val="both"/>
+        <w:rPr>
+          <w:rFonts w:ascii="Ebrima" w:hAnsi="Ebrima"/>
+          <w:b/>
+          <w:smallCaps/>
+          <w:sz w:val="24"/>
+          <w:szCs w:val="24"/>
+        </w:rPr>
+      </w:pPr>
+    </w:p>
+    <w:p>
+      <w:pPr>
+        <w:pStyle w:val="Corpo"/>
+        <w:tabs>
+          <w:tab w:val="left" w:pos="720"/>
+          <w:tab w:val="left" w:pos="1440"/>
+          <w:tab w:val="left" w:pos="2160"/>
+          <w:tab w:val="left" w:pos="2880"/>
+          <w:tab w:val="left" w:pos="3600"/>
+          <w:tab w:val="left" w:pos="4320"/>
+          <w:tab w:val="left" w:pos="5040"/>
+          <w:tab w:val="left" w:pos="5760"/>
+          <w:tab w:val="left" w:pos="6480"/>
+          <w:tab w:val="left" w:pos="7200"/>
+          <w:tab w:val="left" w:pos="7920"/>
+          <w:tab w:val="left" w:pos="8640"/>
+        </w:tabs>
+        <w:jc w:val="both"/>
+        <w:rPr>
+          <w:rFonts w:ascii="Ebrima" w:hAnsi="Ebrima"/>
+          <w:sz w:val="24"/>
+          <w:szCs w:val="24"/>
+        </w:rPr>
+      </w:pPr>
+      <w:r>
+        <w:rPr>
+          <w:rFonts w:ascii="Ebrima" w:hAnsi="Ebrima"/>
+          <w:b/>
+          <w:smallCaps/>
+          <w:sz w:val="24"/>
+          <w:szCs w:val="24"/>
+        </w:rPr>
+        <w:t>Reajuste</w:t>
+      </w:r>
+      <w:r>
+        <w:rPr>
+          <w:rFonts w:ascii="Ebrima" w:hAnsi="Ebrima"/>
+          <w:smallCaps/>
+          <w:sz w:val="24"/>
+          <w:szCs w:val="24"/>
+        </w:rPr>
+        <w:t xml:space="preserve">: </w:t>
+      </w:r>
+      <w:r>
+        <w:rPr>
+          <w:rFonts w:ascii="Ebrima" w:hAnsi="Ebrima"/>
+          <w:sz w:val="24"/>
+          <w:szCs w:val="24"/>
+        </w:rPr>
+        <w:t xml:space="preserve">Os valores apresentados são válidos pelo período de </w:t>
+      </w:r>
+      <w:r>
+        <w:rPr>
+          <w:rFonts w:ascii="Ebrima" w:hAnsi="Ebrima"/>
+          <w:sz w:val="24"/>
+          <w:szCs w:val="24"/>
+        </w:rPr>
+        <w:t>12</w:t>
+      </w:r>
+      <w:r>
+        <w:rPr>
+          <w:rFonts w:ascii="Ebrima" w:hAnsi="Ebrima"/>
+          <w:sz w:val="24"/>
+          <w:szCs w:val="24"/>
+        </w:rPr>
+        <w:t xml:space="preserve"> meses a contar da data de aprovação da proposta</w:t>
+      </w:r>
+      <w:r>
+        <w:rPr>
+          <w:rFonts w:ascii="Ebrima" w:hAnsi="Ebrima"/>
+          <w:sz w:val="24"/>
+          <w:szCs w:val="24"/>
+        </w:rPr>
+        <w:t>. A</w:t>
+      </w:r>
+      <w:r>
+        <w:rPr>
+          <w:rFonts w:ascii="Ebrima" w:hAnsi="Ebrima"/>
+          <w:sz w:val="24"/>
+          <w:szCs w:val="24"/>
+        </w:rPr>
+        <w:t xml:space="preserve">pós este período </w:t>
+      </w:r>
+      <w:r>
+        <w:rPr>
+          <w:rFonts w:ascii="Ebrima" w:hAnsi="Ebrima"/>
+          <w:sz w:val="24"/>
+          <w:szCs w:val="24"/>
+        </w:rPr>
+        <w:t xml:space="preserve">o valor será reajustado </w:t>
+      </w:r>
+      <w:r>
+        <w:rPr>
+          <w:rFonts w:ascii="Ebrima" w:hAnsi="Ebrima"/>
+          <w:sz w:val="24"/>
+          <w:szCs w:val="24"/>
+        </w:rPr>
+        <w:t xml:space="preserve">anualmente </w:t>
+      </w:r>
+      <w:r>
+        <w:rPr>
+          <w:rFonts w:ascii="Ebrima" w:hAnsi="Ebrima"/>
+          <w:sz w:val="24"/>
+          <w:szCs w:val="24"/>
+        </w:rPr>
+        <w:t>de acordo com o valor atualizado da hora técnica (indexado ao salário-mínimo) ou subsidiariamente pelo INCC</w:t>
+      </w:r>
+      <w:r>
+        <w:rPr>
+          <w:rFonts w:ascii="Ebrima" w:hAnsi="Ebrima"/>
+          <w:sz w:val="24"/>
+          <w:szCs w:val="24"/>
+        </w:rPr>
+        <w:t>.</w:t>
+      </w:r>
+    </w:p>
+    <w:p>
+      <w:pPr>
+        <w:pStyle w:val="Corpo"/>
+        <w:tabs>
+          <w:tab w:val="left" w:pos="720"/>
+          <w:tab w:val="left" w:pos="1440"/>
+          <w:tab w:val="left" w:pos="2160"/>
+          <w:tab w:val="left" w:pos="2880"/>
+          <w:tab w:val="left" w:pos="3600"/>
+          <w:tab w:val="left" w:pos="4320"/>
+          <w:tab w:val="left" w:pos="5040"/>
+          <w:tab w:val="left" w:pos="5760"/>
+          <w:tab w:val="left" w:pos="6480"/>
+          <w:tab w:val="left" w:pos="7200"/>
+          <w:tab w:val="left" w:pos="7920"/>
+          <w:tab w:val="left" w:pos="8640"/>
+        </w:tabs>
+        <w:jc w:val="both"/>
+        <w:rPr>
+          <w:rFonts w:ascii="Ebrima" w:hAnsi="Ebrima"/>
+          <w:sz w:val="24"/>
+          <w:szCs w:val="24"/>
+        </w:rPr>
+      </w:pPr>
+    </w:p>
+    <w:p>
+      <w:pPr>
+        <w:pStyle w:val="Corpo"/>
+        <w:tabs>
+          <w:tab w:val="left" w:pos="720"/>
+          <w:tab w:val="left" w:pos="1440"/>
+          <w:tab w:val="left" w:pos="2160"/>
+          <w:tab w:val="left" w:pos="2880"/>
+          <w:tab w:val="left" w:pos="3600"/>
+          <w:tab w:val="left" w:pos="4320"/>
+          <w:tab w:val="left" w:pos="5040"/>
+          <w:tab w:val="left" w:pos="5760"/>
+          <w:tab w:val="left" w:pos="6480"/>
+          <w:tab w:val="left" w:pos="7200"/>
+          <w:tab w:val="left" w:pos="7920"/>
+          <w:tab w:val="left" w:pos="8640"/>
+        </w:tabs>
+        <w:jc w:val="both"/>
+        <w:rPr>
+          <w:rFonts w:ascii="Ebrima" w:hAnsi="Ebrima"/>
+          <w:b/>
+          <w:bCs/>
+          <w:smallCaps/>
+          <w:sz w:val="24"/>
+          <w:szCs w:val="24"/>
+        </w:rPr>
+      </w:pPr>
+      <w:r>
+        <w:rPr>
+          <w:rFonts w:ascii="Ebrima" w:hAnsi="Ebrima"/>
+          <w:b/>
+          <w:bCs/>
+          <w:smallCaps/>
+          <w:sz w:val="24"/>
+          <w:szCs w:val="24"/>
+        </w:rPr>
+        <w:t>Condições:</w:t>
+      </w:r>
+      <w:r>
+        <w:rPr>
+          <w:rFonts w:ascii="Ebrima" w:hAnsi="Ebrima"/>
+          <w:b/>
+          <w:bCs/>
+          <w:smallCaps/>
+          <w:sz w:val="24"/>
+          <w:szCs w:val="24"/>
+        </w:rPr>
+        <w:tab/>
+      </w:r>
+      <w:r>
+        <w:rPr>
+          <w:rFonts w:ascii="Ebrima" w:hAnsi="Ebrima"/>
+          <w:b/>
+          <w:bCs/>
+          <w:smallCaps/>
+          <w:sz w:val="24"/>
+          <w:szCs w:val="24"/>
+        </w:rPr>
+        <w:tab/>
+      </w:r>
+      <w:r>
+        <w:rPr>
+          <w:rFonts w:ascii="Ebrima" w:hAnsi="Ebrima"/>
+          <w:b/>
+          <w:bCs/>
+          <w:smallCaps/>
+          <w:sz w:val="24"/>
+          <w:szCs w:val="24"/>
+        </w:rPr>
+        <w:tab/>
+      </w:r>
+      <w:r>
+        <w:rPr>
+          <w:rFonts w:ascii="Ebrima" w:hAnsi="Ebrima"/>
+          <w:b/>
+          <w:bCs/>
+          <w:smallCaps/>
+          <w:sz w:val="24"/>
+          <w:szCs w:val="24"/>
+        </w:rPr>
+        <w:tab/>
+      </w:r>
+      <w:r>
+        <w:rPr>
+          <w:rFonts w:ascii="Ebrima" w:hAnsi="Ebrima"/>
+          <w:b/>
+          <w:bCs/>
+          <w:smallCaps/>
+          <w:sz w:val="24"/>
+          <w:szCs w:val="24"/>
+        </w:rPr>
+        <w:tab/>
+      </w:r>
+      <w:r>
+        <w:rPr>
+          <w:rFonts w:ascii="Ebrima" w:hAnsi="Ebrima"/>
+          <w:b/>
+          <w:bCs/>
+          <w:smallCaps/>
+          <w:sz w:val="24"/>
+          <w:szCs w:val="24"/>
+        </w:rPr>
+        <w:tab/>
+      </w:r>
+      <w:r>
+        <w:rPr>
+          <w:rFonts w:ascii="Ebrima" w:hAnsi="Ebrima"/>
+          <w:b/>
+          <w:bCs/>
+          <w:smallCaps/>
+          <w:sz w:val="24"/>
+          <w:szCs w:val="24"/>
+        </w:rPr>
+        <w:tab/>
+      </w:r>
+      <w:r>
+        <w:rPr>
+          <w:rFonts w:ascii="Ebrima" w:hAnsi="Ebrima"/>
+          <w:b/>
+          <w:bCs/>
+          <w:smallCaps/>
+          <w:sz w:val="24"/>
+          <w:szCs w:val="24"/>
+        </w:rPr>
+        <w:tab/>
+      </w:r>
+    </w:p>
+    <w:p>
+      <w:pPr>
+        <w:pStyle w:val="Corpo"/>
+        <w:tabs>
+          <w:tab w:val="left" w:pos="720"/>
+          <w:tab w:val="left" w:pos="1440"/>
+          <w:tab w:val="left" w:pos="2160"/>
+          <w:tab w:val="left" w:pos="2880"/>
+          <w:tab w:val="left" w:pos="3600"/>
+          <w:tab w:val="left" w:pos="4320"/>
+          <w:tab w:val="left" w:pos="5040"/>
+          <w:tab w:val="left" w:pos="5760"/>
+          <w:tab w:val="left" w:pos="6480"/>
+          <w:tab w:val="left" w:pos="7200"/>
+          <w:tab w:val="left" w:pos="7920"/>
+          <w:tab w:val="left" w:pos="8640"/>
+        </w:tabs>
+        <w:jc w:val="both"/>
+        <w:rPr>
+          <w:rFonts w:ascii="Ebrima" w:hAnsi="Ebrima"/>
+          <w:sz w:val="24"/>
+          <w:szCs w:val="24"/>
+        </w:rPr>
+      </w:pPr>
+      <w:r>
+        <w:rPr>
+          <w:rFonts w:ascii="Ebrima" w:hAnsi="Ebrima"/>
+          <w:sz w:val="24"/>
+          <w:szCs w:val="24"/>
+        </w:rPr>
+        <w:t>a) o pagamento dos serviços não está condicionado à emissão de alvarás, certidões ou licenças pelos órgãos licenciadores;</w:t>
+      </w:r>
+      <w:r>
+        <w:rPr>
+          <w:rFonts w:ascii="Ebrima" w:hAnsi="Ebrima"/>
+          <w:sz w:val="24"/>
+          <w:szCs w:val="24"/>
+        </w:rPr>
+        <w:tab/>
+      </w:r>
+      <w:r>
+        <w:rPr>
+          <w:rFonts w:ascii="Ebrima" w:hAnsi="Ebrima"/>
+          <w:sz w:val="24"/>
+          <w:szCs w:val="24"/>
+        </w:rPr>
+        <w:tab/>
+      </w:r>
+      <w:r>
+        <w:rPr>
+          <w:rFonts w:ascii="Ebrima" w:hAnsi="Ebrima"/>
+          <w:sz w:val="24"/>
+          <w:szCs w:val="24"/>
+        </w:rPr>
+        <w:tab/>
+      </w:r>
+      <w:r>
+        <w:rPr>
+          <w:rFonts w:ascii="Ebrima" w:hAnsi="Ebrima"/>
+          <w:sz w:val="24"/>
+          <w:szCs w:val="24"/>
+        </w:rPr>
+        <w:tab/>
+      </w:r>
+      <w:r>
+        <w:rPr>
+          <w:rFonts w:ascii="Ebrima" w:hAnsi="Ebrima"/>
+          <w:sz w:val="24"/>
+          <w:szCs w:val="24"/>
+        </w:rPr>
+        <w:tab/>
+      </w:r>
+      <w:r>
+        <w:rPr>
+          <w:rFonts w:ascii="Ebrima" w:hAnsi="Ebrima"/>
+          <w:sz w:val="24"/>
+          <w:szCs w:val="24"/>
+        </w:rPr>
+        <w:tab/>
+      </w:r>
+      <w:r>
+        <w:rPr>
+          <w:rFonts w:ascii="Ebrima" w:hAnsi="Ebrima"/>
+          <w:sz w:val="24"/>
+          <w:szCs w:val="24"/>
+        </w:rPr>
+        <w:tab/>
+      </w:r>
+    </w:p>
+    <w:p>
+      <w:pPr>
+        <w:pStyle w:val="Corpo"/>
+        <w:tabs>
+          <w:tab w:val="left" w:pos="720"/>
+          <w:tab w:val="left" w:pos="1440"/>
+          <w:tab w:val="left" w:pos="2160"/>
+          <w:tab w:val="left" w:pos="2880"/>
+          <w:tab w:val="left" w:pos="3600"/>
+          <w:tab w:val="left" w:pos="4320"/>
+          <w:tab w:val="left" w:pos="5040"/>
+          <w:tab w:val="left" w:pos="5760"/>
+          <w:tab w:val="left" w:pos="6480"/>
+          <w:tab w:val="left" w:pos="7200"/>
+          <w:tab w:val="left" w:pos="7920"/>
+          <w:tab w:val="left" w:pos="8640"/>
+        </w:tabs>
+        <w:jc w:val="both"/>
+        <w:rPr>
+          <w:rFonts w:ascii="Ebrima" w:hAnsi="Ebrima"/>
+          <w:sz w:val="24"/>
+          <w:szCs w:val="24"/>
+        </w:rPr>
+      </w:pPr>
+      <w:r>
+        <w:rPr>
+          <w:rFonts w:ascii="Ebrima" w:hAnsi="Ebrima"/>
+          <w:sz w:val="24"/>
+          <w:szCs w:val="24"/>
+        </w:rPr>
+        <w:t xml:space="preserve">b) a </w:t>
+      </w:r>
+      <w:r>
+        <w:rPr>
+          <w:rFonts w:ascii="Ebrima" w:hAnsi="Ebrima"/>
+          <w:sz w:val="24"/>
+          <w:szCs w:val="24"/>
+        </w:rPr>
+        <w:t>CONTRATANTE</w:t>
+      </w:r>
+      <w:r>
+        <w:rPr>
+          <w:rFonts w:ascii="Ebrima" w:hAnsi="Ebrima"/>
+          <w:sz w:val="24"/>
+          <w:szCs w:val="24"/>
+        </w:rPr>
+        <w:t xml:space="preserve"> deve fornecer dados, informações</w:t>
+      </w:r>
+      <w:r>
+        <w:rPr>
+          <w:rFonts w:ascii="Ebrima" w:hAnsi="Ebrima"/>
+          <w:sz w:val="24"/>
+          <w:szCs w:val="24"/>
+        </w:rPr>
+        <w:t>, fotografias</w:t>
+      </w:r>
+      <w:r>
+        <w:rPr>
+          <w:rFonts w:ascii="Ebrima" w:hAnsi="Ebrima"/>
+          <w:sz w:val="24"/>
+          <w:szCs w:val="24"/>
+        </w:rPr>
+        <w:t xml:space="preserve"> e documentos necessários à execução dos serviços contratados</w:t>
+      </w:r>
+      <w:r>
+        <w:rPr>
+          <w:rFonts w:ascii="Ebrima" w:hAnsi="Ebrima"/>
+          <w:sz w:val="24"/>
+          <w:szCs w:val="24"/>
+        </w:rPr>
+        <w:t>;</w:t>
+      </w:r>
+      <w:r>
+        <w:rPr>
+          <w:rFonts w:ascii="Ebrima" w:hAnsi="Ebrima"/>
+          <w:sz w:val="24"/>
+          <w:szCs w:val="24"/>
+        </w:rPr>
+        <w:tab/>
+      </w:r>
+      <w:r>
+        <w:rPr>
+          <w:rFonts w:ascii="Ebrima" w:hAnsi="Ebrima"/>
+          <w:sz w:val="24"/>
+          <w:szCs w:val="24"/>
+        </w:rPr>
+        <w:tab/>
+      </w:r>
+    </w:p>
+    <w:p>
+      <w:pPr>
+        <w:pStyle w:val="Corpo"/>
+        <w:tabs>
+          <w:tab w:val="left" w:pos="720"/>
+          <w:tab w:val="left" w:pos="1440"/>
+          <w:tab w:val="left" w:pos="2160"/>
+          <w:tab w:val="left" w:pos="2880"/>
+          <w:tab w:val="left" w:pos="3600"/>
+          <w:tab w:val="left" w:pos="4320"/>
+          <w:tab w:val="left" w:pos="5040"/>
+          <w:tab w:val="left" w:pos="5760"/>
+          <w:tab w:val="left" w:pos="6480"/>
+          <w:tab w:val="left" w:pos="7200"/>
+          <w:tab w:val="left" w:pos="7920"/>
+          <w:tab w:val="left" w:pos="8640"/>
+        </w:tabs>
+        <w:jc w:val="both"/>
+        <w:rPr>
+          <w:rFonts w:ascii="Ebrima" w:hAnsi="Ebrima"/>
+          <w:sz w:val="24"/>
+          <w:szCs w:val="24"/>
+        </w:rPr>
+      </w:pPr>
+      <w:r>
+        <w:rPr>
+          <w:rFonts w:ascii="Ebrima" w:hAnsi="Ebrima"/>
+          <w:sz w:val="24"/>
+          <w:szCs w:val="24"/>
+        </w:rPr>
+        <w:t xml:space="preserve">c) fica a cargo da contratante o pagamento </w:t>
+      </w:r>
+      <w:r>
+        <w:rPr>
+          <w:rFonts w:ascii="Ebrima" w:hAnsi="Ebrima"/>
+          <w:sz w:val="24"/>
+          <w:szCs w:val="24"/>
+        </w:rPr>
+        <w:t>da</w:t>
+      </w:r>
+      <w:r>
+        <w:rPr>
+          <w:rFonts w:ascii="Ebrima" w:hAnsi="Ebrima"/>
+          <w:sz w:val="24"/>
+          <w:szCs w:val="24"/>
+        </w:rPr>
+        <w:t>s</w:t>
+      </w:r>
+      <w:r>
+        <w:rPr>
+          <w:rFonts w:ascii="Ebrima" w:hAnsi="Ebrima"/>
+          <w:sz w:val="24"/>
+          <w:szCs w:val="24"/>
+        </w:rPr>
+        <w:t xml:space="preserve"> </w:t>
+      </w:r>
+      <w:r>
+        <w:rPr>
+          <w:rFonts w:ascii="Ebrima" w:hAnsi="Ebrima"/>
+          <w:sz w:val="24"/>
+          <w:szCs w:val="24"/>
+        </w:rPr>
+        <w:t>taxa</w:t>
+      </w:r>
+      <w:r>
+        <w:rPr>
+          <w:rFonts w:ascii="Ebrima" w:hAnsi="Ebrima"/>
+          <w:sz w:val="24"/>
+          <w:szCs w:val="24"/>
+        </w:rPr>
+        <w:t>s</w:t>
+      </w:r>
+      <w:r>
+        <w:rPr>
+          <w:rFonts w:ascii="Ebrima" w:hAnsi="Ebrima"/>
+          <w:sz w:val="24"/>
+          <w:szCs w:val="24"/>
+        </w:rPr>
+        <w:t xml:space="preserve"> de análise do</w:t>
+      </w:r>
+      <w:r>
+        <w:rPr>
+          <w:rFonts w:ascii="Ebrima" w:hAnsi="Ebrima"/>
+          <w:sz w:val="24"/>
+          <w:szCs w:val="24"/>
+        </w:rPr>
+        <w:t>s processos e do</w:t>
+      </w:r>
+      <w:r>
+        <w:rPr>
+          <w:rFonts w:ascii="Ebrima" w:hAnsi="Ebrima"/>
+          <w:sz w:val="24"/>
+          <w:szCs w:val="24"/>
+        </w:rPr>
+        <w:t xml:space="preserve"> projeto/relatório.</w:t>
+      </w:r>
+      <w:r>
+        <w:rPr>
+          <w:rFonts w:ascii="Ebrima" w:hAnsi="Ebrima"/>
+          <w:sz w:val="24"/>
+          <w:szCs w:val="24"/>
+        </w:rPr>
+        <w:tab/>
+      </w:r>
+      <w:r>
+        <w:rPr>
+          <w:rFonts w:ascii="Ebrima" w:hAnsi="Ebrima"/>
+          <w:sz w:val="24"/>
+          <w:szCs w:val="24"/>
+        </w:rPr>
+        <w:tab/>
+      </w:r>
+    </w:p>
+    <w:p>
+      <w:pPr>
+        <w:pStyle w:val="Corpo"/>
+        <w:tabs>
+          <w:tab w:val="left" w:pos="720"/>
+          <w:tab w:val="left" w:pos="1440"/>
+          <w:tab w:val="left" w:pos="2160"/>
+          <w:tab w:val="left" w:pos="2880"/>
+          <w:tab w:val="left" w:pos="3600"/>
+          <w:tab w:val="left" w:pos="4320"/>
+          <w:tab w:val="left" w:pos="5040"/>
+          <w:tab w:val="left" w:pos="5760"/>
+          <w:tab w:val="left" w:pos="6480"/>
+          <w:tab w:val="left" w:pos="7200"/>
+          <w:tab w:val="left" w:pos="7920"/>
+          <w:tab w:val="left" w:pos="8640"/>
+        </w:tabs>
+        <w:jc w:val="both"/>
+        <w:rPr>
+          <w:rFonts w:ascii="Ebrima" w:hAnsi="Ebrima"/>
+          <w:sz w:val="24"/>
+          <w:szCs w:val="24"/>
+        </w:rPr>
+      </w:pPr>
+      <w:r>
+        <w:rPr>
+          <w:rFonts w:ascii="Ebrima" w:hAnsi="Ebrima"/>
+          <w:sz w:val="24"/>
+          <w:szCs w:val="24"/>
+        </w:rPr>
+        <w:tab/>
+      </w:r>
+      <w:r>
+        <w:rPr>
+          <w:rFonts w:ascii="Ebrima" w:hAnsi="Ebrima"/>
+          <w:sz w:val="24"/>
+          <w:szCs w:val="24"/>
+        </w:rPr>
+        <w:tab/>
+      </w:r>
+      <w:r>
+        <w:rPr>
+          <w:rFonts w:ascii="Ebrima" w:hAnsi="Ebrima"/>
+          <w:sz w:val="24"/>
+          <w:szCs w:val="24"/>
+        </w:rPr>
+        <w:tab/>
+      </w:r>
+      <w:r>
+        <w:rPr>
+          <w:rFonts w:ascii="Ebrima" w:hAnsi="Ebrima"/>
+          <w:sz w:val="24"/>
+          <w:szCs w:val="24"/>
+        </w:rPr>
+        <w:tab/>
+      </w:r>
+      <w:r>
+        <w:rPr>
+          <w:rFonts w:ascii="Ebrima" w:hAnsi="Ebrima"/>
+          <w:sz w:val="24"/>
+          <w:szCs w:val="24"/>
+        </w:rPr>
+        <w:tab/>
+      </w:r>
+      <w:r>
+        <w:rPr>
+          <w:rFonts w:ascii="Ebrima" w:hAnsi="Ebrima"/>
+          <w:sz w:val="24"/>
+          <w:szCs w:val="24"/>
+        </w:rPr>
+        <w:tab/>
+      </w:r>
+    </w:p>
+    <w:p>
+      <w:pPr>
+        <w:pStyle w:val="Corpo"/>
+        <w:tabs>
+          <w:tab w:val="left" w:pos="0"/>
+          <w:tab w:val="left" w:pos="1440"/>
+          <w:tab w:val="left" w:pos="2160"/>
+          <w:tab w:val="left" w:pos="2880"/>
+          <w:tab w:val="left" w:pos="3600"/>
+          <w:tab w:val="left" w:pos="4320"/>
+          <w:tab w:val="left" w:pos="5040"/>
+          <w:tab w:val="left" w:pos="5760"/>
+          <w:tab w:val="left" w:pos="6480"/>
+          <w:tab w:val="left" w:pos="7200"/>
+          <w:tab w:val="left" w:pos="7920"/>
+          <w:tab w:val="left" w:pos="8640"/>
+        </w:tabs>
+        <w:jc w:val="both"/>
+        <w:rPr>
+          <w:rFonts w:ascii="Ebrima" w:hAnsi="Ebrima"/>
+          <w:b/>
+          <w:smallCaps/>
+          <w:sz w:val="24"/>
+          <w:szCs w:val="24"/>
+        </w:rPr>
+      </w:pPr>
+      <w:r>
+        <w:rPr>
+          <w:rFonts w:ascii="Ebrima" w:hAnsi="Ebrima"/>
+          <w:b/>
+          <w:smallCaps/>
+          <w:sz w:val="24"/>
+          <w:szCs w:val="24"/>
+        </w:rPr>
+        <w:t xml:space="preserve">Pagamento: </w:t>
+      </w:r>
+      <w:r>
+        <w:rPr>
+          <w:rFonts w:ascii="Ebrima" w:hAnsi="Ebrima"/>
+          <w:sz w:val="24"/>
+          <w:szCs w:val="24"/>
+        </w:rPr>
+        <w:t xml:space="preserve"> </w:t>
+      </w:r>
+      <w:r>
+        <w:rPr>
+          <w:rFonts w:ascii="Ebrima" w:hAnsi="Ebrima"/>
+          <w:sz w:val="24"/>
+          <w:szCs w:val="24"/>
+        </w:rPr>
+        <w:t xml:space="preserve">Em até </w:t>
+      </w:r>
+      <w:r>
+        <w:rPr>
+          <w:rFonts w:ascii="Ebrima" w:hAnsi="Ebrima"/>
+          <w:sz w:val="24"/>
+          <w:szCs w:val="24"/>
+        </w:rPr>
+        <w:t>3</w:t>
+      </w:r>
+      <w:r>
+        <w:rPr>
+          <w:rFonts w:ascii="Ebrima" w:hAnsi="Ebrima"/>
+          <w:sz w:val="24"/>
+          <w:szCs w:val="24"/>
+        </w:rPr>
+        <w:t xml:space="preserve">0 dias </w:t>
+      </w:r>
+      <w:r>
+        <w:rPr>
+          <w:rFonts w:ascii="Ebrima" w:hAnsi="Ebrima"/>
+          <w:sz w:val="24"/>
+          <w:szCs w:val="24"/>
+        </w:rPr>
+        <w:t>da conclusão de cada uma das etapas de trabalho</w:t>
+      </w:r>
+      <w:r>
+        <w:rPr>
+          <w:rFonts w:ascii="Ebrima" w:hAnsi="Ebrima"/>
+          <w:sz w:val="24"/>
+          <w:szCs w:val="24"/>
+        </w:rPr>
+        <w:t>, contados da emissão da respectiva nota fiscal</w:t>
+      </w:r>
+      <w:r>
+        <w:rPr>
+          <w:rFonts w:ascii="Ebrima" w:hAnsi="Ebrima"/>
+          <w:sz w:val="24"/>
+          <w:szCs w:val="24"/>
+        </w:rPr>
+        <w:t>.</w:t>
+      </w:r>
+    </w:p>
+    <w:p>
+      <w:pPr>
+        <w:pStyle w:val="Corpo"/>
+        <w:tabs>
+          <w:tab w:val="left" w:pos="720"/>
+          <w:tab w:val="left" w:pos="1440"/>
+          <w:tab w:val="left" w:pos="2160"/>
+          <w:tab w:val="left" w:pos="2880"/>
+          <w:tab w:val="left" w:pos="3600"/>
+          <w:tab w:val="left" w:pos="4320"/>
+          <w:tab w:val="left" w:pos="5040"/>
+          <w:tab w:val="left" w:pos="5760"/>
+          <w:tab w:val="left" w:pos="6480"/>
+          <w:tab w:val="left" w:pos="7200"/>
+          <w:tab w:val="left" w:pos="7920"/>
+          <w:tab w:val="left" w:pos="8640"/>
+        </w:tabs>
+        <w:jc w:val="both"/>
+        <w:rPr>
+          <w:rFonts w:ascii="Ebrima" w:hAnsi="Ebrima"/>
+          <w:sz w:val="16"/>
+          <w:szCs w:val="16"/>
+        </w:rPr>
+      </w:pPr>
+    </w:p>
+    <w:p>
+      <w:pPr>
+        <w:pStyle w:val="Corpo"/>
+        <w:tabs>
+          <w:tab w:val="left" w:pos="720"/>
+          <w:tab w:val="left" w:pos="1440"/>
+          <w:tab w:val="left" w:pos="2160"/>
+          <w:tab w:val="left" w:pos="2880"/>
+          <w:tab w:val="left" w:pos="3600"/>
+          <w:tab w:val="left" w:pos="4320"/>
+          <w:tab w:val="left" w:pos="5040"/>
+          <w:tab w:val="left" w:pos="5760"/>
+          <w:tab w:val="left" w:pos="6480"/>
+          <w:tab w:val="left" w:pos="7200"/>
+          <w:tab w:val="left" w:pos="7920"/>
+          <w:tab w:val="left" w:pos="8640"/>
+        </w:tabs>
+        <w:jc w:val="both"/>
+        <w:rPr>
+          <w:rFonts w:ascii="Ebrima" w:hAnsi="Ebrima"/>
+          <w:sz w:val="24"/>
+          <w:szCs w:val="24"/>
+        </w:rPr>
+      </w:pPr>
+    </w:p>
+    <w:p>
+      <w:pPr>
+        <w:pStyle w:val="Corpo"/>
+        <w:tabs>
+          <w:tab w:val="left" w:pos="720"/>
+          <w:tab w:val="left" w:pos="1440"/>
+          <w:tab w:val="left" w:pos="2160"/>
+          <w:tab w:val="left" w:pos="2880"/>
+          <w:tab w:val="left" w:pos="3600"/>
+          <w:tab w:val="left" w:pos="4320"/>
+          <w:tab w:val="left" w:pos="5040"/>
+          <w:tab w:val="left" w:pos="5760"/>
+          <w:tab w:val="left" w:pos="6480"/>
+          <w:tab w:val="left" w:pos="7200"/>
+          <w:tab w:val="left" w:pos="7920"/>
+          <w:tab w:val="left" w:pos="8640"/>
+        </w:tabs>
+        <w:jc w:val="both"/>
+        <w:rPr>
+          <w:rFonts w:ascii="Ebrima" w:hAnsi="Ebrima"/>
+          <w:sz w:val="24"/>
+          <w:szCs w:val="24"/>
+        </w:rPr>
+      </w:pPr>
+      <w:r>
+        <w:rPr>
+          <w:rFonts w:ascii="Ebrima" w:hAnsi="Ebrima"/>
+          <w:sz w:val="24"/>
+          <w:szCs w:val="24"/>
+        </w:rPr>
+        <w:t>Colocando-nos à Vosso dispor para os esclarecimentos que se fizerem necessários, despedimo-nos,</w:t>
+      </w:r>
+    </w:p>
+    <w:p>
+      <w:pPr>
+        <w:pStyle w:val="Corpo"/>
+        <w:tabs>
+          <w:tab w:val="left" w:pos="720"/>
+          <w:tab w:val="left" w:pos="1440"/>
+          <w:tab w:val="left" w:pos="2160"/>
+          <w:tab w:val="left" w:pos="2880"/>
+          <w:tab w:val="left" w:pos="3600"/>
+          <w:tab w:val="left" w:pos="4320"/>
+          <w:tab w:val="left" w:pos="5040"/>
+          <w:tab w:val="left" w:pos="5760"/>
+          <w:tab w:val="left" w:pos="6480"/>
+          <w:tab w:val="left" w:pos="7200"/>
+          <w:tab w:val="left" w:pos="7920"/>
+          <w:tab w:val="left" w:pos="8640"/>
+        </w:tabs>
+        <w:jc w:val="both"/>
+        <w:rPr>
+          <w:rFonts w:ascii="Ebrima" w:hAnsi="Ebrima"/>
+          <w:smallCaps/>
+          <w:sz w:val="24"/>
+          <w:szCs w:val="24"/>
+        </w:rPr>
+      </w:pPr>
+    </w:p>
+    <w:p>
+      <w:pPr>
+        <w:pStyle w:val="Corpo"/>
+        <w:tabs>
+          <w:tab w:val="left" w:pos="720"/>
+          <w:tab w:val="left" w:pos="1440"/>
+          <w:tab w:val="left" w:pos="2160"/>
+          <w:tab w:val="left" w:pos="2880"/>
+          <w:tab w:val="left" w:pos="3600"/>
+          <w:tab w:val="left" w:pos="4320"/>
+          <w:tab w:val="left" w:pos="5040"/>
+          <w:tab w:val="left" w:pos="5760"/>
+          <w:tab w:val="left" w:pos="6480"/>
+          <w:tab w:val="left" w:pos="7200"/>
+          <w:tab w:val="left" w:pos="7920"/>
+          <w:tab w:val="left" w:pos="8640"/>
+        </w:tabs>
+        <w:jc w:val="both"/>
+        <w:rPr>
+          <w:rFonts w:ascii="Ebrima" w:hAnsi="Ebrima"/>
+          <w:smallCaps/>
+          <w:sz w:val="24"/>
+          <w:szCs w:val="24"/>
+        </w:rPr>
+      </w:pPr>
+    </w:p>
+    <w:p>
+      <w:pPr>
+        <w:pStyle w:val="Corpo"/>
+        <w:tabs>
+          <w:tab w:val="left" w:pos="720"/>
+          <w:tab w:val="left" w:pos="1440"/>
+          <w:tab w:val="left" w:pos="2160"/>
+          <w:tab w:val="left" w:pos="2880"/>
+          <w:tab w:val="left" w:pos="3600"/>
+          <w:tab w:val="left" w:pos="4320"/>
+          <w:tab w:val="left" w:pos="5040"/>
+          <w:tab w:val="left" w:pos="5760"/>
+          <w:tab w:val="left" w:pos="6480"/>
+          <w:tab w:val="left" w:pos="7200"/>
+          <w:tab w:val="left" w:pos="7920"/>
+          <w:tab w:val="left" w:pos="8640"/>
+        </w:tabs>
+        <w:jc w:val="both"/>
+        <w:rPr>
+          <w:rFonts w:ascii="Ebrima" w:hAnsi="Ebrima"/>
+          <w:smallCaps/>
+          <w:sz w:val="24"/>
+          <w:szCs w:val="24"/>
+        </w:rPr>
+      </w:pPr>
+    </w:p>
+    <w:p>
+      <w:pPr>
+        <w:pStyle w:val="Corpo"/>
+        <w:tabs>
+          <w:tab w:val="left" w:pos="720"/>
+          <w:tab w:val="left" w:pos="1440"/>
+          <w:tab w:val="left" w:pos="2160"/>
+          <w:tab w:val="left" w:pos="2880"/>
+          <w:tab w:val="left" w:pos="3600"/>
+          <w:tab w:val="left" w:pos="4320"/>
+          <w:tab w:val="left" w:pos="5040"/>
+          <w:tab w:val="left" w:pos="5760"/>
+          <w:tab w:val="left" w:pos="6480"/>
+          <w:tab w:val="left" w:pos="7200"/>
+          <w:tab w:val="left" w:pos="7920"/>
+          <w:tab w:val="left" w:pos="8640"/>
+        </w:tabs>
+        <w:jc w:val="both"/>
+        <w:rPr>
+          <w:rFonts w:ascii="Ebrima" w:hAnsi="Ebrima"/>
+          <w:smallCaps/>
+          <w:sz w:val="24"/>
+          <w:szCs w:val="24"/>
+        </w:rPr>
+      </w:pPr>
+    </w:p>
+    <w:p>
+      <w:pPr>
+        <w:pStyle w:val="Corpo"/>
+        <w:tabs>
+          <w:tab w:val="left" w:pos="720"/>
+          <w:tab w:val="left" w:pos="1440"/>
+          <w:tab w:val="left" w:pos="2160"/>
+          <w:tab w:val="left" w:pos="2880"/>
+          <w:tab w:val="left" w:pos="3600"/>
+          <w:tab w:val="left" w:pos="4320"/>
+          <w:tab w:val="left" w:pos="5040"/>
+          <w:tab w:val="left" w:pos="5760"/>
+          <w:tab w:val="left" w:pos="6480"/>
+          <w:tab w:val="left" w:pos="7200"/>
+          <w:tab w:val="left" w:pos="7920"/>
+          <w:tab w:val="left" w:pos="8640"/>
+        </w:tabs>
+        <w:jc w:val="both"/>
+        <w:rPr>
+          <w:rFonts w:ascii="Ebrima" w:hAnsi="Ebrima"/>
+          <w:sz w:val="24"/>
+          <w:szCs w:val="24"/>
+        </w:rPr>
+      </w:pPr>
+      <w:r>
+        <w:rPr>
+          <w:rFonts w:ascii="Ebrima" w:hAnsi="Ebrima"/>
+          <w:smallCaps/>
+          <w:sz w:val="24"/>
+          <w:szCs w:val="24"/>
+        </w:rPr>
+        <w:t>Cordialmente</w:t>
+      </w:r>
+      <w:r>
+        <w:rPr>
+          <w:rFonts w:ascii="Ebrima" w:hAnsi="Ebrima"/>
+          <w:sz w:val="24"/>
+          <w:szCs w:val="24"/>
+        </w:rPr>
+        <w:t>,</w:t>
+      </w:r>
+    </w:p>
+    <w:p>
+      <w:pPr>
+        <w:pStyle w:val="Corpo"/>
+        <w:tabs>
+          <w:tab w:val="left" w:pos="720"/>
+          <w:tab w:val="left" w:pos="1440"/>
+          <w:tab w:val="left" w:pos="2160"/>
+          <w:tab w:val="left" w:pos="2880"/>
+          <w:tab w:val="left" w:pos="3600"/>
+          <w:tab w:val="left" w:pos="4320"/>
+          <w:tab w:val="left" w:pos="5040"/>
+          <w:tab w:val="left" w:pos="5760"/>
+          <w:tab w:val="left" w:pos="6480"/>
+          <w:tab w:val="left" w:pos="7200"/>
+          <w:tab w:val="left" w:pos="7920"/>
+          <w:tab w:val="left" w:pos="8640"/>
+        </w:tabs>
+        <w:jc w:val="both"/>
+        <w:rPr>
+          <w:rFonts w:ascii="Ebrima" w:hAnsi="Ebrima"/>
+          <w:b/>
+          <w:smallCaps/>
+          <w:sz w:val="24"/>
+          <w:szCs w:val="24"/>
+        </w:rPr>
+      </w:pPr>
+      <w:r>
+        <w:rPr>
+          <w:rFonts w:ascii="Ebrima" w:hAnsi="Ebrima"/>
+          <w:b/>
+          <w:smallCaps/>
+          <w:noProof/>
+          <w:sz w:val="24"/>
+          <w:szCs w:val="24"/>
+        </w:rPr>
+        <w:drawing>
+          <wp:inline distT="0" distB="0" distL="0" distR="0" wp14:anchorId="6CA5B6D3" wp14:editId="664CB6FB">
+            <wp:extent cx="869577" cy="430306"/>
+            <wp:effectExtent l="0" t="0" r="6985" b="8255"/>
+            <wp:docPr id="1" name="Imagem 1" descr="Desenho preto e branco&#10;&#10;Descrição gerada automaticamente com confiança média"/>
+            <wp:cNvGraphicFramePr>
+              <a:graphicFrameLocks xmlns:a="http://schemas.openxmlformats.org/drawingml/2006/main" noChangeAspect="1"/>
+            </wp:cNvGraphicFramePr>
+            <a:graphic xmlns:a="http://schemas.openxmlformats.org/drawingml/2006/main">
+              <a:graphicData uri="http://schemas.openxmlformats.org/drawingml/2006/picture">
+                <pic:pic xmlns:pic="http://schemas.openxmlformats.org/drawingml/2006/picture">
+                  <pic:nvPicPr>
+                    <pic:cNvPr id="1" name="Imagem 1" descr="Desenho preto e branco&#10;&#10;Descrição gerada automaticamente com confiança média"/>
+                    <pic:cNvPicPr/>
+                  </pic:nvPicPr>
+                  <pic:blipFill>
+                    <a:blip r:embed="rId8" cstate="print">
+                      <a:extLst>
+                        <a:ext uri="{28A0092B-C50C-407E-A947-70E740481C1C}">
+                          <a14:useLocalDpi xmlns:a14="http://schemas.microsoft.com/office/drawing/2010/main" val="0"/>
+                        </a:ext>
+                      </a:extLst>
+                    </a:blip>
+                    <a:stretch>
+                      <a:fillRect/>
+                    </a:stretch>
+                  </pic:blipFill>
+                  <pic:spPr>
+                    <a:xfrm>
+                      <a:off x="0" y="0"/>
+                      <a:ext cx="903493" cy="447089"/>
+                    </a:xfrm>
+                    <a:prstGeom prst="rect">
+                      <a:avLst/>
+                    </a:prstGeom>
+                  </pic:spPr>
+                </pic:pic>
+              </a:graphicData>
+            </a:graphic>
+          </wp:inline>
+        </w:drawing>
+      </w:r>
+    </w:p>
+    <w:p>
+      <w:pPr>
+        <w:pStyle w:val="Corpo"/>
+        <w:tabs>
+          <w:tab w:val="left" w:pos="720"/>
+          <w:tab w:val="left" w:pos="1440"/>
+          <w:tab w:val="left" w:pos="2160"/>
+          <w:tab w:val="left" w:pos="2880"/>
+          <w:tab w:val="left" w:pos="3600"/>
+          <w:tab w:val="left" w:pos="4320"/>
+          <w:tab w:val="left" w:pos="5040"/>
+          <w:tab w:val="left" w:pos="5760"/>
+          <w:tab w:val="left" w:pos="6480"/>
+          <w:tab w:val="left" w:pos="7200"/>
+          <w:tab w:val="left" w:pos="7920"/>
+          <w:tab w:val="left" w:pos="8640"/>
+        </w:tabs>
+        <w:jc w:val="both"/>
+        <w:rPr>
+          <w:rFonts w:ascii="Ebrima" w:hAnsi="Ebrima"/>
+          <w:b/>
+          <w:smallCaps/>
+          <w:sz w:val="24"/>
+          <w:szCs w:val="24"/>
+        </w:rPr>
+      </w:pPr>
+      <w:r>
+        <w:rPr>
+          <w:rFonts w:ascii="Ebrima" w:hAnsi="Ebrima"/>
+          <w:b/>
+          <w:smallCaps/>
+          <w:sz w:val="24"/>
+          <w:szCs w:val="24"/>
+        </w:rPr>
+        <w:t>André Nagalli</w:t>
+      </w:r>
+    </w:p>
+    <w:p>
+      <w:pPr>
+        <w:pStyle w:val="Corpo"/>
+        <w:tabs>
+          <w:tab w:val="left" w:pos="720"/>
+          <w:tab w:val="left" w:pos="1440"/>
+          <w:tab w:val="left" w:pos="2160"/>
+          <w:tab w:val="left" w:pos="2880"/>
+          <w:tab w:val="left" w:pos="3600"/>
+          <w:tab w:val="left" w:pos="4320"/>
+          <w:tab w:val="left" w:pos="5040"/>
+          <w:tab w:val="left" w:pos="5760"/>
+          <w:tab w:val="left" w:pos="6480"/>
+          <w:tab w:val="left" w:pos="7200"/>
+          <w:tab w:val="left" w:pos="7920"/>
+          <w:tab w:val="left" w:pos="8640"/>
+        </w:tabs>
+        <w:jc w:val="both"/>
+        <w:rPr>
+          <w:rFonts w:ascii="Ebrima" w:hAnsi="Ebrima"/>
+          <w:bCs/>
+          <w:smallCaps/>
+          <w:sz w:val="20"/>
+        </w:rPr>
+      </w:pPr>
+      <w:r>
+        <w:rPr>
+          <w:rFonts w:ascii="Ebrima" w:hAnsi="Ebrima"/>
+          <w:bCs/>
+          <w:smallCaps/>
+          <w:sz w:val="20"/>
+        </w:rPr>
+        <w:t>Eng. Civil CREA-PR 70</w:t>
+      </w:r>
+      <w:r>
+        <w:rPr>
+          <w:rFonts w:ascii="Ebrima" w:hAnsi="Ebrima"/>
+          <w:bCs/>
+          <w:smallCaps/>
+          <w:sz w:val="20"/>
+        </w:rPr>
+        <w:t>.</w:t>
+      </w:r>
+      <w:r>
+        <w:rPr>
+          <w:rFonts w:ascii="Ebrima" w:hAnsi="Ebrima"/>
+          <w:bCs/>
+          <w:smallCaps/>
+          <w:sz w:val="20"/>
+        </w:rPr>
+        <w:t>901/D, Advogado, OAB</w:t>
+      </w:r>
+      <w:r>
+        <w:rPr>
+          <w:rFonts w:ascii="Ebrima" w:hAnsi="Ebrima"/>
+          <w:bCs/>
+          <w:smallCaps/>
+          <w:sz w:val="20"/>
+        </w:rPr>
+        <w:t>/PR</w:t>
+      </w:r>
+      <w:r>
+        <w:rPr>
+          <w:rFonts w:ascii="Ebrima" w:hAnsi="Ebrima"/>
+          <w:bCs/>
+          <w:smallCaps/>
+          <w:sz w:val="20"/>
+        </w:rPr>
+        <w:t xml:space="preserve"> 87</w:t>
+      </w:r>
+      <w:r>
+        <w:rPr>
+          <w:rFonts w:ascii="Ebrima" w:hAnsi="Ebrima"/>
+          <w:bCs/>
+          <w:smallCaps/>
+          <w:sz w:val="20"/>
+        </w:rPr>
+        <w:t>.</w:t>
+      </w:r>
+      <w:r>
+        <w:rPr>
+          <w:rFonts w:ascii="Ebrima" w:hAnsi="Ebrima"/>
+          <w:bCs/>
+          <w:smallCaps/>
+          <w:sz w:val="20"/>
+        </w:rPr>
+        <w:t>212</w:t>
+      </w:r>
+    </w:p>
+    <w:p>
+      <w:pPr>
+        <w:pStyle w:val="Corpo"/>
+        <w:tabs>
+          <w:tab w:val="left" w:pos="720"/>
+          <w:tab w:val="left" w:pos="1440"/>
+          <w:tab w:val="left" w:pos="2160"/>
+          <w:tab w:val="left" w:pos="2880"/>
+          <w:tab w:val="left" w:pos="3600"/>
+          <w:tab w:val="left" w:pos="4320"/>
+          <w:tab w:val="left" w:pos="5040"/>
+          <w:tab w:val="left" w:pos="5760"/>
+          <w:tab w:val="left" w:pos="6480"/>
+          <w:tab w:val="left" w:pos="7200"/>
+          <w:tab w:val="left" w:pos="7920"/>
+          <w:tab w:val="left" w:pos="8640"/>
+        </w:tabs>
+        <w:jc w:val="both"/>
+        <w:rPr>
+          <w:rFonts w:ascii="Ebrima" w:hAnsi="Ebrima"/>
+          <w:sz w:val="20"/>
+        </w:rPr>
+      </w:pPr>
+      <w:r>
+        <w:rPr>
+          <w:rFonts w:ascii="Ebrima" w:hAnsi="Ebrima"/>
+          <w:bCs/>
+          <w:smallCaps/>
+          <w:sz w:val="20"/>
+        </w:rPr>
+        <w:t>Mestre em Eng. de Rec. Hídricos e Ambiental, Doutor em Geologia</w:t>
+      </w:r>
+    </w:p>
+    <w:sectPr>
+      <w:headerReference w:type="default" r:id="rId9"/>
+      <w:footerReference w:type="default" r:id="rId10"/>
+      <w:pgSz w:w="11906" w:h="16838"/>
+      <w:pgMar w:top="1843" w:right="1418" w:bottom="1560" w:left="1701" w:header="567" w:footer="981" w:gutter="0"/>
+      <w:cols w:space="708"/>
+      <w:docGrid w:linePitch="360"/>
+    </w:sectPr>
+  </w:body>
+</w:document>
 </file>
 
 <file path=word/endnotes.xml><?xml version="1.0" encoding="utf-8"?>

</xml_diff>

<commit_message>
fix: linha ART do DOCX de demolicao com 2 colunas e placeholder {engenheiroNome} no lugar do nome estatico
</commit_message>
<xml_diff>
--- a/src/lib/templates/proposta-demolicao/template.docx
+++ b/src/lib/templates/proposta-demolicao/template.docx
@@ -113,31 +113,7 @@
           <w:sz w:val="24"/>
           <w:szCs w:val="24"/>
         </w:rPr>
-        <w:t xml:space="preserve">Eng. </w:t>
-      </w:r>
-      <w:proofErr w:type="spellStart"/>
-      <w:r>
-        <w:rPr>
-          <w:rFonts w:ascii="Ebrima" w:hAnsi="Ebrima"/>
-          <w:b/>
-          <w:bCs/>
-          <w:smallCaps/>
-          <w:sz w:val="24"/>
-          <w:szCs w:val="24"/>
-        </w:rPr>
-        <w:t>Antonio</w:t>
-      </w:r>
-      <w:proofErr w:type="spellEnd"/>
-      <w:r>
-        <w:rPr>
-          <w:rFonts w:ascii="Ebrima" w:hAnsi="Ebrima"/>
-          <w:b/>
-          <w:bCs/>
-          <w:smallCaps/>
-          <w:sz w:val="24"/>
-          <w:szCs w:val="24"/>
-        </w:rPr>
-        <w:t xml:space="preserve"> M. Martins</w:t>
+        <w:t xml:space="preserve">{engenheiroNome}</w:t>
       </w:r>
     </w:p>
     <w:p>
@@ -1804,102 +1780,6 @@
                 <w:szCs w:val="20"/>
               </w:rPr>
               <w:t xml:space="preserve">inclusa</w:t>
-            </w:r>
-          </w:p>
-        </w:tc>
-        <w:tc>
-          <w:tcPr>
-            <w:tcW w:w="1563" w:type="dxa"/>
-            <w:tcBorders>
-              <w:top w:val="single" w:sz="4" w:space="0" w:color="auto"/>
-              <w:left w:val="single" w:sz="4" w:space="0" w:color="auto"/>
-              <w:bottom w:val="single" w:sz="4" w:space="0" w:color="auto"/>
-              <w:right w:val="single" w:sz="4" w:space="0" w:color="auto"/>
-            </w:tcBorders>
-            <w:vAlign w:val="center"/>
-            <w:hideMark/>
-          </w:tcPr>
-          <w:p>
-            <w:pPr>
-              <w:spacing w:line="256" w:lineRule="auto"/>
-              <w:jc w:val="center"/>
-              <w:rPr>
-                <w:rFonts w:ascii="Ebrima" w:hAnsi="Ebrima"/>
-                <w:sz w:val="20"/>
-                <w:szCs w:val="20"/>
-              </w:rPr>
-            </w:pPr>
-            <w:r>
-              <w:rPr>
-                <w:rFonts w:ascii="Ebrima" w:hAnsi="Ebrima"/>
-                <w:sz w:val="20"/>
-                <w:szCs w:val="20"/>
-              </w:rPr>
-              <w:t xml:space="preserve"/>
-            </w:r>
-          </w:p>
-        </w:tc>
-        <w:tc>
-          <w:tcPr>
-            <w:tcW w:w="1041" w:type="dxa"/>
-            <w:tcBorders>
-              <w:top w:val="single" w:sz="4" w:space="0" w:color="auto"/>
-              <w:left w:val="single" w:sz="4" w:space="0" w:color="auto"/>
-              <w:bottom w:val="single" w:sz="4" w:space="0" w:color="auto"/>
-              <w:right w:val="single" w:sz="4" w:space="0" w:color="auto"/>
-            </w:tcBorders>
-            <w:vAlign w:val="center"/>
-            <w:hideMark/>
-          </w:tcPr>
-          <w:p>
-            <w:pPr>
-              <w:spacing w:line="256" w:lineRule="auto"/>
-              <w:jc w:val="center"/>
-              <w:rPr>
-                <w:rFonts w:ascii="Ebrima" w:hAnsi="Ebrima"/>
-                <w:sz w:val="20"/>
-                <w:szCs w:val="20"/>
-              </w:rPr>
-            </w:pPr>
-            <w:r>
-              <w:rPr>
-                <w:rFonts w:ascii="Ebrima" w:hAnsi="Ebrima"/>
-                <w:sz w:val="20"/>
-                <w:szCs w:val="20"/>
-              </w:rPr>
-              <w:t xml:space="preserve"/>
-            </w:r>
-          </w:p>
-        </w:tc>
-        <w:tc>
-          <w:tcPr>
-            <w:tcW w:w="1166" w:type="dxa"/>
-            <w:tcBorders>
-              <w:top w:val="single" w:sz="4" w:space="0" w:color="auto"/>
-              <w:left w:val="single" w:sz="4" w:space="0" w:color="auto"/>
-              <w:bottom w:val="single" w:sz="4" w:space="0" w:color="auto"/>
-              <w:right w:val="single" w:sz="4" w:space="0" w:color="auto"/>
-            </w:tcBorders>
-            <w:vAlign w:val="center"/>
-            <w:hideMark/>
-          </w:tcPr>
-          <w:p>
-            <w:pPr>
-              <w:spacing w:line="256" w:lineRule="auto"/>
-              <w:jc w:val="center"/>
-              <w:rPr>
-                <w:rFonts w:ascii="Ebrima" w:hAnsi="Ebrima"/>
-                <w:sz w:val="20"/>
-                <w:szCs w:val="20"/>
-              </w:rPr>
-            </w:pPr>
-            <w:r>
-              <w:rPr>
-                <w:rFonts w:ascii="Ebrima" w:hAnsi="Ebrima"/>
-                <w:sz w:val="20"/>
-                <w:szCs w:val="20"/>
-              </w:rPr>
-              <w:t xml:space="preserve">incluso</w:t>
             </w:r>
           </w:p>
         </w:tc>

</xml_diff>

<commit_message>
fix: coluna S.T.* com quantidade de PGRCC/RGRCC, D.A.* fixo em 18% e tabela ajustada a largura da pagina A4 no DOCX de demolicao
</commit_message>
<xml_diff>
--- a/src/lib/templates/proposta-demolicao/template.docx
+++ b/src/lib/templates/proposta-demolicao/template.docx
@@ -810,7 +810,7 @@
     </w:p>
     <w:tbl>
       <w:tblPr>
-        <w:tblW w:w="12585" w:type="dxa"/>
+        <w:tblW w:w="8780" w:type="dxa"/>
         <w:tblInd w:w="-5" w:type="dxa"/>
         <w:tblLayout w:type="fixed"/>
         <w:tblCellMar>
@@ -821,15 +821,12 @@
       </w:tblPr>
       <w:tblGrid>
         <w:gridCol w:w="575"/>
-        <w:gridCol w:w="3531"/>
+        <w:gridCol w:w="3496"/>
         <w:gridCol w:w="709"/>
         <w:gridCol w:w="567"/>
         <w:gridCol w:w="709"/>
         <w:gridCol w:w="1306"/>
         <w:gridCol w:w="1418"/>
-        <w:gridCol w:w="1563"/>
-        <w:gridCol w:w="1041"/>
-        <w:gridCol w:w="1166"/>
       </w:tblGrid>
       <w:tr>
         <w:trPr>
@@ -1345,7 +1342,7 @@
                 <w:sz w:val="20"/>
                 <w:szCs w:val="20"/>
               </w:rPr>
-              <w:t xml:space="preserve">n</w:t>
+              <w:t xml:space="preserve">{quantidadePgrcc}</w:t>
             </w:r>
           </w:p>
         </w:tc>
@@ -1377,7 +1374,7 @@
                 <w:sz w:val="20"/>
                 <w:szCs w:val="20"/>
               </w:rPr>
-              <w:t xml:space="preserve">HT</w:t>
+              <w:t xml:space="preserve">18%</w:t>
             </w:r>
           </w:p>
         </w:tc>
@@ -1577,7 +1574,7 @@
                 <w:sz w:val="20"/>
                 <w:szCs w:val="20"/>
               </w:rPr>
-              <w:t xml:space="preserve">y</w:t>
+              <w:t xml:space="preserve">{quantidadeRgrcc}</w:t>
             </w:r>
           </w:p>
         </w:tc>
@@ -1609,7 +1606,7 @@
                 <w:sz w:val="20"/>
                 <w:szCs w:val="20"/>
               </w:rPr>
-              <w:t xml:space="preserve">HT</w:t>
+              <w:t xml:space="preserve">18%</w:t>
             </w:r>
           </w:p>
         </w:tc>

</xml_diff>

<commit_message>
fix: coluna Un. de volta a HT e D.A.* fixo em 18% na tabela de investimento do DOCX de demolicao
</commit_message>
<xml_diff>
--- a/src/lib/templates/proposta-demolicao/template.docx
+++ b/src/lib/templates/proposta-demolicao/template.docx
@@ -1374,7 +1374,7 @@
                 <w:sz w:val="20"/>
                 <w:szCs w:val="20"/>
               </w:rPr>
-              <w:t xml:space="preserve">18%</w:t>
+              <w:t xml:space="preserve">HT</w:t>
             </w:r>
           </w:p>
         </w:tc>
@@ -1406,7 +1406,7 @@
                 <w:sz w:val="20"/>
                 <w:szCs w:val="20"/>
               </w:rPr>
-              <w:t xml:space="preserve">{percentualDesconto}%</w:t>
+              <w:t xml:space="preserve">18%</w:t>
             </w:r>
           </w:p>
         </w:tc>
@@ -1606,7 +1606,7 @@
                 <w:sz w:val="20"/>
                 <w:szCs w:val="20"/>
               </w:rPr>
-              <w:t xml:space="preserve">18%</w:t>
+              <w:t xml:space="preserve">HT</w:t>
             </w:r>
           </w:p>
         </w:tc>
@@ -1638,7 +1638,7 @@
                 <w:sz w:val="20"/>
                 <w:szCs w:val="20"/>
               </w:rPr>
-              <w:t xml:space="preserve">{percentualDesconto}%</w:t>
+              <w:t xml:space="preserve">18%</w:t>
             </w:r>
           </w:p>
         </w:tc>

</xml_diff>

<commit_message>
fix: cidade e data dinamicas na linha de data do DOCX de demolicao ({cidade} e {dataFormatada})
</commit_message>
<xml_diff>
--- a/src/lib/templates/proposta-demolicao/template.docx
+++ b/src/lib/templates/proposta-demolicao/template.docx
@@ -38,7 +38,7 @@
           <w:rFonts w:ascii="Ebrima" w:hAnsi="Ebrima"/>
           <w:szCs w:val="24"/>
         </w:rPr>
-        <w:t>Curitiba</w:t>
+        <w:t>{cidade}</w:t>
       </w:r>
       <w:r>
         <w:rPr>
@@ -52,14 +52,14 @@
           <w:rFonts w:ascii="Ebrima" w:hAnsi="Ebrima"/>
           <w:szCs w:val="24"/>
         </w:rPr>
-        <w:t>04 de agosto</w:t>
-      </w:r>
-      <w:r>
-        <w:rPr>
-          <w:rFonts w:ascii="Ebrima" w:hAnsi="Ebrima"/>
-          <w:szCs w:val="24"/>
-        </w:rPr>
-        <w:t xml:space="preserve"> de 2026</w:t>
+        <w:t>{dataFormatada}</w:t>
+      </w:r>
+      <w:r>
+        <w:rPr>
+          <w:rFonts w:ascii="Ebrima" w:hAnsi="Ebrima"/>
+          <w:szCs w:val="24"/>
+        </w:rPr>
+        <w:t xml:space="preserve"/>
       </w:r>
       <w:r>
         <w:rPr>

</xml_diff>